<commit_message>
Expand UI/UX Functional Screen Inventory with roles and states previously missing
Adds a Contact Centre Console module, Medical Director/QA and Clinical
Safety Officer screens, MFA enrollment and staff account settings as
platform-wide states, device permission handling, Facility Partner
account provisioning, provider-facing ratings visibility, and fully
specifies the Incident Case, DSAR Case, and Complaint Case list screens
that were previously only referenced in passing.
</commit_message>
<xml_diff>
--- a/docs/AFC_UIUX_Functional_Screen_Inventory.docx
+++ b/docs/AFC_UIUX_Functional_Screen_Inventory.docx
@@ -171,6 +171,19 @@
         <w:spacing w:after="90"/>
       </w:pPr>
       <w:r>
+        <w:t xml:space="preserve">Module 0: Contact Centre Console — Contact Centre Agent</w:t>
+      </w:r>
+    </w:p>
+    <w:p>
+      <w:pPr>
+        <w:pStyle w:val="ListParagraph"/>
+        <w:numPr>
+          <w:ilvl w:val="0"/>
+          <w:numId w:val="2"/>
+        </w:numPr>
+        <w:spacing w:after="90"/>
+      </w:pPr>
+      <w:r>
         <w:t xml:space="preserve">Module 1: Dispatch Console — Emergency Dispatcher, Scheduling Dispatcher, Duty Supervisor</w:t>
       </w:r>
     </w:p>
@@ -236,7 +249,7 @@
         <w:spacing w:after="90"/>
       </w:pPr>
       <w:r>
-        <w:t xml:space="preserve">Module 6: Compliance and Governance — Compliance/Clinical Quality Officer</w:t>
+        <w:t xml:space="preserve">Module 6: Compliance and Governance — Compliance/Clinical Quality Officer, Medical Director/QA, Clinical Safety Officer</w:t>
       </w:r>
     </w:p>
     <w:p>
@@ -710,7 +723,419 @@
         <w:pStyle w:val="Heading2"/>
       </w:pPr>
       <w:r>
-        <w:t xml:space="preserve">S.5 Not Found / Invalid Record Reference</w:t>
+        <w:t xml:space="preserve">S.5 Device Permission Requests (Mobile Apps)</w:t>
+      </w:r>
+    </w:p>
+    <w:p>
+      <w:pPr>
+        <w:pStyle w:val="ListParagraph"/>
+        <w:numPr>
+          <w:ilvl w:val="0"/>
+          <w:numId w:val="2"/>
+        </w:numPr>
+        <w:spacing w:after="90"/>
+      </w:pPr>
+      <w:r>
+        <w:t xml:space="preserve">Applies to: the Patient App and Field Staff App wherever a device capability is genuinely needed — this is not a single screen but a repeatable pattern used at the specific moment each permission is actually required, never requested en masse at first launch.</w:t>
+      </w:r>
+    </w:p>
+    <w:p>
+      <w:pPr>
+        <w:pStyle w:val="ListParagraph"/>
+        <w:numPr>
+          <w:ilvl w:val="0"/>
+          <w:numId w:val="2"/>
+        </w:numPr>
+        <w:spacing w:after="90"/>
+      </w:pPr>
+      <w:r>
+        <w:t xml:space="preserve">Purpose: Request exactly the device capability a specific action needs, with a plain-language reason shown before the OS-level permission dialog fires, so a user understands why before being asked, rather than seeing an unexplained system prompt.</w:t>
+      </w:r>
+    </w:p>
+    <w:p>
+      <w:pPr>
+        <w:pStyle w:val="ListParagraph"/>
+        <w:numPr>
+          <w:ilvl w:val="0"/>
+          <w:numId w:val="2"/>
+        </w:numPr>
+        <w:spacing w:after="90"/>
+      </w:pPr>
+      <w:r>
+        <w:t xml:space="preserve">Permissions covered and where each is actually requested:</w:t>
+      </w:r>
+    </w:p>
+    <w:p>
+      <w:pPr>
+        <w:pStyle w:val="ListParagraph"/>
+        <w:numPr>
+          <w:ilvl w:val="0"/>
+          <w:numId w:val="2"/>
+        </w:numPr>
+        <w:spacing w:after="90"/>
+      </w:pPr>
+      <w:r>
+        <w:rPr>
+          <w:b/>
+          <w:bCs/>
+        </w:rPr>
+        <w:t xml:space="preserve">Location</w:t>
+      </w:r>
+      <w:r>
+        <w:t xml:space="preserve"> — requested at first use of the Emergency SOS Trigger (to pinpoint the patient), the Field Staff App's Navigation/Map screen (to route the provider), and Ambulance Crew's live GPS tracking (continuous, requested at Shift Start/Go Online, not per-job).</w:t>
+      </w:r>
+    </w:p>
+    <w:p>
+      <w:pPr>
+        <w:pStyle w:val="ListParagraph"/>
+        <w:numPr>
+          <w:ilvl w:val="0"/>
+          <w:numId w:val="2"/>
+        </w:numPr>
+        <w:spacing w:after="90"/>
+      </w:pPr>
+      <w:r>
+        <w:rPr>
+          <w:b/>
+          <w:bCs/>
+        </w:rPr>
+        <w:t xml:space="preserve">Camera</w:t>
+      </w:r>
+      <w:r>
+        <w:t xml:space="preserve"> — requested at first use of ID Scan during Registration or Patient Identity Verification, wound-care photo documentation in Clinical Documentation, and prescription-photo upload in Book Medication Delivery.</w:t>
+      </w:r>
+    </w:p>
+    <w:p>
+      <w:pPr>
+        <w:pStyle w:val="ListParagraph"/>
+        <w:numPr>
+          <w:ilvl w:val="0"/>
+          <w:numId w:val="2"/>
+        </w:numPr>
+        <w:spacing w:after="90"/>
+      </w:pPr>
+      <w:r>
+        <w:rPr>
+          <w:b/>
+          <w:bCs/>
+        </w:rPr>
+        <w:t xml:space="preserve">Microphone</w:t>
+      </w:r>
+      <w:r>
+        <w:t xml:space="preserve"> — requested at first use of voice-to-text dictation in Clinical Documentation; never requested for a role that doesn't use dictation.</w:t>
+      </w:r>
+    </w:p>
+    <w:p>
+      <w:pPr>
+        <w:pStyle w:val="ListParagraph"/>
+        <w:numPr>
+          <w:ilvl w:val="0"/>
+          <w:numId w:val="2"/>
+        </w:numPr>
+        <w:spacing w:after="90"/>
+      </w:pPr>
+      <w:r>
+        <w:rPr>
+          <w:b/>
+          <w:bCs/>
+        </w:rPr>
+        <w:t xml:space="preserve">Push notifications</w:t>
+      </w:r>
+      <w:r>
+        <w:t xml:space="preserve"> — requested once, early (typically right after Registration/Login), covering the Notifications Center and Escalation/Alert Inbox equivalents; never re-requested repeatedly if declined, per platform notification norms.</w:t>
+      </w:r>
+    </w:p>
+    <w:p>
+      <w:pPr>
+        <w:pStyle w:val="ListParagraph"/>
+        <w:numPr>
+          <w:ilvl w:val="0"/>
+          <w:numId w:val="2"/>
+        </w:numPr>
+        <w:spacing w:after="90"/>
+      </w:pPr>
+      <w:r>
+        <w:rPr>
+          <w:b/>
+          <w:bCs/>
+        </w:rPr>
+        <w:t xml:space="preserve">Biometric (Face/Fingerprint)</w:t>
+      </w:r>
+      <w:r>
+        <w:t xml:space="preserve"> — requested only when a user opts in to the biometric-login toggle on Login or Account Settings, never on first launch by default.</w:t>
+      </w:r>
+    </w:p>
+    <w:p>
+      <w:pPr>
+        <w:pStyle w:val="ListParagraph"/>
+        <w:numPr>
+          <w:ilvl w:val="0"/>
+          <w:numId w:val="2"/>
+        </w:numPr>
+        <w:spacing w:after="90"/>
+      </w:pPr>
+      <w:r>
+        <w:t xml:space="preserve">Key information displayed: A brief, specific rationale for the permission ("AFC needs your location to send help to the right place") shown immediately before the OS prompt; if previously denied, a message explaining what's now unavailable and a deep link to the device's own app-settings screen to change it, since an app cannot re-trigger a denied OS permission dialog directly.</w:t>
+      </w:r>
+    </w:p>
+    <w:p>
+      <w:pPr>
+        <w:pStyle w:val="ListParagraph"/>
+        <w:numPr>
+          <w:ilvl w:val="0"/>
+          <w:numId w:val="2"/>
+        </w:numPr>
+        <w:spacing w:after="90"/>
+      </w:pPr>
+      <w:r>
+        <w:t xml:space="preserve">Actions: Allow / Don't Allow (the OS-level dialog itself, not an app-drawn one); "Open Settings" (app-drawn, shown after a denial when the user later returns to the action that needs it).</w:t>
+      </w:r>
+    </w:p>
+    <w:p>
+      <w:pPr>
+        <w:pStyle w:val="ListParagraph"/>
+        <w:numPr>
+          <w:ilvl w:val="0"/>
+          <w:numId w:val="2"/>
+        </w:numPr>
+        <w:spacing w:after="90"/>
+      </w:pPr>
+      <w:r>
+        <w:t xml:space="preserve">Navigation: From: the specific screen/action that first needs the capability. To: back to that same screen/action, either proceeding (granted) or with the feature's specific fallback behavior (denied) — never a dead end.</w:t>
+      </w:r>
+    </w:p>
+    <w:p>
+      <w:pPr>
+        <w:pStyle w:val="ListParagraph"/>
+        <w:numPr>
+          <w:ilvl w:val="0"/>
+          <w:numId w:val="2"/>
+        </w:numPr>
+        <w:spacing w:after="90"/>
+      </w:pPr>
+      <w:r>
+        <w:t xml:space="preserve">Validation/errors: A denied permission never crashes or blanks the triggering screen; each capability has a defined fallback: denied Location on SOS Trigger prompts manual address entry instead of blocking the emergency request entirely; denied Camera on ID Scan falls back to the verbal/manual identity-verification path already defined on that screen; denied Microphone simply removes the dictation option, leaving manual text entry; denied Push Notifications means the Notifications Center becomes the only way to see alerts, with an in-app banner noting this rather than the user wondering why they stopped getting notified.</w:t>
+      </w:r>
+    </w:p>
+    <w:p>
+      <w:r>
+        <w:br w:type="page"/>
+      </w:r>
+    </w:p>
+    <w:p>
+      <w:pPr>
+        <w:pStyle w:val="Heading2"/>
+      </w:pPr>
+      <w:r>
+        <w:t xml:space="preserve">S.6 Staff Account Settings and Profile</w:t>
+      </w:r>
+    </w:p>
+    <w:p>
+      <w:pPr>
+        <w:pStyle w:val="ListParagraph"/>
+        <w:numPr>
+          <w:ilvl w:val="0"/>
+          <w:numId w:val="2"/>
+        </w:numPr>
+        <w:spacing w:after="90"/>
+      </w:pPr>
+      <w:r>
+        <w:t xml:space="preserve">Applies to: every internal, AFC-employed role across the Field Staff App and all eight web platform modules — Home Doctor, Nurse, Home Health Aide, Pharmacist, Ambulance Crew, Phone Consultation Clinician, Contact Centre Agent, Emergency Dispatcher, Scheduling Dispatcher, Duty Supervisor, Fleet Manager, Finance/Billing Officer, Finance Manager, Membership and Customer Success Agent/Lead, Compliance/Clinical Quality Officer, Medical Director/QA, Clinical Safety Officer, IT/System Administrator, Operations Manager, Executive. Every one of these roles reaches the same underlying screen, scoped to their own account only.</w:t>
+      </w:r>
+    </w:p>
+    <w:p>
+      <w:pPr>
+        <w:pStyle w:val="ListParagraph"/>
+        <w:numPr>
+          <w:ilvl w:val="0"/>
+          <w:numId w:val="2"/>
+        </w:numPr>
+        <w:spacing w:after="90"/>
+      </w:pPr>
+      <w:r>
+        <w:t xml:space="preserve">Purpose: Give every staff member, regardless of role, a place to manage their own account — the gap this specification previously left unaddressed while defining a detailed Account Settings screen for the Patient App but nothing equivalent for any internal role.</w:t>
+      </w:r>
+    </w:p>
+    <w:p>
+      <w:pPr>
+        <w:pStyle w:val="ListParagraph"/>
+        <w:numPr>
+          <w:ilvl w:val="0"/>
+          <w:numId w:val="2"/>
+        </w:numPr>
+        <w:spacing w:after="90"/>
+      </w:pPr>
+      <w:r>
+        <w:t xml:space="preserve">Key information displayed: Profile fields (name, contact details, photo); current role(s) and module access (read-only — changing this is IT Administration's Role Assignment screen, not self-service); notification preferences; MFA enrollment status with a link to the MFA Enrollment screen (S.8) if not yet set up; password-change option; active-session list with the ability to sign out other sessions.</w:t>
+      </w:r>
+    </w:p>
+    <w:p>
+      <w:pPr>
+        <w:pStyle w:val="ListParagraph"/>
+        <w:numPr>
+          <w:ilvl w:val="0"/>
+          <w:numId w:val="2"/>
+        </w:numPr>
+        <w:spacing w:after="90"/>
+      </w:pPr>
+      <w:r>
+        <w:t xml:space="preserve">Actions: Edit contact details; set notification preferences; change password; enroll in or reconfigure MFA (routes to S.8); sign out a specific other active session; sign out everywhere.</w:t>
+      </w:r>
+    </w:p>
+    <w:p>
+      <w:pPr>
+        <w:pStyle w:val="ListParagraph"/>
+        <w:numPr>
+          <w:ilvl w:val="0"/>
+          <w:numId w:val="2"/>
+        </w:numPr>
+        <w:spacing w:after="90"/>
+      </w:pPr>
+      <w:r>
+        <w:t xml:space="preserve">Navigation: From: a persistent account/profile entry point present in every module's platform shell and in the Field Staff App's menu. To: MFA Enrollment (S.8) if not yet configured; Login, on sign-out.</w:t>
+      </w:r>
+    </w:p>
+    <w:p>
+      <w:pPr>
+        <w:pStyle w:val="ListParagraph"/>
+        <w:numPr>
+          <w:ilvl w:val="0"/>
+          <w:numId w:val="2"/>
+        </w:numPr>
+        <w:spacing w:after="90"/>
+      </w:pPr>
+      <w:r>
+        <w:t xml:space="preserve">Validation/errors: Password change requires the current password; MFA cannot be disabled entirely for a role where it's mandatory (per Appendix D of the Enterprise Platform Specification) — a staff member can reconfigure their MFA method but not turn it off.</w:t>
+      </w:r>
+    </w:p>
+    <w:p>
+      <w:pPr>
+        <w:pStyle w:val="ListParagraph"/>
+        <w:numPr>
+          <w:ilvl w:val="0"/>
+          <w:numId w:val="2"/>
+        </w:numPr>
+        <w:spacing w:after="90"/>
+      </w:pPr>
+      <w:r>
+        <w:t xml:space="preserve">Empty state: Not applicable — every account has a profile.</w:t>
+      </w:r>
+    </w:p>
+    <w:p>
+      <w:r>
+        <w:br w:type="page"/>
+      </w:r>
+    </w:p>
+    <w:p>
+      <w:pPr>
+        <w:pStyle w:val="Heading2"/>
+      </w:pPr>
+      <w:r>
+        <w:t xml:space="preserve">S.7 MFA Enrollment</w:t>
+      </w:r>
+    </w:p>
+    <w:p>
+      <w:pPr>
+        <w:pStyle w:val="ListParagraph"/>
+        <w:numPr>
+          <w:ilvl w:val="0"/>
+          <w:numId w:val="2"/>
+        </w:numPr>
+        <w:spacing w:after="90"/>
+      </w:pPr>
+      <w:r>
+        <w:t xml:space="preserve">Applies to: every internal staff role listed in S.7, mandatory at first login with no skip option, consistent with the non-negotiable engineering standard already established for this platform.</w:t>
+      </w:r>
+    </w:p>
+    <w:p>
+      <w:pPr>
+        <w:pStyle w:val="ListParagraph"/>
+        <w:numPr>
+          <w:ilvl w:val="0"/>
+          <w:numId w:val="2"/>
+        </w:numPr>
+        <w:spacing w:after="90"/>
+      </w:pPr>
+      <w:r>
+        <w:t xml:space="preserve">Purpose: Walk a staff member through setting up multi-factor authentication before they can reach any other screen — the missing screen behind a requirement that was previously stated as a rule but never given a UI moment anywhere in this inventory.</w:t>
+      </w:r>
+    </w:p>
+    <w:p>
+      <w:pPr>
+        <w:pStyle w:val="ListParagraph"/>
+        <w:numPr>
+          <w:ilvl w:val="0"/>
+          <w:numId w:val="2"/>
+        </w:numPr>
+        <w:spacing w:after="90"/>
+      </w:pPr>
+      <w:r>
+        <w:t xml:space="preserve">Key information displayed: Method selection (authenticator app preferred; SMS-based code as the documented fallback only, given its weaker security profile); a QR code or manual setup key for an authenticator app; a verification-code entry field to confirm the method works before enrollment completes.</w:t>
+      </w:r>
+    </w:p>
+    <w:p>
+      <w:pPr>
+        <w:pStyle w:val="ListParagraph"/>
+        <w:numPr>
+          <w:ilvl w:val="0"/>
+          <w:numId w:val="2"/>
+        </w:numPr>
+        <w:spacing w:after="90"/>
+      </w:pPr>
+      <w:r>
+        <w:t xml:space="preserve">Actions: Select method; scan QR code or enter setup key; enter verification code to confirm; complete enrollment; (later, from S.7) reconfigure method or regenerate backup codes.</w:t>
+      </w:r>
+    </w:p>
+    <w:p>
+      <w:pPr>
+        <w:pStyle w:val="ListParagraph"/>
+        <w:numPr>
+          <w:ilvl w:val="0"/>
+          <w:numId w:val="2"/>
+        </w:numPr>
+        <w:spacing w:after="90"/>
+      </w:pPr>
+      <w:r>
+        <w:t xml:space="preserve">Navigation: From: first login (mandatory, blocking) or Staff Account Settings (S.7, to reconfigure later). To: the role's normal landing screen (Shift Start for Field Staff, module home for web platform roles) once enrollment completes.</w:t>
+      </w:r>
+    </w:p>
+    <w:p>
+      <w:pPr>
+        <w:pStyle w:val="ListParagraph"/>
+        <w:numPr>
+          <w:ilvl w:val="0"/>
+          <w:numId w:val="2"/>
+        </w:numPr>
+        <w:spacing w:after="90"/>
+      </w:pPr>
+      <w:r>
+        <w:t xml:space="preserve">Validation/errors: Cannot proceed past this screen on first login without completing enrollment; incorrect verification code during setup does not lock the account, only prompts retry; a lost-device recovery path uses pre-generated backup codes (shown once, at enrollment, with an explicit "save these now" prompt) rather than a weaker fallback that would undermine the control's purpose.</w:t>
+      </w:r>
+    </w:p>
+    <w:p>
+      <w:pPr>
+        <w:pStyle w:val="ListParagraph"/>
+        <w:numPr>
+          <w:ilvl w:val="0"/>
+          <w:numId w:val="2"/>
+        </w:numPr>
+        <w:spacing w:after="90"/>
+      </w:pPr>
+      <w:r>
+        <w:t xml:space="preserve">Empty state: Not applicable — a mandatory one-time setup flow.</w:t>
+      </w:r>
+    </w:p>
+    <w:p>
+      <w:r>
+        <w:br w:type="page"/>
+      </w:r>
+    </w:p>
+    <w:p>
+      <w:pPr>
+        <w:pStyle w:val="Heading2"/>
+      </w:pPr>
+      <w:r>
+        <w:t xml:space="preserve">S.8 Not Found / Invalid Record Reference</w:t>
       </w:r>
     </w:p>
     <w:p>
@@ -4962,7 +5387,7 @@
         <w:spacing w:after="90"/>
       </w:pPr>
       <w:r>
-        <w:t xml:space="preserve">Navigation: From: Shift Start/Job List menu. To: payout-detail expansion (same screen), own Dispute Case status.</w:t>
+        <w:t xml:space="preserve">Navigation: From: Shift Start/Job List menu. To: payout-detail expansion (same screen), own Dispute Case status; My Performance and Ratings (18).</w:t>
       </w:r>
     </w:p>
     <w:p>
@@ -4989,6 +5414,110 @@
       </w:pPr>
       <w:r>
         <w:t xml:space="preserve">Empty state: "No completed jobs this period" for a period with no activity — distinguished from "No Compensation Profile on file," which is instead surfaced as a blocking notice at Shift Start (screen 2), so a provider never mistakes a missing pay setup for simply having had a quiet period.</w:t>
+      </w:r>
+    </w:p>
+    <w:p>
+      <w:r>
+        <w:br w:type="page"/>
+      </w:r>
+    </w:p>
+    <w:p>
+      <w:pPr>
+        <w:pStyle w:val="Heading2"/>
+      </w:pPr>
+      <w:r>
+        <w:t xml:space="preserve">18. My Performance and Ratings</w:t>
+      </w:r>
+    </w:p>
+    <w:p>
+      <w:pPr>
+        <w:pStyle w:val="ListParagraph"/>
+        <w:numPr>
+          <w:ilvl w:val="0"/>
+          <w:numId w:val="2"/>
+        </w:numPr>
+        <w:spacing w:after="90"/>
+      </w:pPr>
+      <w:r>
+        <w:t xml:space="preserve">Role(s): All field roles, each scoped strictly to their own data — patients rate a visit/booking (Patient App screen 19), and this is where the provider who delivered it sees the result.</w:t>
+      </w:r>
+    </w:p>
+    <w:p>
+      <w:pPr>
+        <w:pStyle w:val="ListParagraph"/>
+        <w:numPr>
+          <w:ilvl w:val="0"/>
+          <w:numId w:val="2"/>
+        </w:numPr>
+        <w:spacing w:after="90"/>
+      </w:pPr>
+      <w:r>
+        <w:t xml:space="preserve">Purpose: Let a provider see their own patient-satisfaction rating trend and any written feedback, closing the loop on the rating a patient leaves after a completed visit — until now, patient ratings existed with no provider-facing counterpart anywhere in the inventory.</w:t>
+      </w:r>
+    </w:p>
+    <w:p>
+      <w:pPr>
+        <w:pStyle w:val="ListParagraph"/>
+        <w:numPr>
+          <w:ilvl w:val="0"/>
+          <w:numId w:val="2"/>
+        </w:numPr>
+        <w:spacing w:after="90"/>
+      </w:pPr>
+      <w:r>
+        <w:t xml:space="preserve">Key information displayed: Overall rating average and trend over time; individual rating/feedback entries per completed job, anonymized to the extent the underlying feedback allows (a provider sees what was said about their own visit, not the patient's other activity); any coaching note a Medical Director/QA or Duty Supervisor has attached to a specific low rating, per the sampling/quality-review processes defined elsewhere.</w:t>
+      </w:r>
+    </w:p>
+    <w:p>
+      <w:pPr>
+        <w:pStyle w:val="ListParagraph"/>
+        <w:numPr>
+          <w:ilvl w:val="0"/>
+          <w:numId w:val="2"/>
+        </w:numPr>
+        <w:spacing w:after="90"/>
+      </w:pPr>
+      <w:r>
+        <w:t xml:space="preserve">Actions: Filter by date range; view a specific rated job's detail (read-only, same underlying record as the Job Closeout summary); acknowledge a coaching note.</w:t>
+      </w:r>
+    </w:p>
+    <w:p>
+      <w:pPr>
+        <w:pStyle w:val="ListParagraph"/>
+        <w:numPr>
+          <w:ilvl w:val="0"/>
+          <w:numId w:val="2"/>
+        </w:numPr>
+        <w:spacing w:after="90"/>
+      </w:pPr>
+      <w:r>
+        <w:t xml:space="preserve">Navigation: From: My Earnings (17) or Job List menu. To: the underlying Job Detail/closeout record (read-only).</w:t>
+      </w:r>
+    </w:p>
+    <w:p>
+      <w:pPr>
+        <w:pStyle w:val="ListParagraph"/>
+        <w:numPr>
+          <w:ilvl w:val="0"/>
+          <w:numId w:val="2"/>
+        </w:numPr>
+        <w:spacing w:after="90"/>
+      </w:pPr>
+      <w:r>
+        <w:t xml:space="preserve">Validation/errors: By design, no UI path exists anywhere in the app to view another provider's ratings, mirroring the same strict self-only scope as My Earnings.</w:t>
+      </w:r>
+    </w:p>
+    <w:p>
+      <w:pPr>
+        <w:pStyle w:val="ListParagraph"/>
+        <w:numPr>
+          <w:ilvl w:val="0"/>
+          <w:numId w:val="2"/>
+        </w:numPr>
+        <w:spacing w:after="90"/>
+      </w:pPr>
+      <w:r>
+        <w:t xml:space="preserve">Empty state: "No ratings yet" for a provider with no completed, rated jobs in the selected period.</w:t>
       </w:r>
     </w:p>
     <w:p>
@@ -5023,7 +5552,7 @@
           <w:sz w:val="38"/>
           <w:szCs w:val="38"/>
         </w:rPr>
-        <w:t xml:space="preserve">Dispatch, Fleet &amp; Facility Partner</w:t>
+        <w:t xml:space="preserve">Contact Centre, Dispatch, Fleet &amp; Facility Partner</w:t>
       </w:r>
     </w:p>
     <w:p>
@@ -5038,7 +5567,444 @@
           <w:sz w:val="24"/>
           <w:szCs w:val="24"/>
         </w:rPr>
-        <w:t xml:space="preserve">Live emergency and scheduling dispatch, fleet readiness, and the external facility referral portal</w:t>
+        <w:t xml:space="preserve">Phone-channel intake, live emergency and scheduling dispatch, fleet readiness, and the external facility referral portal</w:t>
+      </w:r>
+    </w:p>
+    <w:p>
+      <w:r>
+        <w:br w:type="page"/>
+      </w:r>
+    </w:p>
+    <w:p>
+      <w:pPr>
+        <w:pStyle w:val="Heading1"/>
+      </w:pPr>
+      <w:r>
+        <w:t xml:space="preserve">Module 0: Contact Centre Console</w:t>
+      </w:r>
+    </w:p>
+    <w:p>
+      <w:pPr>
+        <w:spacing w:after="160"/>
+      </w:pPr>
+      <w:r>
+        <w:t xml:space="preserve">Used by Contact Centre Agent — a role named throughout this specification with real permissions (creating and amending Bookings and SOS Requests on a patient's behalf, viewing invoice status) but, until now, no screens of its own anywhere in this inventory.</w:t>
+      </w:r>
+    </w:p>
+    <w:p>
+      <w:r>
+        <w:br w:type="page"/>
+      </w:r>
+    </w:p>
+    <w:p>
+      <w:pPr>
+        <w:pStyle w:val="Heading2"/>
+      </w:pPr>
+      <w:r>
+        <w:t xml:space="preserve">0.1 Call Intake Screen</w:t>
+      </w:r>
+    </w:p>
+    <w:p>
+      <w:pPr>
+        <w:pStyle w:val="ListParagraph"/>
+        <w:numPr>
+          <w:ilvl w:val="0"/>
+          <w:numId w:val="2"/>
+        </w:numPr>
+        <w:spacing w:after="90"/>
+      </w:pPr>
+      <w:r>
+        <w:t xml:space="preserve">Role(s): Contact Centre Agent</w:t>
+      </w:r>
+    </w:p>
+    <w:p>
+      <w:pPr>
+        <w:pStyle w:val="ListParagraph"/>
+        <w:numPr>
+          <w:ilvl w:val="0"/>
+          <w:numId w:val="2"/>
+        </w:numPr>
+        <w:spacing w:after="90"/>
+      </w:pPr>
+      <w:r>
+        <w:t xml:space="preserve">Purpose: The Agent's working screen while on a call with a patient or caller, used to identify the caller's existing record (or start a new one) before booking anything on their behalf.</w:t>
+      </w:r>
+    </w:p>
+    <w:p>
+      <w:pPr>
+        <w:pStyle w:val="ListParagraph"/>
+        <w:numPr>
+          <w:ilvl w:val="0"/>
+          <w:numId w:val="2"/>
+        </w:numPr>
+        <w:spacing w:after="90"/>
+      </w:pPr>
+      <w:r>
+        <w:t xml:space="preserve">Key information displayed: Caller lookup (by phone number, name, or Member ID) with matching results; if no match, a "new caller" path; once identified, a summary of the patient's recent bookings and any open SOS Requests, so the Agent has context before asking the caller to repeat themselves.</w:t>
+      </w:r>
+    </w:p>
+    <w:p>
+      <w:pPr>
+        <w:pStyle w:val="ListParagraph"/>
+        <w:numPr>
+          <w:ilvl w:val="0"/>
+          <w:numId w:val="2"/>
+        </w:numPr>
+        <w:spacing w:after="90"/>
+      </w:pPr>
+      <w:r>
+        <w:t xml:space="preserve">Actions: Search for existing patient; create a new (guest) patient record; open Book on Behalf of Patient (0.2) for the identified patient; open Emergency Intake (0.3) if the call is urgent.</w:t>
+      </w:r>
+    </w:p>
+    <w:p>
+      <w:pPr>
+        <w:pStyle w:val="ListParagraph"/>
+        <w:numPr>
+          <w:ilvl w:val="0"/>
+          <w:numId w:val="2"/>
+        </w:numPr>
+        <w:spacing w:after="90"/>
+      </w:pPr>
+      <w:r>
+        <w:t xml:space="preserve">Navigation: From: platform home / module launcher, typically opened at the start of every inbound call. To: Book on Behalf of Patient (0.2), Emergency Intake (0.3), Call Log (0.4).</w:t>
+      </w:r>
+    </w:p>
+    <w:p>
+      <w:pPr>
+        <w:pStyle w:val="ListParagraph"/>
+        <w:numPr>
+          <w:ilvl w:val="0"/>
+          <w:numId w:val="2"/>
+        </w:numPr>
+        <w:spacing w:after="90"/>
+      </w:pPr>
+      <w:r>
+        <w:t xml:space="preserve">Validation/errors: Duplicate-record warning if a similar name/phone match already exists, to avoid creating a second patient record for someone who's called before; a caller who can't be identified at all proceeds as a new guest record rather than blocking the call.</w:t>
+      </w:r>
+    </w:p>
+    <w:p>
+      <w:pPr>
+        <w:pStyle w:val="ListParagraph"/>
+        <w:numPr>
+          <w:ilvl w:val="0"/>
+          <w:numId w:val="2"/>
+        </w:numPr>
+        <w:spacing w:after="90"/>
+      </w:pPr>
+      <w:r>
+        <w:t xml:space="preserve">Empty state: Not applicable — this is the Agent's per-call working screen, always active during a call.</w:t>
+      </w:r>
+    </w:p>
+    <w:p>
+      <w:r>
+        <w:br w:type="page"/>
+      </w:r>
+    </w:p>
+    <w:p>
+      <w:pPr>
+        <w:pStyle w:val="Heading2"/>
+      </w:pPr>
+      <w:r>
+        <w:t xml:space="preserve">0.2 Book on Behalf of Patient</w:t>
+      </w:r>
+    </w:p>
+    <w:p>
+      <w:pPr>
+        <w:pStyle w:val="ListParagraph"/>
+        <w:numPr>
+          <w:ilvl w:val="0"/>
+          <w:numId w:val="2"/>
+        </w:numPr>
+        <w:spacing w:after="90"/>
+      </w:pPr>
+      <w:r>
+        <w:t xml:space="preserve">Role(s): Contact Centre Agent</w:t>
+      </w:r>
+    </w:p>
+    <w:p>
+      <w:pPr>
+        <w:pStyle w:val="ListParagraph"/>
+        <w:numPr>
+          <w:ilvl w:val="0"/>
+          <w:numId w:val="2"/>
+        </w:numPr>
+        <w:spacing w:after="90"/>
+      </w:pPr>
+      <w:r>
+        <w:t xml:space="preserve">Purpose: Create a standard (non-emergency) Booking on a patient's behalf over the phone — the phone-channel equivalent of the Patient App's own booking screens, since a caller doesn't have the app open in front of them.</w:t>
+      </w:r>
+    </w:p>
+    <w:p>
+      <w:pPr>
+        <w:pStyle w:val="ListParagraph"/>
+        <w:numPr>
+          <w:ilvl w:val="0"/>
+          <w:numId w:val="2"/>
+        </w:numPr>
+        <w:spacing w:after="90"/>
+      </w:pPr>
+      <w:r>
+        <w:t xml:space="preserve">Key information displayed: The same fields as the Patient App's Book a Home Visit / Medication Delivery / Phone Consultation / Scheduled Ambulance Transport screens, read out to and confirmed with the caller rather than typed by the patient themselves; a clear on-screen reminder that consent (per the shared Consent and Signature Screen) still needs to be captured from the patient directly, not assumed from the Agent's side of the call.</w:t>
+      </w:r>
+    </w:p>
+    <w:p>
+      <w:pPr>
+        <w:pStyle w:val="ListParagraph"/>
+        <w:numPr>
+          <w:ilvl w:val="0"/>
+          <w:numId w:val="2"/>
+        </w:numPr>
+        <w:spacing w:after="90"/>
+      </w:pPr>
+      <w:r>
+        <w:t xml:space="preserve">Actions: Select service type; enter details as the caller provides them; confirm consent was verbally given (logged as a distinct, lower-rigor consent capture method than the Patient App's own signature flow, flagged as such in the record); submit booking.</w:t>
+      </w:r>
+    </w:p>
+    <w:p>
+      <w:pPr>
+        <w:pStyle w:val="ListParagraph"/>
+        <w:numPr>
+          <w:ilvl w:val="0"/>
+          <w:numId w:val="2"/>
+        </w:numPr>
+        <w:spacing w:after="90"/>
+      </w:pPr>
+      <w:r>
+        <w:t xml:space="preserve">Navigation: From: Call Intake Screen (0.1). To: Booking Confirmation (a phone-channel equivalent of the Patient App's own confirmation screen, read back to the caller); back to Call Intake.</w:t>
+      </w:r>
+    </w:p>
+    <w:p>
+      <w:pPr>
+        <w:pStyle w:val="ListParagraph"/>
+        <w:numPr>
+          <w:ilvl w:val="0"/>
+          <w:numId w:val="2"/>
+        </w:numPr>
+        <w:spacing w:after="90"/>
+      </w:pPr>
+      <w:r>
+        <w:t xml:space="preserve">Validation/errors: Same required-field validation as the Patient App's booking screens; a booking for a service requiring a Care Plan (recurring Nurse/Aide visits) cannot be created directly here — the Agent instead routes the caller toward a first assessment visit, consistent with the rule that only a Physician or Nurse can author a Care Plan.</w:t>
+      </w:r>
+    </w:p>
+    <w:p>
+      <w:pPr>
+        <w:pStyle w:val="ListParagraph"/>
+        <w:numPr>
+          <w:ilvl w:val="0"/>
+          <w:numId w:val="2"/>
+        </w:numPr>
+        <w:spacing w:after="90"/>
+      </w:pPr>
+      <w:r>
+        <w:t xml:space="preserve">Empty state: Not applicable — a single booking form.</w:t>
+      </w:r>
+    </w:p>
+    <w:p>
+      <w:r>
+        <w:br w:type="page"/>
+      </w:r>
+    </w:p>
+    <w:p>
+      <w:pPr>
+        <w:pStyle w:val="Heading2"/>
+      </w:pPr>
+      <w:r>
+        <w:t xml:space="preserve">0.3 Emergency Intake Screen</w:t>
+      </w:r>
+    </w:p>
+    <w:p>
+      <w:pPr>
+        <w:pStyle w:val="ListParagraph"/>
+        <w:numPr>
+          <w:ilvl w:val="0"/>
+          <w:numId w:val="2"/>
+        </w:numPr>
+        <w:spacing w:after="90"/>
+      </w:pPr>
+      <w:r>
+        <w:t xml:space="preserve">Role(s): Contact Centre Agent</w:t>
+      </w:r>
+    </w:p>
+    <w:p>
+      <w:pPr>
+        <w:pStyle w:val="ListParagraph"/>
+        <w:numPr>
+          <w:ilvl w:val="0"/>
+          <w:numId w:val="2"/>
+        </w:numPr>
+        <w:spacing w:after="90"/>
+      </w:pPr>
+      <w:r>
+        <w:t xml:space="preserve">Purpose: Handle an inbound emergency call by creating an SOS Request on the caller's behalf and handing it immediately to the Emergency Dispatcher's queue — distinct from routine booking, since every second matters here.</w:t>
+      </w:r>
+    </w:p>
+    <w:p>
+      <w:pPr>
+        <w:pStyle w:val="ListParagraph"/>
+        <w:numPr>
+          <w:ilvl w:val="0"/>
+          <w:numId w:val="2"/>
+        </w:numPr>
+        <w:spacing w:after="90"/>
+      </w:pPr>
+      <w:r>
+        <w:t xml:space="preserve">Key information displayed: A condensed, emergency-focused version of the SOS intake fields (location, chief complaint, callback number); a live indicator once the SOS Request has been created and entered the Emergency Dispatcher's Live Emergency Queue, so the Agent can confirm to the caller that dispatch is already underway.</w:t>
+      </w:r>
+    </w:p>
+    <w:p>
+      <w:pPr>
+        <w:pStyle w:val="ListParagraph"/>
+        <w:numPr>
+          <w:ilvl w:val="0"/>
+          <w:numId w:val="2"/>
+        </w:numPr>
+        <w:spacing w:after="90"/>
+      </w:pPr>
+      <w:r>
+        <w:t xml:space="preserve">Actions: Capture minimum viable emergency details; Submit and Escalate (creates the SOS Request immediately, does not wait for full details before entering the queue); stay on the line while dispatch proceeds.</w:t>
+      </w:r>
+    </w:p>
+    <w:p>
+      <w:pPr>
+        <w:pStyle w:val="ListParagraph"/>
+        <w:numPr>
+          <w:ilvl w:val="0"/>
+          <w:numId w:val="2"/>
+        </w:numPr>
+        <w:spacing w:after="90"/>
+      </w:pPr>
+      <w:r>
+        <w:t xml:space="preserve">Navigation: From: Call Intake Screen (0.1), or directly if the Agent recognizes an emergency before full caller identification completes. To: Call Intake Screen (0.1) once the emergency handoff is confirmed; the created SOS Request is then owned by the Emergency Dispatcher's own screens (Module 1), not the Contact Centre Agent's.</w:t>
+      </w:r>
+    </w:p>
+    <w:p>
+      <w:pPr>
+        <w:pStyle w:val="ListParagraph"/>
+        <w:numPr>
+          <w:ilvl w:val="0"/>
+          <w:numId w:val="2"/>
+        </w:numPr>
+        <w:spacing w:after="90"/>
+      </w:pPr>
+      <w:r>
+        <w:t xml:space="preserve">Validation/errors: This screen deliberately has fewer required fields than the standard SOS Trigger in the Patient App, since an Agent relaying a caller's account in real time cannot always get complete information before dispatch needs to start; missing details can be added to the SOS Request afterward without blocking its creation.</w:t>
+      </w:r>
+    </w:p>
+    <w:p>
+      <w:pPr>
+        <w:pStyle w:val="ListParagraph"/>
+        <w:numPr>
+          <w:ilvl w:val="0"/>
+          <w:numId w:val="2"/>
+        </w:numPr>
+        <w:spacing w:after="90"/>
+      </w:pPr>
+      <w:r>
+        <w:t xml:space="preserve">Empty state: Not applicable — a single-use emergency form.</w:t>
+      </w:r>
+    </w:p>
+    <w:p>
+      <w:r>
+        <w:br w:type="page"/>
+      </w:r>
+    </w:p>
+    <w:p>
+      <w:pPr>
+        <w:pStyle w:val="Heading2"/>
+      </w:pPr>
+      <w:r>
+        <w:t xml:space="preserve">0.4 Call Log</w:t>
+      </w:r>
+    </w:p>
+    <w:p>
+      <w:pPr>
+        <w:pStyle w:val="ListParagraph"/>
+        <w:numPr>
+          <w:ilvl w:val="0"/>
+          <w:numId w:val="2"/>
+        </w:numPr>
+        <w:spacing w:after="90"/>
+      </w:pPr>
+      <w:r>
+        <w:t xml:space="preserve">Role(s): Contact Centre Agent</w:t>
+      </w:r>
+    </w:p>
+    <w:p>
+      <w:pPr>
+        <w:pStyle w:val="ListParagraph"/>
+        <w:numPr>
+          <w:ilvl w:val="0"/>
+          <w:numId w:val="2"/>
+        </w:numPr>
+        <w:spacing w:after="90"/>
+      </w:pPr>
+      <w:r>
+        <w:t xml:space="preserve">Purpose: The Agent's own record of calls handled, for their own reference and for supervisory quality review.</w:t>
+      </w:r>
+    </w:p>
+    <w:p>
+      <w:pPr>
+        <w:pStyle w:val="ListParagraph"/>
+        <w:numPr>
+          <w:ilvl w:val="0"/>
+          <w:numId w:val="2"/>
+        </w:numPr>
+        <w:spacing w:after="90"/>
+      </w:pPr>
+      <w:r>
+        <w:t xml:space="preserve">Key information displayed: Chronological list of calls handled by this Agent, each with caller identity (if resolved), call type (booking, emergency, inquiry), outcome (booking created, escalated, no action needed), duration.</w:t>
+      </w:r>
+    </w:p>
+    <w:p>
+      <w:pPr>
+        <w:pStyle w:val="ListParagraph"/>
+        <w:numPr>
+          <w:ilvl w:val="0"/>
+          <w:numId w:val="2"/>
+        </w:numPr>
+        <w:spacing w:after="90"/>
+      </w:pPr>
+      <w:r>
+        <w:t xml:space="preserve">Actions: Filter by date/type; reopen a linked Booking or SOS Request from a past call entry.</w:t>
+      </w:r>
+    </w:p>
+    <w:p>
+      <w:pPr>
+        <w:pStyle w:val="ListParagraph"/>
+        <w:numPr>
+          <w:ilvl w:val="0"/>
+          <w:numId w:val="2"/>
+        </w:numPr>
+        <w:spacing w:after="90"/>
+      </w:pPr>
+      <w:r>
+        <w:t xml:space="preserve">Navigation: From: platform home. To: the linked Booking Detail or SOS Request record.</w:t>
+      </w:r>
+    </w:p>
+    <w:p>
+      <w:pPr>
+        <w:pStyle w:val="ListParagraph"/>
+        <w:numPr>
+          <w:ilvl w:val="0"/>
+          <w:numId w:val="2"/>
+        </w:numPr>
+        <w:spacing w:after="90"/>
+      </w:pPr>
+      <w:r>
+        <w:t xml:space="preserve">Validation/errors: None beyond navigation.</w:t>
+      </w:r>
+    </w:p>
+    <w:p>
+      <w:pPr>
+        <w:pStyle w:val="ListParagraph"/>
+        <w:numPr>
+          <w:ilvl w:val="0"/>
+          <w:numId w:val="2"/>
+        </w:numPr>
+        <w:spacing w:after="90"/>
+      </w:pPr>
+      <w:r>
+        <w:t xml:space="preserve">Empty state: "No calls logged yet" for a new Agent account.</w:t>
       </w:r>
     </w:p>
     <w:p>
@@ -13426,7 +14392,7 @@
         <w:pStyle w:val="Heading2"/>
       </w:pPr>
       <w:r>
-        <w:t xml:space="preserve">2.4 Complaint Case Screen</w:t>
+        <w:t xml:space="preserve">2.4 My Complaint Cases (Agent Worklist)</w:t>
       </w:r>
     </w:p>
     <w:tbl>
@@ -13539,7 +14505,7 @@
                 <w:sz w:val="18"/>
                 <w:szCs w:val="18"/>
               </w:rPr>
-              <w:t xml:space="preserve">Agent (logs, works case); Lead (reassigns, escalates further to Compliance if warranted, closes high-severity cases)</w:t>
+              <w:t xml:space="preserve">Agent (own assigned cases); Lead (all Agents' cases, for oversight)</w:t>
             </w:r>
           </w:p>
         </w:tc>
@@ -13584,7 +14550,7 @@
                 <w:sz w:val="18"/>
                 <w:szCs w:val="18"/>
               </w:rPr>
-              <w:t xml:space="preserve">Track a Member's Complaint Case from intake through resolution.</w:t>
+              <w:t xml:space="preserve">An Agent's own worklist of assigned Complaint Cases, independent of any specific Member — previously an Agent could only reach a complaint through that Member's own detail screen, with no way to see their full caseload at a glance.</w:t>
             </w:r>
           </w:p>
         </w:tc>
@@ -13629,7 +14595,7 @@
                 <w:sz w:val="18"/>
                 <w:szCs w:val="18"/>
               </w:rPr>
-              <w:t xml:space="preserve">Complaint Case ID, linked Member, category (service, billing, clinical concern, staff conduct), severity, narrative/correspondence log, status (Open, In Progress, Escalated, Resolved), resolution summary</w:t>
+              <w:t xml:space="preserve">Complaint Case ID, linked Member, category, severity, status, age/SLA — across every complaint assigned to this Agent (or, for a Lead, filterable by any Agent).</w:t>
             </w:r>
           </w:p>
         </w:tc>
@@ -13674,7 +14640,7 @@
                 <w:sz w:val="18"/>
                 <w:szCs w:val="18"/>
               </w:rPr>
-              <w:t xml:space="preserve">Log correspondence; set severity; assign/reassign owner; escalate to Lead; escalate to Compliance module (creates linked Incident Case if clinical/safety concern); resolve and close</w:t>
+              <w:t xml:space="preserve">Filter by category/severity/status/age; open Complaint Case Screen (2.5); for a Lead, reassign a case from one Agent to another directly from this worklist.</w:t>
             </w:r>
           </w:p>
         </w:tc>
@@ -13719,7 +14685,7 @@
                 <w:sz w:val="18"/>
                 <w:szCs w:val="18"/>
               </w:rPr>
-              <w:t xml:space="preserve">From: Member Detail screen or module launcher. To: Member Detail screen; Lead Escalation Queue; Incident Case screen (Compliance module, if escalated)</w:t>
+              <w:t xml:space="preserve">From: module launcher. To: Complaint Case Screen (2.5), Member Detail (for full context).</w:t>
             </w:r>
           </w:p>
         </w:tc>
@@ -13764,7 +14730,52 @@
                 <w:sz w:val="18"/>
                 <w:szCs w:val="18"/>
               </w:rPr>
-              <w:t xml:space="preserve">Cannot close case without resolution summary; clinical-safety category auto-flags for mandatory Compliance escalation and blocks closure until acknowledged</w:t>
+              <w:t xml:space="preserve">None beyond navigation.</w:t>
+            </w:r>
+          </w:p>
+        </w:tc>
+      </w:tr>
+      <w:tr>
+        <w:trPr>
+          <w:cantSplit/>
+        </w:trPr>
+        <w:tc>
+          <w:tcPr>
+            <w:tcW w:type="dxa" w:w="4680"/>
+            <w:tcMar>
+              <w:top w:type="dxa" w:w="90"/>
+              <w:left w:type="dxa" w:w="110"/>
+              <w:bottom w:type="dxa" w:w="90"/>
+              <w:right w:type="dxa" w:w="110"/>
+            </w:tcMar>
+          </w:tcPr>
+          <w:p>
+            <w:r>
+              <w:rPr>
+                <w:sz w:val="18"/>
+                <w:szCs w:val="18"/>
+              </w:rPr>
+              <w:t xml:space="preserve">Empty state</w:t>
+            </w:r>
+          </w:p>
+        </w:tc>
+        <w:tc>
+          <w:tcPr>
+            <w:tcW w:type="dxa" w:w="4680"/>
+            <w:tcMar>
+              <w:top w:type="dxa" w:w="90"/>
+              <w:left w:type="dxa" w:w="110"/>
+              <w:bottom w:type="dxa" w:w="90"/>
+              <w:right w:type="dxa" w:w="110"/>
+            </w:tcMar>
+          </w:tcPr>
+          <w:p>
+            <w:r>
+              <w:rPr>
+                <w:sz w:val="18"/>
+                <w:szCs w:val="18"/>
+              </w:rPr>
+              <w:t xml:space="preserve">"No complaint cases assigned to you" as a positive confirmation state.</w:t>
             </w:r>
           </w:p>
         </w:tc>
@@ -13785,7 +14796,7 @@
         <w:pStyle w:val="Heading2"/>
       </w:pPr>
       <w:r>
-        <w:t xml:space="preserve">2.5 Win-Back / Lapsed-Member Outreach Queue</w:t>
+        <w:t xml:space="preserve">2.5 Complaint Case Screen</w:t>
       </w:r>
     </w:p>
     <w:tbl>
@@ -13898,7 +14909,7 @@
                 <w:sz w:val="18"/>
                 <w:szCs w:val="18"/>
               </w:rPr>
-              <w:t xml:space="preserve">Agent (works queue, logs outreach); Lead (view team performance, reassign items)</w:t>
+              <w:t xml:space="preserve">Agent (logs, works case); Lead (reassigns, escalates further to Compliance if warranted, closes high-severity cases)</w:t>
             </w:r>
           </w:p>
         </w:tc>
@@ -13943,7 +14954,7 @@
                 <w:sz w:val="18"/>
                 <w:szCs w:val="18"/>
               </w:rPr>
-              <w:t xml:space="preserve">Prioritized worklist of Suspended and Lapsed Members for proactive re-engagement outreach.</w:t>
+              <w:t xml:space="preserve">Track a Member's Complaint Case from intake through resolution.</w:t>
             </w:r>
           </w:p>
         </w:tc>
@@ -13988,7 +14999,7 @@
                 <w:sz w:val="18"/>
                 <w:szCs w:val="18"/>
               </w:rPr>
-              <w:t xml:space="preserve">Member name, prior plan, lapse/suspension date and reason, last contact attempt, outreach outcome history, suggested offer/incentive (if configured); a hard exclusion flag for deceased members, rendered as a non-selectable, greyed row rather than simply absent, so an Agent scanning the queue sees explicitly why a recently-lapsed name they expected isn't actionable</w:t>
+              <w:t xml:space="preserve">Complaint Case ID, linked Member, category (service, billing, clinical concern, staff conduct), severity, narrative/correspondence log, status (Open, In Progress, Escalated, Resolved), resolution summary</w:t>
             </w:r>
           </w:p>
         </w:tc>
@@ -14033,7 +15044,7 @@
                 <w:sz w:val="18"/>
                 <w:szCs w:val="18"/>
               </w:rPr>
-              <w:t xml:space="preserve">Filter by lapse reason/plan/branch; log outreach attempt and outcome; mark as won-back (routes to reinstatement); mark as declined/do-not-contact</w:t>
+              <w:t xml:space="preserve">Log correspondence; set severity; assign/reassign owner; escalate to Lead; escalate to Compliance module (creates linked Incident Case if clinical/safety concern); resolve and close</w:t>
             </w:r>
           </w:p>
         </w:tc>
@@ -14078,7 +15089,7 @@
                 <w:sz w:val="18"/>
                 <w:szCs w:val="18"/>
               </w:rPr>
-              <w:t xml:space="preserve">From: module launcher. To: Member Detail screen; Plan Change screen (on reinstatement)</w:t>
+              <w:t xml:space="preserve">From: My Complaint Cases (2.4), Member Detail screen, or module launcher. To: Member Detail screen; Lead Escalation Queue; Incident Case screen (Compliance module, if escalated)</w:t>
             </w:r>
           </w:p>
         </w:tc>
@@ -14123,52 +15134,7 @@
                 <w:sz w:val="18"/>
                 <w:szCs w:val="18"/>
               </w:rPr>
-              <w:t xml:space="preserve">Cannot log contact against a Member marked do-not-contact or deceased — the deceased exclusion is a hard, non-overridable block, not a warning an Agent can dismiss; reinstatement requires valid payment method before status change completes</w:t>
-            </w:r>
-          </w:p>
-        </w:tc>
-      </w:tr>
-      <w:tr>
-        <w:trPr>
-          <w:cantSplit/>
-        </w:trPr>
-        <w:tc>
-          <w:tcPr>
-            <w:tcW w:type="dxa" w:w="4680"/>
-            <w:tcMar>
-              <w:top w:type="dxa" w:w="90"/>
-              <w:left w:type="dxa" w:w="110"/>
-              <w:bottom w:type="dxa" w:w="90"/>
-              <w:right w:type="dxa" w:w="110"/>
-            </w:tcMar>
-          </w:tcPr>
-          <w:p>
-            <w:r>
-              <w:rPr>
-                <w:sz w:val="18"/>
-                <w:szCs w:val="18"/>
-              </w:rPr>
-              <w:t xml:space="preserve">Empty state</w:t>
-            </w:r>
-          </w:p>
-        </w:tc>
-        <w:tc>
-          <w:tcPr>
-            <w:tcW w:type="dxa" w:w="4680"/>
-            <w:tcMar>
-              <w:top w:type="dxa" w:w="90"/>
-              <w:left w:type="dxa" w:w="110"/>
-              <w:bottom w:type="dxa" w:w="90"/>
-              <w:right w:type="dxa" w:w="110"/>
-            </w:tcMar>
-          </w:tcPr>
-          <w:p>
-            <w:r>
-              <w:rPr>
-                <w:sz w:val="18"/>
-                <w:szCs w:val="18"/>
-              </w:rPr>
-              <w:t xml:space="preserve">"No members currently in outreach" as a positive confirmation state</w:t>
+              <w:t xml:space="preserve">Cannot close case without resolution summary; clinical-safety category auto-flags for mandatory Compliance escalation and blocks closure until acknowledged</w:t>
             </w:r>
           </w:p>
         </w:tc>
@@ -14189,7 +15155,7 @@
         <w:pStyle w:val="Heading2"/>
       </w:pPr>
       <w:r>
-        <w:t xml:space="preserve">2.6 Lead Escalation Queue</w:t>
+        <w:t xml:space="preserve">2.6 Win-Back / Lapsed-Member Outreach Queue</w:t>
       </w:r>
     </w:p>
     <w:tbl>
@@ -14302,7 +15268,7 @@
                 <w:sz w:val="18"/>
                 <w:szCs w:val="18"/>
               </w:rPr>
-              <w:t xml:space="preserve">Membership and Customer Success Lead only</w:t>
+              <w:t xml:space="preserve">Agent (works queue, logs outreach); Lead (view team performance, reassign items)</w:t>
             </w:r>
           </w:p>
         </w:tc>
@@ -14347,7 +15313,7 @@
                 <w:sz w:val="18"/>
                 <w:szCs w:val="18"/>
               </w:rPr>
-              <w:t xml:space="preserve">Cross-cutting queue aggregating exceptions and escalations raised by Agents needing Lead review or approval.</w:t>
+              <w:t xml:space="preserve">Prioritized worklist of Suspended and Lapsed Members for proactive re-engagement outreach.</w:t>
             </w:r>
           </w:p>
         </w:tc>
@@ -14392,7 +15358,7 @@
                 <w:sz w:val="18"/>
                 <w:szCs w:val="18"/>
               </w:rPr>
-              <w:t xml:space="preserve">Escalation type (Plan Change override, Complaint Case escalation, suspension/reinstatement exception), source Agent, linked Member, age/SLA, priority; a banner indicating a Backup Lead is covering, if one is active (same continuity pattern as 1.9's Backup Finance Manager)</w:t>
+              <w:t xml:space="preserve">Member name, prior plan, lapse/suspension date and reason, last contact attempt, outreach outcome history, suggested offer/incentive (if configured); a hard exclusion flag for deceased members, rendered as a non-selectable, greyed row rather than simply absent, so an Agent scanning the queue sees explicitly why a recently-lapsed name they expected isn't actionable</w:t>
             </w:r>
           </w:p>
         </w:tc>
@@ -14437,7 +15403,7 @@
                 <w:sz w:val="18"/>
                 <w:szCs w:val="18"/>
               </w:rPr>
-              <w:t xml:space="preserve">Filter by type/age; open underlying case; approve/deny with comment; reassign to another Agent; escalate further to Compliance; designate/end a Backup Lead covering period</w:t>
+              <w:t xml:space="preserve">Filter by lapse reason/plan/branch; log outreach attempt and outcome; mark as won-back (routes to reinstatement); mark as declined/do-not-contact</w:t>
             </w:r>
           </w:p>
         </w:tc>
@@ -14482,7 +15448,7 @@
                 <w:sz w:val="18"/>
                 <w:szCs w:val="18"/>
               </w:rPr>
-              <w:t xml:space="preserve">From: platform home or any Agent-submitted escalation action. To: Member Detail, Plan Change, Complaint Case screens</w:t>
+              <w:t xml:space="preserve">From: module launcher. To: Member Detail screen; Plan Change screen (on reinstatement)</w:t>
             </w:r>
           </w:p>
         </w:tc>
@@ -14527,7 +15493,7 @@
                 <w:sz w:val="18"/>
                 <w:szCs w:val="18"/>
               </w:rPr>
-              <w:t xml:space="preserve">Denial requires comment returned to submitting Agent; items past SLA flagged for priority handling</w:t>
+              <w:t xml:space="preserve">Cannot log contact against a Member marked do-not-contact or deceased — the deceased exclusion is a hard, non-overridable block, not a warning an Agent can dismiss; reinstatement requires valid payment method before status change completes</w:t>
             </w:r>
           </w:p>
         </w:tc>
@@ -14572,7 +15538,7 @@
                 <w:sz w:val="18"/>
                 <w:szCs w:val="18"/>
               </w:rPr>
-              <w:t xml:space="preserve">"Nothing awaiting your review" as a positive confirmation state</w:t>
+              <w:t xml:space="preserve">"No members currently in outreach" as a positive confirmation state</w:t>
             </w:r>
           </w:p>
         </w:tc>
@@ -14593,7 +15559,7 @@
         <w:pStyle w:val="Heading2"/>
       </w:pPr>
       <w:r>
-        <w:t xml:space="preserve">2.7 Customer Success Lead Quality-Review Sampling Screen</w:t>
+        <w:t xml:space="preserve">2.7 Lead Escalation Queue</w:t>
       </w:r>
     </w:p>
     <w:tbl>
@@ -14751,7 +15717,7 @@
                 <w:sz w:val="18"/>
                 <w:szCs w:val="18"/>
               </w:rPr>
-              <w:t xml:space="preserve">Conduct the periodic review of a system-drawn sample of Agent-handled cases — not only the ones escalated to the Lead — to catch a service-quality pattern before it becomes a complaint trend, mirroring 1.12's Finance Manager equivalent.</w:t>
+              <w:t xml:space="preserve">Cross-cutting queue aggregating exceptions and escalations raised by Agents needing Lead review or approval.</w:t>
             </w:r>
           </w:p>
         </w:tc>
@@ -14796,7 +15762,7 @@
                 <w:sz w:val="18"/>
                 <w:szCs w:val="18"/>
               </w:rPr>
-              <w:t xml:space="preserve">A sampled set of recent Agent decisions (plan changes processed, complaints resolved, win-back outreach outcomes) drawn automatically across all Agents; each item's original handling and any prior review outcome; aggregate resolution-time and complaint-recurrence metrics per Agent</w:t>
+              <w:t xml:space="preserve">Escalation type (Plan Change override, Complaint Case escalation, suspension/reinstatement exception), source Agent, linked Member, age/SLA, priority; a banner indicating a Backup Lead is covering, if one is active (same continuity pattern as 1.9's Backup Finance Manager)</w:t>
             </w:r>
           </w:p>
         </w:tc>
@@ -14841,7 +15807,7 @@
                 <w:sz w:val="18"/>
                 <w:szCs w:val="18"/>
               </w:rPr>
-              <w:t xml:space="preserve">Mark a sampled case as Consistent or Flag for Follow-Up; add a coaching note visible to the reviewed Agent; escalate a pattern to a documented performance conversation tracked outside this system; close the sampling cycle</w:t>
+              <w:t xml:space="preserve">Filter by type/age; open underlying case; approve/deny with comment; reassign to another Agent; escalate further to Compliance; designate/end a Backup Lead covering period</w:t>
             </w:r>
           </w:p>
         </w:tc>
@@ -14886,7 +15852,7 @@
                 <w:sz w:val="18"/>
                 <w:szCs w:val="18"/>
               </w:rPr>
-              <w:t xml:space="preserve">From: module launcher, on the standing monthly cadence. To: the specific underlying Member Detail, Plan Change, or Complaint Case screen for a sampled item</w:t>
+              <w:t xml:space="preserve">From: platform home or any Agent-submitted escalation action. To: Member Detail, Plan Change, Complaint Case screens</w:t>
             </w:r>
           </w:p>
         </w:tc>
@@ -14931,7 +15897,7 @@
                 <w:sz w:val="18"/>
                 <w:szCs w:val="18"/>
               </w:rPr>
-              <w:t xml:space="preserve">Cannot close a sampling cycle with a flagged item that has no follow-up note recorded</w:t>
+              <w:t xml:space="preserve">Denial requires comment returned to submitting Agent; items past SLA flagged for priority handling</w:t>
             </w:r>
           </w:p>
         </w:tc>
@@ -14976,7 +15942,7 @@
                 <w:sz w:val="18"/>
                 <w:szCs w:val="18"/>
               </w:rPr>
-              <w:t xml:space="preserve">"No Agent decisions this period" using the same positive-confirmation treatment as 1.12</w:t>
+              <w:t xml:space="preserve">"Nothing awaiting your review" as a positive confirmation state</w:t>
             </w:r>
           </w:p>
         </w:tc>
@@ -14994,23 +15960,10 @@
     </w:p>
     <w:p>
       <w:pPr>
-        <w:pStyle w:val="Heading1"/>
-      </w:pPr>
-      <w:r>
-        <w:t xml:space="preserve">Module 3: Compliance and Governance</w:t>
-      </w:r>
-    </w:p>
-    <w:p>
-      <w:r>
-        <w:br w:type="page"/>
-      </w:r>
-    </w:p>
-    <w:p>
-      <w:pPr>
         <w:pStyle w:val="Heading2"/>
       </w:pPr>
       <w:r>
-        <w:t xml:space="preserve">3.1 Incident Case Investigation Screen</w:t>
+        <w:t xml:space="preserve">2.8 Customer Success Lead Quality-Review Sampling Screen</w:t>
       </w:r>
     </w:p>
     <w:tbl>
@@ -15123,7 +16076,7 @@
                 <w:sz w:val="18"/>
                 <w:szCs w:val="18"/>
               </w:rPr>
-              <w:t xml:space="preserve">Compliance/Clinical Quality Officer</w:t>
+              <w:t xml:space="preserve">Membership and Customer Success Lead only</w:t>
             </w:r>
           </w:p>
         </w:tc>
@@ -15168,7 +16121,7 @@
                 <w:sz w:val="18"/>
                 <w:szCs w:val="18"/>
               </w:rPr>
-              <w:t xml:space="preserve">Investigate and manage a single Incident Case (safety, clinical, or operational) from report through closure.</w:t>
+              <w:t xml:space="preserve">Conduct the periodic review of a system-drawn sample of Agent-handled cases — not only the ones escalated to the Lead — to catch a service-quality pattern before it becomes a complaint trend, mirroring 1.12's Finance Manager equivalent.</w:t>
             </w:r>
           </w:p>
         </w:tc>
@@ -15213,7 +16166,7 @@
                 <w:sz w:val="18"/>
                 <w:szCs w:val="18"/>
               </w:rPr>
-              <w:t xml:space="preserve">Incident Case ID, linked Member/patient, linked Vehicle/Crew Record (if ambulance-related), incident type/severity, narrative timeline, linked Complaint Case (if origin), investigation findings, corrective actions, status (Reported, Under Investigation, Corrective Action, Closed)</w:t>
+              <w:t xml:space="preserve">A sampled set of recent Agent decisions (plan changes processed, complaints resolved, win-back outreach outcomes) drawn automatically across all Agents; each item's original handling and any prior review outcome; aggregate resolution-time and complaint-recurrence metrics per Agent</w:t>
             </w:r>
           </w:p>
         </w:tc>
@@ -15258,7 +16211,7 @@
                 <w:sz w:val="18"/>
                 <w:szCs w:val="18"/>
               </w:rPr>
-              <w:t xml:space="preserve">Add investigation note; assign investigator; record findings; define corrective action with owner and due date; link related Incident Cases; close case</w:t>
+              <w:t xml:space="preserve">Mark a sampled case as Consistent or Flag for Follow-Up; add a coaching note visible to the reviewed Agent; escalate a pattern to a documented performance conversation tracked outside this system; close the sampling cycle</w:t>
             </w:r>
           </w:p>
         </w:tc>
@@ -15303,7 +16256,7 @@
                 <w:sz w:val="18"/>
                 <w:szCs w:val="18"/>
               </w:rPr>
-              <w:t xml:space="preserve">From: Complaint Case screen (Membership module escalation), regulatory alert, or module launcher (via an Incident Case List, which shows "No open Incident Cases" as its empty state — a positive confirmation, not a neutral one, given what it means for patient safety). To: Regulatory Reporting Calendar/Tracker (if reportable); Credential Expiry Dashboard (if staff-competency related)</w:t>
+              <w:t xml:space="preserve">From: module launcher, on the standing monthly cadence. To: the specific underlying Member Detail, Plan Change, or Complaint Case screen for a sampled item</w:t>
             </w:r>
           </w:p>
         </w:tc>
@@ -15348,7 +16301,52 @@
                 <w:sz w:val="18"/>
                 <w:szCs w:val="18"/>
               </w:rPr>
-              <w:t xml:space="preserve">Cannot close case with open corrective actions; reportable-incident flag blocks closure until regulatory filing status is confirmed</w:t>
+              <w:t xml:space="preserve">Cannot close a sampling cycle with a flagged item that has no follow-up note recorded</w:t>
+            </w:r>
+          </w:p>
+        </w:tc>
+      </w:tr>
+      <w:tr>
+        <w:trPr>
+          <w:cantSplit/>
+        </w:trPr>
+        <w:tc>
+          <w:tcPr>
+            <w:tcW w:type="dxa" w:w="4680"/>
+            <w:tcMar>
+              <w:top w:type="dxa" w:w="90"/>
+              <w:left w:type="dxa" w:w="110"/>
+              <w:bottom w:type="dxa" w:w="90"/>
+              <w:right w:type="dxa" w:w="110"/>
+            </w:tcMar>
+          </w:tcPr>
+          <w:p>
+            <w:r>
+              <w:rPr>
+                <w:sz w:val="18"/>
+                <w:szCs w:val="18"/>
+              </w:rPr>
+              <w:t xml:space="preserve">Empty state</w:t>
+            </w:r>
+          </w:p>
+        </w:tc>
+        <w:tc>
+          <w:tcPr>
+            <w:tcW w:type="dxa" w:w="4680"/>
+            <w:tcMar>
+              <w:top w:type="dxa" w:w="90"/>
+              <w:left w:type="dxa" w:w="110"/>
+              <w:bottom w:type="dxa" w:w="90"/>
+              <w:right w:type="dxa" w:w="110"/>
+            </w:tcMar>
+          </w:tcPr>
+          <w:p>
+            <w:r>
+              <w:rPr>
+                <w:sz w:val="18"/>
+                <w:szCs w:val="18"/>
+              </w:rPr>
+              <w:t xml:space="preserve">"No Agent decisions this period" using the same positive-confirmation treatment as 1.12</w:t>
             </w:r>
           </w:p>
         </w:tc>
@@ -15366,10 +16364,23 @@
     </w:p>
     <w:p>
       <w:pPr>
+        <w:pStyle w:val="Heading1"/>
+      </w:pPr>
+      <w:r>
+        <w:t xml:space="preserve">Module 3: Compliance and Governance</w:t>
+      </w:r>
+    </w:p>
+    <w:p>
+      <w:r>
+        <w:br w:type="page"/>
+      </w:r>
+    </w:p>
+    <w:p>
+      <w:pPr>
         <w:pStyle w:val="Heading2"/>
       </w:pPr>
       <w:r>
-        <w:t xml:space="preserve">3.2 Credentialing / Onboarding Verification Queue</w:t>
+        <w:t xml:space="preserve">3.0 Incident Case List</w:t>
       </w:r>
     </w:p>
     <w:tbl>
@@ -15527,7 +16538,7 @@
                 <w:sz w:val="18"/>
                 <w:szCs w:val="18"/>
               </w:rPr>
-              <w:t xml:space="preserve">Track the full new-clinician credentialing process from primary-source verification through independent scheduling eligibility — not just a generic document checklist.</w:t>
+              <w:t xml:space="preserve">The full worklist of Incident Cases, previously only referenced in passing as a navigation source from the Investigation Screen — given its own complete specification here.</w:t>
             </w:r>
           </w:p>
         </w:tc>
@@ -15572,7 +16583,7 @@
                 <w:sz w:val="18"/>
                 <w:szCs w:val="18"/>
               </w:rPr>
-              <w:t xml:space="preserve">Candidate/staff name, role applied for; a structured checklist reflecting every distinct verification step: primary-source license verification (issuing body contacted, response received, outcome), background/police-record check (status, outcome), professional indemnity/malpractice insurance confirmation (current, expiry), scope-of-practice grant (exactly which service types and acuity levels this individual is credentialed for — not a blanket yes/no), supervised-orientation/shadowing period status and supervising clinician's sign-off; overall clearance status (Not Verified, Restricted — supervised only, Fully Cleared); a case-age indicator with an "aged-open" flag distinct from normal in-progress status, raised when a case has been open longer than the standard verification window because the issuing body hasn't responded</w:t>
+              <w:t xml:space="preserve">Incident Case ID, category (clinical adverse event, medication error, vehicle accident, equipment failure, staff conduct, data breach, near-miss), severity, linked patient/Member or Vehicle/Crew Record, status (Reported, Under Investigation, Corrective Action, Closed), age, reportable-to-regulator flag</w:t>
             </w:r>
           </w:p>
         </w:tc>
@@ -15617,7 +16628,7 @@
                 <w:sz w:val="18"/>
                 <w:szCs w:val="18"/>
               </w:rPr>
-              <w:t xml:space="preserve">Mark each checklist item verified/rejected independently (not a single overall toggle); record the scope-of-practice grant, which technically propagates to the Scheduling/Emergency Dispatcher's assignment engine so an under-scoped clinician cannot be assigned outside their granted scope; record supervising clinician's sign-off; escalate an aged-open case for issuing-body follow-up; clear staff member for activation (routes to User Account activation in 4.1); reject/hold onboarding</w:t>
+              <w:t xml:space="preserve">Filter by category/severity/status/age; open Incident Case Investigation Screen (3.1); create a new case directly (for a Compliance-initiated investigation not originating from a Complaint Case)</w:t>
             </w:r>
           </w:p>
         </w:tc>
@@ -15662,7 +16673,7 @@
                 <w:sz w:val="18"/>
                 <w:szCs w:val="18"/>
               </w:rPr>
-              <w:t xml:space="preserve">From: module launcher or IT Administration's new User Account creation trigger. To: User Account screen (IT module, cross-link to activate access); Credential Expiry Tracking Dashboard; Compensation Profile Setup Screen (1.11, once cleared)</w:t>
+              <w:t xml:space="preserve">From: module launcher. To: Incident Case Investigation Screen (3.1)</w:t>
             </w:r>
           </w:p>
         </w:tc>
@@ -15707,7 +16718,7 @@
                 <w:sz w:val="18"/>
                 <w:szCs w:val="18"/>
               </w:rPr>
-              <w:t xml:space="preserve">Cannot mark full clearance while any required item is Pending or Rejected; expired document at intake blocks verification; a Restricted (supervised-only) clearance is enforced technically on the assignment engine, not left as a note for dispatchers to remember; aged-open cases beyond the standard window auto-escalate rather than sitting silently</w:t>
+              <w:t xml:space="preserve">None beyond navigation</w:t>
             </w:r>
           </w:p>
         </w:tc>
@@ -15752,7 +16763,7 @@
                 <w:sz w:val="18"/>
                 <w:szCs w:val="18"/>
               </w:rPr>
-              <w:t xml:space="preserve">"No onboarding cases in progress" as a positive confirmation state</w:t>
+              <w:t xml:space="preserve">"No open Incident Cases" as a positive confirmation state — deliberately not styled as a neutral empty list, given the patient-safety significance of this being true</w:t>
             </w:r>
           </w:p>
         </w:tc>
@@ -15773,7 +16784,7 @@
         <w:pStyle w:val="Heading2"/>
       </w:pPr>
       <w:r>
-        <w:t xml:space="preserve">3.3 Credential Expiry Tracking Dashboard</w:t>
+        <w:t xml:space="preserve">3.1 Incident Case Investigation Screen</w:t>
       </w:r>
     </w:p>
     <w:tbl>
@@ -15931,7 +16942,7 @@
                 <w:sz w:val="18"/>
                 <w:szCs w:val="18"/>
               </w:rPr>
-              <w:t xml:space="preserve">Monitor upcoming and past-due credential expirations across all active clinical/crew staff.</w:t>
+              <w:t xml:space="preserve">Investigate and manage a single Incident Case (safety, clinical, or operational) from report through closure.</w:t>
             </w:r>
           </w:p>
         </w:tc>
@@ -15976,7 +16987,7 @@
                 <w:sz w:val="18"/>
                 <w:szCs w:val="18"/>
               </w:rPr>
-              <w:t xml:space="preserve">Staff name, role, credential type, expiry date, days remaining/overdue, renewal status, branch</w:t>
+              <w:t xml:space="preserve">Incident Case ID, linked Member/patient, linked Vehicle/Crew Record (if ambulance-related), incident type/severity, narrative timeline, linked Complaint Case (if origin), investigation findings, corrective actions, status (Reported, Under Investigation, Corrective Action, Closed)</w:t>
             </w:r>
           </w:p>
         </w:tc>
@@ -16021,7 +17032,7 @@
                 <w:sz w:val="18"/>
                 <w:szCs w:val="18"/>
               </w:rPr>
-              <w:t xml:space="preserve">Filter by expiry window/role/branch; send renewal reminder; mark renewed with new expiry date; flag for suspension if lapsed</w:t>
+              <w:t xml:space="preserve">Add investigation note; assign investigator; record findings; define corrective action with owner and due date; link related Incident Cases; close case</w:t>
             </w:r>
           </w:p>
         </w:tc>
@@ -16066,7 +17077,7 @@
                 <w:sz w:val="18"/>
                 <w:szCs w:val="18"/>
               </w:rPr>
-              <w:t xml:space="preserve">From: module launcher or Incident Case (if incident tied to expired credential). To: Credentialing Verification Queue (renewal documentation); User Account screen (IT module, to suspend access if lapsed)</w:t>
+              <w:t xml:space="preserve">From: Incident Case List (3.0), Complaint Case screen (Membership module escalation), or regulatory alert. To: Regulatory Reporting Calendar/Tracker (if reportable); Credential Expiry Dashboard (if staff-competency related)</w:t>
             </w:r>
           </w:p>
         </w:tc>
@@ -16111,52 +17122,7 @@
                 <w:sz w:val="18"/>
                 <w:szCs w:val="18"/>
               </w:rPr>
-              <w:t xml:space="preserve">Overdue credential auto-flags staff record; cannot clear flag without renewal documentation attached</w:t>
-            </w:r>
-          </w:p>
-        </w:tc>
-      </w:tr>
-      <w:tr>
-        <w:trPr>
-          <w:cantSplit/>
-        </w:trPr>
-        <w:tc>
-          <w:tcPr>
-            <w:tcW w:type="dxa" w:w="4680"/>
-            <w:tcMar>
-              <w:top w:type="dxa" w:w="90"/>
-              <w:left w:type="dxa" w:w="110"/>
-              <w:bottom w:type="dxa" w:w="90"/>
-              <w:right w:type="dxa" w:w="110"/>
-            </w:tcMar>
-          </w:tcPr>
-          <w:p>
-            <w:r>
-              <w:rPr>
-                <w:sz w:val="18"/>
-                <w:szCs w:val="18"/>
-              </w:rPr>
-              <w:t xml:space="preserve">Empty state</w:t>
-            </w:r>
-          </w:p>
-        </w:tc>
-        <w:tc>
-          <w:tcPr>
-            <w:tcW w:type="dxa" w:w="4680"/>
-            <w:tcMar>
-              <w:top w:type="dxa" w:w="90"/>
-              <w:left w:type="dxa" w:w="110"/>
-              <w:bottom w:type="dxa" w:w="90"/>
-              <w:right w:type="dxa" w:w="110"/>
-            </w:tcMar>
-          </w:tcPr>
-          <w:p>
-            <w:r>
-              <w:rPr>
-                <w:sz w:val="18"/>
-                <w:szCs w:val="18"/>
-              </w:rPr>
-              <w:t xml:space="preserve">"No credentials expiring in the selected window" as a positive confirmation state</w:t>
+              <w:t xml:space="preserve">Cannot close case with open corrective actions; reportable-incident flag blocks closure until regulatory filing status is confirmed</w:t>
             </w:r>
           </w:p>
         </w:tc>
@@ -16177,7 +17143,7 @@
         <w:pStyle w:val="Heading2"/>
       </w:pPr>
       <w:r>
-        <w:t xml:space="preserve">3.4 Controlled-Substance Audit Screen</w:t>
+        <w:t xml:space="preserve">3.2 Credentialing / Onboarding Verification Queue</w:t>
       </w:r>
     </w:p>
     <w:tbl>
@@ -16335,7 +17301,7 @@
                 <w:sz w:val="18"/>
                 <w:szCs w:val="18"/>
               </w:rPr>
-              <w:t xml:space="preserve">Reconcile controlled-substance administration/inventory records against Clinical Note billing-code extracts and crew logs to detect discrepancies.</w:t>
+              <w:t xml:space="preserve">Track the full new-clinician credentialing process from primary-source verification through independent scheduling eligibility — not just a generic document checklist.</w:t>
             </w:r>
           </w:p>
         </w:tc>
@@ -16380,7 +17346,7 @@
                 <w:sz w:val="18"/>
                 <w:szCs w:val="18"/>
               </w:rPr>
-              <w:t xml:space="preserve">Substance/lot, assigned Vehicle/Crew Record, dispensed quantity vs. administered/documented quantity, discrepancy flag, linked Clinical Note reference (code extract only), audit period</w:t>
+              <w:t xml:space="preserve">Candidate/staff name, role applied for; a structured checklist reflecting every distinct verification step: primary-source license verification (issuing body contacted, response received, outcome), background/police-record check (status, outcome), professional indemnity/malpractice insurance confirmation (current, expiry), scope-of-practice grant (exactly which service types and acuity levels this individual is credentialed for — not a blanket yes/no), supervised-orientation/shadowing period status and supervising clinician's sign-off; overall clearance status (Not Verified, Restricted — supervised only, Fully Cleared); a case-age indicator with an "aged-open" flag distinct from normal in-progress status, raised when a case has been open longer than the standard verification window because the issuing body hasn't responded</w:t>
             </w:r>
           </w:p>
         </w:tc>
@@ -16425,7 +17391,7 @@
                 <w:sz w:val="18"/>
                 <w:szCs w:val="18"/>
               </w:rPr>
-              <w:t xml:space="preserve">Reconcile line item; flag discrepancy for investigation (creates linked Incident Case); mark period audited; export audit log</w:t>
+              <w:t xml:space="preserve">Mark each checklist item verified/rejected independently (not a single overall toggle); record the scope-of-practice grant, which technically propagates to the Scheduling/Emergency Dispatcher's assignment engine so an under-scoped clinician cannot be assigned outside their granted scope; record supervising clinician's sign-off; escalate an aged-open case for issuing-body follow-up; clear staff member for activation (routes to User Account activation in 4.1); reject/hold onboarding</w:t>
             </w:r>
           </w:p>
         </w:tc>
@@ -16470,7 +17436,7 @@
                 <w:sz w:val="18"/>
                 <w:szCs w:val="18"/>
               </w:rPr>
-              <w:t xml:space="preserve">From: module launcher. To: Incident Case Investigation screen (on discrepancy); Regulatory Reporting Calendar/Tracker</w:t>
+              <w:t xml:space="preserve">From: module launcher or IT Administration's new User Account creation trigger. To: User Account screen (IT module, cross-link to activate access); Credential Expiry Tracking Dashboard; Compensation Profile Setup Screen (1.11, once cleared)</w:t>
             </w:r>
           </w:p>
         </w:tc>
@@ -16515,7 +17481,7 @@
                 <w:sz w:val="18"/>
                 <w:szCs w:val="18"/>
               </w:rPr>
-              <w:t xml:space="preserve">Cannot mark period audited with unresolved discrepancies; access to full Clinical Note blocked, only billing-code extract visible, consistent with platform-wide restriction</w:t>
+              <w:t xml:space="preserve">Cannot mark full clearance while any required item is Pending or Rejected; expired document at intake blocks verification; a Restricted (supervised-only) clearance is enforced technically on the assignment engine, not left as a note for dispatchers to remember; aged-open cases beyond the standard window auto-escalate rather than sitting silently</w:t>
             </w:r>
           </w:p>
         </w:tc>
@@ -16560,7 +17526,7 @@
                 <w:sz w:val="18"/>
                 <w:szCs w:val="18"/>
               </w:rPr>
-              <w:t xml:space="preserve">"No discrepancies in this audit period" as a positive confirmation state, shown only after the reconciliation itself completes — never shown by default before the audit has actually run, to avoid it being mistaken for "nothing to audit"</w:t>
+              <w:t xml:space="preserve">"No onboarding cases in progress" as a positive confirmation state</w:t>
             </w:r>
           </w:p>
         </w:tc>
@@ -16581,7 +17547,7 @@
         <w:pStyle w:val="Heading2"/>
       </w:pPr>
       <w:r>
-        <w:t xml:space="preserve">3.5 DSAR Case Screen</w:t>
+        <w:t xml:space="preserve">3.3 Credential Expiry Tracking Dashboard</w:t>
       </w:r>
     </w:p>
     <w:tbl>
@@ -16739,7 +17705,7 @@
                 <w:sz w:val="18"/>
                 <w:szCs w:val="18"/>
               </w:rPr>
-              <w:t xml:space="preserve">Manage a Data Subject Access Request from intake through fulfillment within regulatory deadline, including the deceased-patient-specific path.</w:t>
+              <w:t xml:space="preserve">Monitor upcoming and past-due credential expirations across all active clinical/crew staff.</w:t>
             </w:r>
           </w:p>
         </w:tc>
@@ -16784,7 +17750,7 @@
                 <w:sz w:val="18"/>
                 <w:szCs w:val="18"/>
               </w:rPr>
-              <w:t xml:space="preserve">DSAR Case ID, requestor identity/verification status, request type (access, deletion, correction), scope of records requested, linked source records (Member, Clinical Note, Incident Case, etc.), statutory due date (tracked separately for Jamaica-domestic vs. UK-linked requests, since the deadlines differ), status (Received, Identity Verification, In Progress, Fulfilled, Denied); a distinct deceased-patient mode that, once selected, requires a probate/estate documentation type field (e.g., grant of probate, letters of administration, next-of-kin affidavit, per whichever jurisdiction applies) and a jurisdiction selector driving which post-mortem access rules apply, rather than reusing the standard living-patient identity-verification fields</w:t>
+              <w:t xml:space="preserve">Staff name, role, credential type, expiry date, days remaining/overdue, renewal status, branch</w:t>
             </w:r>
           </w:p>
         </w:tc>
@@ -16829,7 +17795,7 @@
                 <w:sz w:val="18"/>
                 <w:szCs w:val="18"/>
               </w:rPr>
-              <w:t xml:space="preserve">Verify requestor identity (standard path) or verify estate/next-of-kin standing (deceased path, with the probate/estate document type recorded); scope/collect responsive records; redact third-party living individuals' data even from an otherwise-valid estate request; approve fulfillment package; deny with legal basis; close case</w:t>
+              <w:t xml:space="preserve">Filter by expiry window/role/branch; send renewal reminder; mark renewed with new expiry date; flag for suspension if lapsed</w:t>
             </w:r>
           </w:p>
         </w:tc>
@@ -16874,7 +17840,7 @@
                 <w:sz w:val="18"/>
                 <w:szCs w:val="18"/>
               </w:rPr>
-              <w:t xml:space="preserve">From: module launcher or intake alert (via a DSAR Case List, which shows "No open DSAR requests" as its empty state). To: Member Detail (Membership module, read-only reference); Regulatory Reporting Calendar/Tracker (deadline tracking)</w:t>
+              <w:t xml:space="preserve">From: module launcher or Incident Case (if incident tied to expired credential). To: Credentialing Verification Queue (renewal documentation); User Account screen (IT module, to suspend access if lapsed)</w:t>
             </w:r>
           </w:p>
         </w:tc>
@@ -16919,7 +17885,52 @@
                 <w:sz w:val="18"/>
                 <w:szCs w:val="18"/>
               </w:rPr>
-              <w:t xml:space="preserve">Cannot fulfill without identity (or estate-standing) verification complete; statutory deadline countdown flags case as at-risk as due date nears, using the jurisdiction-specific deadline, not a single default; denial requires documented legal basis</w:t>
+              <w:t xml:space="preserve">Overdue credential auto-flags staff record; cannot clear flag without renewal documentation attached</w:t>
+            </w:r>
+          </w:p>
+        </w:tc>
+      </w:tr>
+      <w:tr>
+        <w:trPr>
+          <w:cantSplit/>
+        </w:trPr>
+        <w:tc>
+          <w:tcPr>
+            <w:tcW w:type="dxa" w:w="4680"/>
+            <w:tcMar>
+              <w:top w:type="dxa" w:w="90"/>
+              <w:left w:type="dxa" w:w="110"/>
+              <w:bottom w:type="dxa" w:w="90"/>
+              <w:right w:type="dxa" w:w="110"/>
+            </w:tcMar>
+          </w:tcPr>
+          <w:p>
+            <w:r>
+              <w:rPr>
+                <w:sz w:val="18"/>
+                <w:szCs w:val="18"/>
+              </w:rPr>
+              <w:t xml:space="preserve">Empty state</w:t>
+            </w:r>
+          </w:p>
+        </w:tc>
+        <w:tc>
+          <w:tcPr>
+            <w:tcW w:type="dxa" w:w="4680"/>
+            <w:tcMar>
+              <w:top w:type="dxa" w:w="90"/>
+              <w:left w:type="dxa" w:w="110"/>
+              <w:bottom w:type="dxa" w:w="90"/>
+              <w:right w:type="dxa" w:w="110"/>
+            </w:tcMar>
+          </w:tcPr>
+          <w:p>
+            <w:r>
+              <w:rPr>
+                <w:sz w:val="18"/>
+                <w:szCs w:val="18"/>
+              </w:rPr>
+              <w:t xml:space="preserve">"No credentials expiring in the selected window" as a positive confirmation state</w:t>
             </w:r>
           </w:p>
         </w:tc>
@@ -16940,7 +17951,7 @@
         <w:pStyle w:val="Heading2"/>
       </w:pPr>
       <w:r>
-        <w:t xml:space="preserve">3.6 Regulatory Reporting Calendar / Tracker</w:t>
+        <w:t xml:space="preserve">3.4 Controlled-Substance Audit Screen</w:t>
       </w:r>
     </w:p>
     <w:tbl>
@@ -17098,7 +18109,7 @@
                 <w:sz w:val="18"/>
                 <w:szCs w:val="18"/>
               </w:rPr>
-              <w:t xml:space="preserve">Track all recurring and ad hoc regulatory filing obligations and their submission status.</w:t>
+              <w:t xml:space="preserve">Reconcile controlled-substance administration/inventory records against Clinical Note billing-code extracts and crew logs to detect discrepancies.</w:t>
             </w:r>
           </w:p>
         </w:tc>
@@ -17143,7 +18154,7 @@
                 <w:sz w:val="18"/>
                 <w:szCs w:val="18"/>
               </w:rPr>
-              <w:t xml:space="preserve">Filing/report name, regulator/jurisdiction (Jamaica MOHW and UK-facing obligations tracked separately), frequency, due date, status (Not Started, In Progress, Filed, Overdue), linked source case (Incident Case, DSAR Case, Controlled-Substance Audit)</w:t>
+              <w:t xml:space="preserve">Substance/lot, assigned Vehicle/Crew Record, dispensed quantity vs. administered/documented quantity, discrepancy flag, linked Clinical Note reference (code extract only), audit period</w:t>
             </w:r>
           </w:p>
         </w:tc>
@@ -17188,7 +18199,7 @@
                 <w:sz w:val="18"/>
                 <w:szCs w:val="18"/>
               </w:rPr>
-              <w:t xml:space="preserve">Mark filing in progress/complete; attach filed document/confirmation; set reminder; link source case; log extension/exception</w:t>
+              <w:t xml:space="preserve">Reconcile line item; flag discrepancy for investigation (creates linked Incident Case); mark period audited; export audit log</w:t>
             </w:r>
           </w:p>
         </w:tc>
@@ -17233,7 +18244,7 @@
                 <w:sz w:val="18"/>
                 <w:szCs w:val="18"/>
               </w:rPr>
-              <w:t xml:space="preserve">From: module launcher, or auto-created link from Incident Case/Controlled-Substance Audit/DSAR Case when reportable. To: underlying case screen (Incident Case, DSAR Case, Controlled-Substance Audit)</w:t>
+              <w:t xml:space="preserve">From: module launcher. To: Incident Case Investigation screen (on discrepancy); Regulatory Reporting Calendar/Tracker</w:t>
             </w:r>
           </w:p>
         </w:tc>
@@ -17278,7 +18289,52 @@
                 <w:sz w:val="18"/>
                 <w:szCs w:val="18"/>
               </w:rPr>
-              <w:t xml:space="preserve">Overdue filings flagged and cannot be dismissed without documented reason; jurisdiction mismatch warning if wrong regulator selected for entity type</w:t>
+              <w:t xml:space="preserve">Cannot mark period audited with unresolved discrepancies; access to full Clinical Note blocked, only billing-code extract visible, consistent with platform-wide restriction</w:t>
+            </w:r>
+          </w:p>
+        </w:tc>
+      </w:tr>
+      <w:tr>
+        <w:trPr>
+          <w:cantSplit/>
+        </w:trPr>
+        <w:tc>
+          <w:tcPr>
+            <w:tcW w:type="dxa" w:w="4680"/>
+            <w:tcMar>
+              <w:top w:type="dxa" w:w="90"/>
+              <w:left w:type="dxa" w:w="110"/>
+              <w:bottom w:type="dxa" w:w="90"/>
+              <w:right w:type="dxa" w:w="110"/>
+            </w:tcMar>
+          </w:tcPr>
+          <w:p>
+            <w:r>
+              <w:rPr>
+                <w:sz w:val="18"/>
+                <w:szCs w:val="18"/>
+              </w:rPr>
+              <w:t xml:space="preserve">Empty state</w:t>
+            </w:r>
+          </w:p>
+        </w:tc>
+        <w:tc>
+          <w:tcPr>
+            <w:tcW w:type="dxa" w:w="4680"/>
+            <w:tcMar>
+              <w:top w:type="dxa" w:w="90"/>
+              <w:left w:type="dxa" w:w="110"/>
+              <w:bottom w:type="dxa" w:w="90"/>
+              <w:right w:type="dxa" w:w="110"/>
+            </w:tcMar>
+          </w:tcPr>
+          <w:p>
+            <w:r>
+              <w:rPr>
+                <w:sz w:val="18"/>
+                <w:szCs w:val="18"/>
+              </w:rPr>
+              <w:t xml:space="preserve">"No discrepancies in this audit period" as a positive confirmation state, shown only after the reconciliation itself completes — never shown by default before the audit has actually run, to avoid it being mistaken for "nothing to audit"</w:t>
             </w:r>
           </w:p>
         </w:tc>
@@ -17296,23 +18352,10 @@
     </w:p>
     <w:p>
       <w:pPr>
-        <w:pStyle w:val="Heading1"/>
-      </w:pPr>
-      <w:r>
-        <w:t xml:space="preserve">Module 4: IT Administration</w:t>
-      </w:r>
-    </w:p>
-    <w:p>
-      <w:r>
-        <w:br w:type="page"/>
-      </w:r>
-    </w:p>
-    <w:p>
-      <w:pPr>
         <w:pStyle w:val="Heading2"/>
       </w:pPr>
       <w:r>
-        <w:t xml:space="preserve">4.1 User Account List / Management</w:t>
+        <w:t xml:space="preserve">3.5 DSAR Case List</w:t>
       </w:r>
     </w:p>
     <w:tbl>
@@ -17425,7 +18468,7 @@
                 <w:sz w:val="18"/>
                 <w:szCs w:val="18"/>
               </w:rPr>
-              <w:t xml:space="preserve">IT/System Administrator</w:t>
+              <w:t xml:space="preserve">Compliance/Clinical Quality Officer</w:t>
             </w:r>
           </w:p>
         </w:tc>
@@ -17470,7 +18513,7 @@
                 <w:sz w:val="18"/>
                 <w:szCs w:val="18"/>
               </w:rPr>
-              <w:t xml:space="preserve">View and manage all User Accounts across the platform, including status and access.</w:t>
+              <w:t xml:space="preserve">The full worklist of DSAR Cases, previously only referenced in passing as a navigation source — given its own complete specification here.</w:t>
             </w:r>
           </w:p>
         </w:tc>
@@ -17515,7 +18558,7 @@
                 <w:sz w:val="18"/>
                 <w:szCs w:val="18"/>
               </w:rPr>
-              <w:t xml:space="preserve">User name, role(s) assigned, associated module access, account status (Active, Suspended, Deactivated, Pending Activation), last login, linked Credentialing clearance status (for clinical/crew roles)</w:t>
+              <w:t xml:space="preserve">DSAR Case ID, requestor, request type (access, deletion, correction), jurisdiction (Jamaica-domestic vs. UK-linked), status (Received, Identity Verification, In Progress, Fulfilled, Denied), statutory due date, at-risk flag as the deadline nears</w:t>
             </w:r>
           </w:p>
         </w:tc>
@@ -17560,7 +18603,7 @@
                 <w:sz w:val="18"/>
                 <w:szCs w:val="18"/>
               </w:rPr>
-              <w:t xml:space="preserve">Create account; suspend/reactivate/deactivate; reset credentials; force password reset; view access history</w:t>
+              <w:t xml:space="preserve">Filter by status/jurisdiction/due-date proximity; open DSAR Case Screen (3.6)</w:t>
             </w:r>
           </w:p>
         </w:tc>
@@ -17605,7 +18648,7 @@
                 <w:sz w:val="18"/>
                 <w:szCs w:val="18"/>
               </w:rPr>
-              <w:t xml:space="preserve">From: platform home or Credentialing Verification Queue (Compliance module trigger for new clinical staff). To: Role Assignment screen; Access Review screen</w:t>
+              <w:t xml:space="preserve">From: module launcher or intake alert. To: DSAR Case Screen (3.6)</w:t>
             </w:r>
           </w:p>
         </w:tc>
@@ -17650,7 +18693,52 @@
                 <w:sz w:val="18"/>
                 <w:szCs w:val="18"/>
               </w:rPr>
-              <w:t xml:space="preserve">Cannot activate clinical/crew role account without confirmed Credentialing clearance; duplicate-account warning on creation</w:t>
+              <w:t xml:space="preserve">None beyond navigation</w:t>
+            </w:r>
+          </w:p>
+        </w:tc>
+      </w:tr>
+      <w:tr>
+        <w:trPr>
+          <w:cantSplit/>
+        </w:trPr>
+        <w:tc>
+          <w:tcPr>
+            <w:tcW w:type="dxa" w:w="4680"/>
+            <w:tcMar>
+              <w:top w:type="dxa" w:w="90"/>
+              <w:left w:type="dxa" w:w="110"/>
+              <w:bottom w:type="dxa" w:w="90"/>
+              <w:right w:type="dxa" w:w="110"/>
+            </w:tcMar>
+          </w:tcPr>
+          <w:p>
+            <w:r>
+              <w:rPr>
+                <w:sz w:val="18"/>
+                <w:szCs w:val="18"/>
+              </w:rPr>
+              <w:t xml:space="preserve">Empty state</w:t>
+            </w:r>
+          </w:p>
+        </w:tc>
+        <w:tc>
+          <w:tcPr>
+            <w:tcW w:type="dxa" w:w="4680"/>
+            <w:tcMar>
+              <w:top w:type="dxa" w:w="90"/>
+              <w:left w:type="dxa" w:w="110"/>
+              <w:bottom w:type="dxa" w:w="90"/>
+              <w:right w:type="dxa" w:w="110"/>
+            </w:tcMar>
+          </w:tcPr>
+          <w:p>
+            <w:r>
+              <w:rPr>
+                <w:sz w:val="18"/>
+                <w:szCs w:val="18"/>
+              </w:rPr>
+              <w:t xml:space="preserve">"No open DSAR requests" as a positive confirmation state</w:t>
             </w:r>
           </w:p>
         </w:tc>
@@ -17671,7 +18759,7 @@
         <w:pStyle w:val="Heading2"/>
       </w:pPr>
       <w:r>
-        <w:t xml:space="preserve">4.2 Role Assignment Screen</w:t>
+        <w:t xml:space="preserve">3.6 DSAR Case Screen</w:t>
       </w:r>
     </w:p>
     <w:tbl>
@@ -17784,7 +18872,7 @@
                 <w:sz w:val="18"/>
                 <w:szCs w:val="18"/>
               </w:rPr>
-              <w:t xml:space="preserve">IT/System Administrator</w:t>
+              <w:t xml:space="preserve">Compliance/Clinical Quality Officer</w:t>
             </w:r>
           </w:p>
         </w:tc>
@@ -17829,7 +18917,7 @@
                 <w:sz w:val="18"/>
                 <w:szCs w:val="18"/>
               </w:rPr>
-              <w:t xml:space="preserve">Assign or modify the role(s) and corresponding module/permission set for a User Account, including designating time-boxed backup approvers for continuity (Backup Finance Manager, Backup Customer Success Lead).</w:t>
+              <w:t xml:space="preserve">Manage a Data Subject Access Request from intake through fulfillment within regulatory deadline, including the deceased-patient-specific path.</w:t>
             </w:r>
           </w:p>
         </w:tc>
@@ -17874,7 +18962,7 @@
                 <w:sz w:val="18"/>
                 <w:szCs w:val="18"/>
               </w:rPr>
-              <w:t xml:space="preserve">Current role(s), available roles (Finance/Billing Officer, Finance Manager, Membership and Customer Success Agent/Lead, Compliance/Clinical Quality Officer, IT/System Administrator, Operations Manager, Executive), permission summary per role, effective date; active backup-approver designations and their covering period</w:t>
+              <w:t xml:space="preserve">DSAR Case ID, requestor identity/verification status, request type (access, deletion, correction), scope of records requested, linked source records (Member, Clinical Note, Incident Case, etc.), statutory due date (tracked separately for Jamaica-domestic vs. UK-linked requests, since the deadlines differ), status (Received, Identity Verification, In Progress, Fulfilled, Denied); a distinct deceased-patient mode that, once selected, requires a probate/estate documentation type field (e.g., grant of probate, letters of administration, next-of-kin affidavit, per whichever jurisdiction applies) and a jurisdiction selector driving which post-mortem access rules apply, rather than reusing the standard living-patient identity-verification fields</w:t>
             </w:r>
           </w:p>
         </w:tc>
@@ -17919,7 +19007,7 @@
                 <w:sz w:val="18"/>
                 <w:szCs w:val="18"/>
               </w:rPr>
-              <w:t xml:space="preserve">Add/remove role; preview resulting permission set; apply change; require secondary approval for high-privilege roles (Finance Manager, Executive, IT Administrator); designate a time-boxed Backup Finance Manager or Backup Customer Success Lead with a defined start/end date</w:t>
+              <w:t xml:space="preserve">Verify requestor identity (standard path) or verify estate/next-of-kin standing (deceased path, with the probate/estate document type recorded); scope/collect responsive records; redact third-party living individuals' data even from an otherwise-valid estate request; approve fulfillment package; deny with legal basis; close case</w:t>
             </w:r>
           </w:p>
         </w:tc>
@@ -17964,7 +19052,7 @@
                 <w:sz w:val="18"/>
                 <w:szCs w:val="18"/>
               </w:rPr>
-              <w:t xml:space="preserve">From: User Account List/Management. To: User Account List/Management; Access Review screen</w:t>
+              <w:t xml:space="preserve">From: DSAR Case List (3.5) or intake alert. To: Member Detail (Membership module, read-only reference); Regulatory Reporting Calendar/Tracker (deadline tracking)</w:t>
             </w:r>
           </w:p>
         </w:tc>
@@ -18009,7 +19097,7 @@
                 <w:sz w:val="18"/>
                 <w:szCs w:val="18"/>
               </w:rPr>
-              <w:t xml:space="preserve">Assigning conflicting roles (e.g., Billing Officer plus Finance Manager approval authority on own submissions) triggers segregation-of-duties warning; high-privilege assignment requires second admin sign-off; a backup-approver designation with no end date is rejected, since it must be time-boxed by design</w:t>
+              <w:t xml:space="preserve">Cannot fulfill without identity (or estate-standing) verification complete; statutory deadline countdown flags case as at-risk as due date nears, using the jurisdiction-specific deadline, not a single default; denial requires documented legal basis</w:t>
             </w:r>
           </w:p>
         </w:tc>
@@ -18030,7 +19118,7 @@
         <w:pStyle w:val="Heading2"/>
       </w:pPr>
       <w:r>
-        <w:t xml:space="preserve">4.3 Access Review Screen (Periodic Attestation)</w:t>
+        <w:t xml:space="preserve">3.7 Regulatory Reporting Calendar / Tracker</w:t>
       </w:r>
     </w:p>
     <w:tbl>
@@ -18143,7 +19231,7 @@
                 <w:sz w:val="18"/>
                 <w:szCs w:val="18"/>
               </w:rPr>
-              <w:t xml:space="preserve">IT/System Administrator (runs/manages review); role owners (e.g., Finance Manager, Compliance Officer) attest to their team's access as reviewers within this screen</w:t>
+              <w:t xml:space="preserve">Compliance/Clinical Quality Officer</w:t>
             </w:r>
           </w:p>
         </w:tc>
@@ -18188,7 +19276,7 @@
                 <w:sz w:val="18"/>
                 <w:szCs w:val="18"/>
               </w:rPr>
-              <w:t xml:space="preserve">Conduct periodic attestation that each User Account's current access remains appropriate.</w:t>
+              <w:t xml:space="preserve">Track all recurring and ad hoc regulatory filing obligations and their submission status.</w:t>
             </w:r>
           </w:p>
         </w:tc>
@@ -18233,7 +19321,7 @@
                 <w:sz w:val="18"/>
                 <w:szCs w:val="18"/>
               </w:rPr>
-              <w:t xml:space="preserve">Review cycle period, User Account list with current roles, assigned reviewer/attester, attestation status (Pending, Attested, Flagged for Removal), last review date</w:t>
+              <w:t xml:space="preserve">Filing/report name, regulator/jurisdiction (Jamaica MOHW and UK-facing obligations tracked separately), frequency, due date, status (Not Started, In Progress, Filed, Overdue), linked source case (Incident Case, DSAR Case, Controlled-Substance Audit)</w:t>
             </w:r>
           </w:p>
         </w:tc>
@@ -18278,7 +19366,7 @@
                 <w:sz w:val="18"/>
                 <w:szCs w:val="18"/>
               </w:rPr>
-              <w:t xml:space="preserve">Assign reviewer; attest access as appropriate; flag access for removal; bulk-remind pending reviewers; close review cycle</w:t>
+              <w:t xml:space="preserve">Mark filing in progress/complete; attach filed document/confirmation; set reminder; link source case; log extension/exception</w:t>
             </w:r>
           </w:p>
         </w:tc>
@@ -18323,7 +19411,7 @@
                 <w:sz w:val="18"/>
                 <w:szCs w:val="18"/>
               </w:rPr>
-              <w:t xml:space="preserve">From: User Account List/Management or scheduled reminder. To: Role Assignment screen (to act on flagged removals)</w:t>
+              <w:t xml:space="preserve">From: module launcher, or auto-created link from Incident Case/Controlled-Substance Audit/DSAR Case when reportable. To: underlying case screen (Incident Case, DSAR Case, Controlled-Substance Audit)</w:t>
             </w:r>
           </w:p>
         </w:tc>
@@ -18368,52 +19456,7 @@
                 <w:sz w:val="18"/>
                 <w:szCs w:val="18"/>
               </w:rPr>
-              <w:t xml:space="preserve">Cannot close review cycle with outstanding unattested accounts; flagged-for-removal items require follow-up action logged before cycle closes</w:t>
-            </w:r>
-          </w:p>
-        </w:tc>
-      </w:tr>
-      <w:tr>
-        <w:trPr>
-          <w:cantSplit/>
-        </w:trPr>
-        <w:tc>
-          <w:tcPr>
-            <w:tcW w:type="dxa" w:w="4680"/>
-            <w:tcMar>
-              <w:top w:type="dxa" w:w="90"/>
-              <w:left w:type="dxa" w:w="110"/>
-              <w:bottom w:type="dxa" w:w="90"/>
-              <w:right w:type="dxa" w:w="110"/>
-            </w:tcMar>
-          </w:tcPr>
-          <w:p>
-            <w:r>
-              <w:rPr>
-                <w:sz w:val="18"/>
-                <w:szCs w:val="18"/>
-              </w:rPr>
-              <w:t xml:space="preserve">Empty state</w:t>
-            </w:r>
-          </w:p>
-        </w:tc>
-        <w:tc>
-          <w:tcPr>
-            <w:tcW w:type="dxa" w:w="4680"/>
-            <w:tcMar>
-              <w:top w:type="dxa" w:w="90"/>
-              <w:left w:type="dxa" w:w="110"/>
-              <w:bottom w:type="dxa" w:w="90"/>
-              <w:right w:type="dxa" w:w="110"/>
-            </w:tcMar>
-          </w:tcPr>
-          <w:p>
-            <w:r>
-              <w:rPr>
-                <w:sz w:val="18"/>
-                <w:szCs w:val="18"/>
-              </w:rPr>
-              <w:t xml:space="preserve">"All accounts attested" as a positive confirmation state once a cycle completes cleanly</w:t>
+              <w:t xml:space="preserve">Overdue filings flagged and cannot be dismissed without documented reason; jurisdiction mismatch warning if wrong regulator selected for entity type</w:t>
             </w:r>
           </w:p>
         </w:tc>
@@ -18434,7 +19477,7 @@
         <w:pStyle w:val="Heading2"/>
       </w:pPr>
       <w:r>
-        <w:t xml:space="preserve">4.4 System Configuration / Change-Request Screen</w:t>
+        <w:t xml:space="preserve">3.8 Clinical Quality Review and Addendum Screen</w:t>
       </w:r>
     </w:p>
     <w:tbl>
@@ -18547,7 +19590,7 @@
                 <w:sz w:val="18"/>
                 <w:szCs w:val="18"/>
               </w:rPr>
-              <w:t xml:space="preserve">IT/System Administrator</w:t>
+              <w:t xml:space="preserve">Medical Director / QA — a role named throughout the Enterprise Platform Specification with explicit audit and addendum authority over Home Doctor encounters and Care Plans, but with no screen of its own anywhere in this inventory until now</w:t>
             </w:r>
           </w:p>
         </w:tc>
@@ -18592,7 +19635,7 @@
                 <w:sz w:val="18"/>
                 <w:szCs w:val="18"/>
               </w:rPr>
-              <w:t xml:space="preserve">Submit, approve, and track requests to change platform configuration (e.g., new branch setup, integration settings, workflow rules).</w:t>
+              <w:t xml:space="preserve">Support the two things Medical Director/QA actually does per the specification: sampled quality-assurance review of closed clinical encounters, and adding a formal, audit-logged addendum to a clinical record after it has locked (per the 24-hour lock rule established for Clinical Notes).</w:t>
             </w:r>
           </w:p>
         </w:tc>
@@ -18637,7 +19680,7 @@
                 <w:sz w:val="18"/>
                 <w:szCs w:val="18"/>
               </w:rPr>
-              <w:t xml:space="preserve">Change Request ID, requested change description, requesting module/role, risk level, approval status, implementation date, rollback plan</w:t>
+              <w:t xml:space="preserve">A system-drawn sample of recently-closed Home Doctor visit encounters and Care Plans, not self-selected by the reviewer; the full clinical note/plan content for a sampled item; any prior addendum history on a record; the specific field or finding an addendum is being added to.</w:t>
             </w:r>
           </w:p>
         </w:tc>
@@ -18682,7 +19725,7 @@
                 <w:sz w:val="18"/>
                 <w:szCs w:val="18"/>
               </w:rPr>
-              <w:t xml:space="preserve">Submit change request; assess risk; approve/reject; schedule implementation; record rollback if needed; close request</w:t>
+              <w:t xml:space="preserve">Mark a sampled encounter as meeting quality standards or flag it for follow-up; add a coaching note routed to the treating Doctor; add a formal addendum to a locked Clinical Note or Care Plan, with a mandatory reason and the addendum itself clearly marked as a later addition rather than an edit to the original record; escalate a pattern (not a single encounter) to Compliance/Clinical Quality Officer if it suggests a systemic issue rather than an individual one.</w:t>
             </w:r>
           </w:p>
         </w:tc>
@@ -18727,7 +19770,7 @@
                 <w:sz w:val="18"/>
                 <w:szCs w:val="18"/>
               </w:rPr>
-              <w:t xml:space="preserve">From: module launcher or request raised from another module (e.g., Finance requesting new payer integration); receives the initiating request from the New Region/Branch Launch Wizard (5.6) for the technical/geofence configuration steps in that journey. To: none downstream within this screen set (terminal administrative record)</w:t>
+              <w:t xml:space="preserve">From: module launcher, on the standing sampling cadence; or directly from a Clinical Note/Care Plan reached via a cross-module link when an addendum is specifically needed. To: the underlying Clinical Note or Care Plan record (addendum appended, never overwriting); an Incident Case (Compliance module) if a sampled review reveals a genuine safety concern rather than a coaching-level finding.</w:t>
             </w:r>
           </w:p>
         </w:tc>
@@ -18772,7 +19815,7 @@
                 <w:sz w:val="18"/>
                 <w:szCs w:val="18"/>
               </w:rPr>
-              <w:t xml:space="preserve">High-risk changes require documented rollback plan before approval; cannot implement without recorded approval</w:t>
+              <w:t xml:space="preserve">An addendum can never alter or remove the original locked content — it is always an append-only new entry with its own timestamp and author; cannot flag a systemic pattern without at least the minimum number of corroborating sampled instances defined by policy, to avoid over-reacting to a single case.</w:t>
             </w:r>
           </w:p>
         </w:tc>
@@ -18817,7 +19860,7 @@
                 <w:sz w:val="18"/>
                 <w:szCs w:val="18"/>
               </w:rPr>
-              <w:t xml:space="preserve">"No open change requests" as a positive confirmation state</w:t>
+              <w:t xml:space="preserve">"No encounters due for review this cycle" as a positive confirmation state.</w:t>
             </w:r>
           </w:p>
         </w:tc>
@@ -18838,7 +19881,7 @@
         <w:pStyle w:val="Heading2"/>
       </w:pPr>
       <w:r>
-        <w:t xml:space="preserve">4.5 Backup / Security Incident Screen</w:t>
+        <w:t xml:space="preserve">3.9 Safeguarding Case Screen</w:t>
       </w:r>
     </w:p>
     <w:tbl>
@@ -18951,7 +19994,7 @@
                 <w:sz w:val="18"/>
                 <w:szCs w:val="18"/>
               </w:rPr>
-              <w:t xml:space="preserve">IT/System Administrator</w:t>
+              <w:t xml:space="preserve">Clinical Safety Officer — a role named throughout the Enterprise Platform Specification with full access to the safeguarding module arising from Nurse and Home Health Aide mandatory-reporting triggers, but with no screen of its own anywhere in this inventory until now</w:t>
             </w:r>
           </w:p>
         </w:tc>
@@ -18996,7 +20039,7 @@
                 <w:sz w:val="18"/>
                 <w:szCs w:val="18"/>
               </w:rPr>
-              <w:t xml:space="preserve">Track system backup status and manage security incident response (distinct from clinical Incident Case).</w:t>
+              <w:t xml:space="preserve">Manage a safeguarding concern (abuse, neglect, or a vulnerable-persons protection matter) raised by a Nurse or Aide during a home visit, from intake through resolution or statutory referral — kept in a segregated, higher-restriction record distinct from a standard Incident Case, consistent with the heightened confidentiality safeguarding matters require.</w:t>
             </w:r>
           </w:p>
         </w:tc>
@@ -19041,7 +20084,7 @@
                 <w:sz w:val="18"/>
                 <w:szCs w:val="18"/>
               </w:rPr>
-              <w:t xml:space="preserve">Backup job log (schedule, last successful run, failure alerts), security incident list (type, affected systems/accounts, detection date, severity, containment status), remediation actions</w:t>
+              <w:t xml:space="preserve">Safeguarding Case ID, linked patient (access restricted to this role and, on a need-to-know basis, Compliance/Clinical Quality Officer — never visible in the standard Incident Case list or Member Detail screen); the originating Nurse/Aide's structured safeguarding note; risk assessment; statutory-referral status if escalated to an external protection authority; status (Reported, Under Review, Referred Externally, Closed).</w:t>
             </w:r>
           </w:p>
         </w:tc>
@@ -19086,7 +20129,7 @@
                 <w:sz w:val="18"/>
                 <w:szCs w:val="18"/>
               </w:rPr>
-              <w:t xml:space="preserve">Retry/verify backup job; open new security incident; assign remediation owner; log containment/remediation step; close incident; notify Compliance Officer if data exposure suspected (cross-module trigger to DSAR/Incident Case)</w:t>
+              <w:t xml:space="preserve">Add a case note; conduct or record a risk assessment; determine whether statutory external referral thresholds are met; log an external referral with the receiving authority and reference; close the case with a documented outcome.</w:t>
             </w:r>
           </w:p>
         </w:tc>
@@ -19131,7 +20174,7 @@
                 <w:sz w:val="18"/>
                 <w:szCs w:val="18"/>
               </w:rPr>
-              <w:t xml:space="preserve">From: module launcher or automated alert. To: none within IT module (may generate linked record in Compliance module's Incident Case screen if data breach suspected)</w:t>
+              <w:t xml:space="preserve">From: a dedicated safeguarding intake alert (triggered automatically when a Nurse or Aide's mandatory-reporting flag fires during Clinical Documentation), not from the general Incident Case List, given the access-segregation requirement. To: nowhere within the general platform — this module is intentionally a closed loop, with only a de-identified, aggregate count (not case detail) ever surfacing to broader compliance reporting.</w:t>
             </w:r>
           </w:p>
         </w:tc>
@@ -19176,7 +20219,7 @@
                 <w:sz w:val="18"/>
                 <w:szCs w:val="18"/>
               </w:rPr>
-              <w:t xml:space="preserve">Cannot close security incident without documented containment and remediation; failed backup beyond retry threshold auto-escalates severity</w:t>
+              <w:t xml:space="preserve">Cannot be reached or deep-linked by any role other than Clinical Safety Officer (uses the platform-wide Access Denied state for any other attempt, logged as a high-priority audit event given the sensitivity); cannot close a case flagged as meeting external-referral thresholds without the referral itself being logged first.</w:t>
             </w:r>
           </w:p>
         </w:tc>
@@ -19221,7 +20264,7 @@
                 <w:sz w:val="18"/>
                 <w:szCs w:val="18"/>
               </w:rPr>
-              <w:t xml:space="preserve">Security incident list shows "No open security incidents" as a positive confirmation state; the backup job log is never empty by design (it always shows the most recent scheduled run, success or failure)</w:t>
+              <w:t xml:space="preserve">"No open safeguarding cases" as a positive confirmation state.</w:t>
             </w:r>
           </w:p>
         </w:tc>
@@ -19242,7 +20285,7 @@
         <w:pStyle w:val="Heading1"/>
       </w:pPr>
       <w:r>
-        <w:t xml:space="preserve">Module 5: Executive and Operations Reporting</w:t>
+        <w:t xml:space="preserve">Module 4: IT Administration</w:t>
       </w:r>
     </w:p>
     <w:p>
@@ -19255,7 +20298,7 @@
         <w:pStyle w:val="Heading2"/>
       </w:pPr>
       <w:r>
-        <w:t xml:space="preserve">5.1 Main KPI Dashboard</w:t>
+        <w:t xml:space="preserve">4.1 User Account List / Management</w:t>
       </w:r>
     </w:p>
     <w:tbl>
@@ -19368,6 +20411,1949 @@
                 <w:sz w:val="18"/>
                 <w:szCs w:val="18"/>
               </w:rPr>
+              <w:t xml:space="preserve">IT/System Administrator</w:t>
+            </w:r>
+          </w:p>
+        </w:tc>
+      </w:tr>
+      <w:tr>
+        <w:trPr>
+          <w:cantSplit/>
+        </w:trPr>
+        <w:tc>
+          <w:tcPr>
+            <w:tcW w:type="dxa" w:w="4680"/>
+            <w:tcMar>
+              <w:top w:type="dxa" w:w="90"/>
+              <w:left w:type="dxa" w:w="110"/>
+              <w:bottom w:type="dxa" w:w="90"/>
+              <w:right w:type="dxa" w:w="110"/>
+            </w:tcMar>
+          </w:tcPr>
+          <w:p>
+            <w:r>
+              <w:rPr>
+                <w:sz w:val="18"/>
+                <w:szCs w:val="18"/>
+              </w:rPr>
+              <w:t xml:space="preserve">Purpose</w:t>
+            </w:r>
+          </w:p>
+        </w:tc>
+        <w:tc>
+          <w:tcPr>
+            <w:tcW w:type="dxa" w:w="4680"/>
+            <w:tcMar>
+              <w:top w:type="dxa" w:w="90"/>
+              <w:left w:type="dxa" w:w="110"/>
+              <w:bottom w:type="dxa" w:w="90"/>
+              <w:right w:type="dxa" w:w="110"/>
+            </w:tcMar>
+          </w:tcPr>
+          <w:p>
+            <w:r>
+              <w:rPr>
+                <w:sz w:val="18"/>
+                <w:szCs w:val="18"/>
+              </w:rPr>
+              <w:t xml:space="preserve">View and manage all User Accounts across the platform, including status and access — covering both AFC-employed staff accounts and external Facility Partner accounts, which are provisioned through this same screen under a distinct account type rather than a separate, undocumented process.</w:t>
+            </w:r>
+          </w:p>
+        </w:tc>
+      </w:tr>
+      <w:tr>
+        <w:trPr>
+          <w:cantSplit/>
+        </w:trPr>
+        <w:tc>
+          <w:tcPr>
+            <w:tcW w:type="dxa" w:w="4680"/>
+            <w:tcMar>
+              <w:top w:type="dxa" w:w="90"/>
+              <w:left w:type="dxa" w:w="110"/>
+              <w:bottom w:type="dxa" w:w="90"/>
+              <w:right w:type="dxa" w:w="110"/>
+            </w:tcMar>
+          </w:tcPr>
+          <w:p>
+            <w:r>
+              <w:rPr>
+                <w:sz w:val="18"/>
+                <w:szCs w:val="18"/>
+              </w:rPr>
+              <w:t xml:space="preserve">Key info displayed</w:t>
+            </w:r>
+          </w:p>
+        </w:tc>
+        <w:tc>
+          <w:tcPr>
+            <w:tcW w:type="dxa" w:w="4680"/>
+            <w:tcMar>
+              <w:top w:type="dxa" w:w="90"/>
+              <w:left w:type="dxa" w:w="110"/>
+              <w:bottom w:type="dxa" w:w="90"/>
+              <w:right w:type="dxa" w:w="110"/>
+            </w:tcMar>
+          </w:tcPr>
+          <w:p>
+            <w:r>
+              <w:rPr>
+                <w:sz w:val="18"/>
+                <w:szCs w:val="18"/>
+              </w:rPr>
+              <w:t xml:space="preserve">User name, account type (Internal Staff or External Facility Partner), role(s) assigned (internal accounts only — a Facility Partner account has no internal role, only its Portal-scoped access), associated module access, account status (Active, Suspended, Deactivated, Pending Activation), last login, linked Credentialing clearance status (for clinical/crew roles); for a Facility Partner account, the specific facility it's associated with and which named individual at that facility it belongs to (never a shared facility-wide login, per the least-privilege principle already established for that role).</w:t>
+            </w:r>
+          </w:p>
+        </w:tc>
+      </w:tr>
+      <w:tr>
+        <w:trPr>
+          <w:cantSplit/>
+        </w:trPr>
+        <w:tc>
+          <w:tcPr>
+            <w:tcW w:type="dxa" w:w="4680"/>
+            <w:tcMar>
+              <w:top w:type="dxa" w:w="90"/>
+              <w:left w:type="dxa" w:w="110"/>
+              <w:bottom w:type="dxa" w:w="90"/>
+              <w:right w:type="dxa" w:w="110"/>
+            </w:tcMar>
+          </w:tcPr>
+          <w:p>
+            <w:r>
+              <w:rPr>
+                <w:sz w:val="18"/>
+                <w:szCs w:val="18"/>
+              </w:rPr>
+              <w:t xml:space="preserve">Actions</w:t>
+            </w:r>
+          </w:p>
+        </w:tc>
+        <w:tc>
+          <w:tcPr>
+            <w:tcW w:type="dxa" w:w="4680"/>
+            <w:tcMar>
+              <w:top w:type="dxa" w:w="90"/>
+              <w:left w:type="dxa" w:w="110"/>
+              <w:bottom w:type="dxa" w:w="90"/>
+              <w:right w:type="dxa" w:w="110"/>
+            </w:tcMar>
+          </w:tcPr>
+          <w:p>
+            <w:r>
+              <w:rPr>
+                <w:sz w:val="18"/>
+                <w:szCs w:val="18"/>
+              </w:rPr>
+              <w:t xml:space="preserve">Create account (selecting Internal Staff or External Facility Partner at creation, which determines the rest of the form); for a Facility Partner account, associate it with a specific facility and send the account-activation invite directly to that individual; suspend/reactivate/deactivate; reset credentials; force password reset; view access history.</w:t>
+            </w:r>
+          </w:p>
+        </w:tc>
+      </w:tr>
+      <w:tr>
+        <w:trPr>
+          <w:cantSplit/>
+        </w:trPr>
+        <w:tc>
+          <w:tcPr>
+            <w:tcW w:type="dxa" w:w="4680"/>
+            <w:tcMar>
+              <w:top w:type="dxa" w:w="90"/>
+              <w:left w:type="dxa" w:w="110"/>
+              <w:bottom w:type="dxa" w:w="90"/>
+              <w:right w:type="dxa" w:w="110"/>
+            </w:tcMar>
+          </w:tcPr>
+          <w:p>
+            <w:r>
+              <w:rPr>
+                <w:sz w:val="18"/>
+                <w:szCs w:val="18"/>
+              </w:rPr>
+              <w:t xml:space="preserve">Navigation</w:t>
+            </w:r>
+          </w:p>
+        </w:tc>
+        <w:tc>
+          <w:tcPr>
+            <w:tcW w:type="dxa" w:w="4680"/>
+            <w:tcMar>
+              <w:top w:type="dxa" w:w="90"/>
+              <w:left w:type="dxa" w:w="110"/>
+              <w:bottom w:type="dxa" w:w="90"/>
+              <w:right w:type="dxa" w:w="110"/>
+            </w:tcMar>
+          </w:tcPr>
+          <w:p>
+            <w:r>
+              <w:rPr>
+                <w:sz w:val="18"/>
+                <w:szCs w:val="18"/>
+              </w:rPr>
+              <w:t xml:space="preserve">From: platform home or Credentialing Verification Queue (Compliance module trigger for new clinical staff). To: Role Assignment screen (internal accounts only); Access Review screen.</w:t>
+            </w:r>
+          </w:p>
+        </w:tc>
+      </w:tr>
+      <w:tr>
+        <w:trPr>
+          <w:cantSplit/>
+        </w:trPr>
+        <w:tc>
+          <w:tcPr>
+            <w:tcW w:type="dxa" w:w="4680"/>
+            <w:tcMar>
+              <w:top w:type="dxa" w:w="90"/>
+              <w:left w:type="dxa" w:w="110"/>
+              <w:bottom w:type="dxa" w:w="90"/>
+              <w:right w:type="dxa" w:w="110"/>
+            </w:tcMar>
+          </w:tcPr>
+          <w:p>
+            <w:r>
+              <w:rPr>
+                <w:sz w:val="18"/>
+                <w:szCs w:val="18"/>
+              </w:rPr>
+              <w:t xml:space="preserve">Validation/errors</w:t>
+            </w:r>
+          </w:p>
+        </w:tc>
+        <w:tc>
+          <w:tcPr>
+            <w:tcW w:type="dxa" w:w="4680"/>
+            <w:tcMar>
+              <w:top w:type="dxa" w:w="90"/>
+              <w:left w:type="dxa" w:w="110"/>
+              <w:bottom w:type="dxa" w:w="90"/>
+              <w:right w:type="dxa" w:w="110"/>
+            </w:tcMar>
+          </w:tcPr>
+          <w:p>
+            <w:r>
+              <w:rPr>
+                <w:sz w:val="18"/>
+                <w:szCs w:val="18"/>
+              </w:rPr>
+              <w:t xml:space="preserve">Cannot activate clinical/crew role account without confirmed Credentialing clearance; duplicate-account warning on creation; a Facility Partner account cannot be assigned an internal role — the two account types are mutually exclusive, not layered.</w:t>
+            </w:r>
+          </w:p>
+        </w:tc>
+      </w:tr>
+    </w:tbl>
+    <w:p>
+      <w:pPr>
+        <w:spacing w:after="160"/>
+      </w:pPr>
+    </w:p>
+    <w:p>
+      <w:r>
+        <w:br w:type="page"/>
+      </w:r>
+    </w:p>
+    <w:p>
+      <w:pPr>
+        <w:pStyle w:val="Heading2"/>
+      </w:pPr>
+      <w:r>
+        <w:t xml:space="preserve">4.2 Role Assignment Screen</w:t>
+      </w:r>
+    </w:p>
+    <w:tbl>
+      <w:tblPr>
+        <w:tblW w:type="dxa" w:w="9360"/>
+        <w:tblBorders>
+          <w:top w:val="single" w:color="D8D2C2" w:sz="4"/>
+          <w:left w:val="single" w:color="D8D2C2" w:sz="4"/>
+          <w:bottom w:val="single" w:color="D8D2C2" w:sz="4"/>
+          <w:right w:val="single" w:color="D8D2C2" w:sz="4"/>
+          <w:insideH w:val="single" w:color="D8D2C2" w:sz="4"/>
+          <w:insideV w:val="single" w:color="D8D2C2" w:sz="4"/>
+        </w:tblBorders>
+      </w:tblPr>
+      <w:tblGrid>
+        <w:gridCol w:w="4680"/>
+        <w:gridCol w:w="4680"/>
+      </w:tblGrid>
+      <w:tr>
+        <w:trPr>
+          <w:cantSplit/>
+          <w:tblHeader/>
+        </w:trPr>
+        <w:tc>
+          <w:tcPr>
+            <w:tcW w:type="dxa" w:w="4680"/>
+            <w:shd w:fill="16423C" w:val="clear"/>
+            <w:tcMar>
+              <w:top w:type="dxa" w:w="90"/>
+              <w:left w:type="dxa" w:w="110"/>
+              <w:bottom w:type="dxa" w:w="90"/>
+              <w:right w:type="dxa" w:w="110"/>
+            </w:tcMar>
+          </w:tcPr>
+          <w:p>
+            <w:r>
+              <w:rPr>
+                <w:b/>
+                <w:bCs/>
+                <w:color w:val="FFFFFF"/>
+                <w:sz w:val="18"/>
+                <w:szCs w:val="18"/>
+              </w:rPr>
+              <w:t xml:space="preserve">Field</w:t>
+            </w:r>
+          </w:p>
+        </w:tc>
+        <w:tc>
+          <w:tcPr>
+            <w:tcW w:type="dxa" w:w="4680"/>
+            <w:shd w:fill="16423C" w:val="clear"/>
+            <w:tcMar>
+              <w:top w:type="dxa" w:w="90"/>
+              <w:left w:type="dxa" w:w="110"/>
+              <w:bottom w:type="dxa" w:w="90"/>
+              <w:right w:type="dxa" w:w="110"/>
+            </w:tcMar>
+          </w:tcPr>
+          <w:p>
+            <w:r>
+              <w:rPr>
+                <w:b/>
+                <w:bCs/>
+                <w:color w:val="FFFFFF"/>
+                <w:sz w:val="18"/>
+                <w:szCs w:val="18"/>
+              </w:rPr>
+              <w:t xml:space="preserve">Detail</w:t>
+            </w:r>
+          </w:p>
+        </w:tc>
+      </w:tr>
+      <w:tr>
+        <w:trPr>
+          <w:cantSplit/>
+        </w:trPr>
+        <w:tc>
+          <w:tcPr>
+            <w:tcW w:type="dxa" w:w="4680"/>
+            <w:tcMar>
+              <w:top w:type="dxa" w:w="90"/>
+              <w:left w:type="dxa" w:w="110"/>
+              <w:bottom w:type="dxa" w:w="90"/>
+              <w:right w:type="dxa" w:w="110"/>
+            </w:tcMar>
+          </w:tcPr>
+          <w:p>
+            <w:r>
+              <w:rPr>
+                <w:sz w:val="18"/>
+                <w:szCs w:val="18"/>
+              </w:rPr>
+              <w:t xml:space="preserve">Roles</w:t>
+            </w:r>
+          </w:p>
+        </w:tc>
+        <w:tc>
+          <w:tcPr>
+            <w:tcW w:type="dxa" w:w="4680"/>
+            <w:tcMar>
+              <w:top w:type="dxa" w:w="90"/>
+              <w:left w:type="dxa" w:w="110"/>
+              <w:bottom w:type="dxa" w:w="90"/>
+              <w:right w:type="dxa" w:w="110"/>
+            </w:tcMar>
+          </w:tcPr>
+          <w:p>
+            <w:r>
+              <w:rPr>
+                <w:sz w:val="18"/>
+                <w:szCs w:val="18"/>
+              </w:rPr>
+              <w:t xml:space="preserve">IT/System Administrator</w:t>
+            </w:r>
+          </w:p>
+        </w:tc>
+      </w:tr>
+      <w:tr>
+        <w:trPr>
+          <w:cantSplit/>
+        </w:trPr>
+        <w:tc>
+          <w:tcPr>
+            <w:tcW w:type="dxa" w:w="4680"/>
+            <w:tcMar>
+              <w:top w:type="dxa" w:w="90"/>
+              <w:left w:type="dxa" w:w="110"/>
+              <w:bottom w:type="dxa" w:w="90"/>
+              <w:right w:type="dxa" w:w="110"/>
+            </w:tcMar>
+          </w:tcPr>
+          <w:p>
+            <w:r>
+              <w:rPr>
+                <w:sz w:val="18"/>
+                <w:szCs w:val="18"/>
+              </w:rPr>
+              <w:t xml:space="preserve">Purpose</w:t>
+            </w:r>
+          </w:p>
+        </w:tc>
+        <w:tc>
+          <w:tcPr>
+            <w:tcW w:type="dxa" w:w="4680"/>
+            <w:tcMar>
+              <w:top w:type="dxa" w:w="90"/>
+              <w:left w:type="dxa" w:w="110"/>
+              <w:bottom w:type="dxa" w:w="90"/>
+              <w:right w:type="dxa" w:w="110"/>
+            </w:tcMar>
+          </w:tcPr>
+          <w:p>
+            <w:r>
+              <w:rPr>
+                <w:sz w:val="18"/>
+                <w:szCs w:val="18"/>
+              </w:rPr>
+              <w:t xml:space="preserve">Assign or modify the role(s) and corresponding module/permission set for a User Account, including designating time-boxed backup approvers for continuity (Backup Finance Manager, Backup Customer Success Lead).</w:t>
+            </w:r>
+          </w:p>
+        </w:tc>
+      </w:tr>
+      <w:tr>
+        <w:trPr>
+          <w:cantSplit/>
+        </w:trPr>
+        <w:tc>
+          <w:tcPr>
+            <w:tcW w:type="dxa" w:w="4680"/>
+            <w:tcMar>
+              <w:top w:type="dxa" w:w="90"/>
+              <w:left w:type="dxa" w:w="110"/>
+              <w:bottom w:type="dxa" w:w="90"/>
+              <w:right w:type="dxa" w:w="110"/>
+            </w:tcMar>
+          </w:tcPr>
+          <w:p>
+            <w:r>
+              <w:rPr>
+                <w:sz w:val="18"/>
+                <w:szCs w:val="18"/>
+              </w:rPr>
+              <w:t xml:space="preserve">Key info displayed</w:t>
+            </w:r>
+          </w:p>
+        </w:tc>
+        <w:tc>
+          <w:tcPr>
+            <w:tcW w:type="dxa" w:w="4680"/>
+            <w:tcMar>
+              <w:top w:type="dxa" w:w="90"/>
+              <w:left w:type="dxa" w:w="110"/>
+              <w:bottom w:type="dxa" w:w="90"/>
+              <w:right w:type="dxa" w:w="110"/>
+            </w:tcMar>
+          </w:tcPr>
+          <w:p>
+            <w:r>
+              <w:rPr>
+                <w:sz w:val="18"/>
+                <w:szCs w:val="18"/>
+              </w:rPr>
+              <w:t xml:space="preserve">Current role(s), available roles (Finance/Billing Officer, Finance Manager, Membership and Customer Success Agent/Lead, Compliance/Clinical Quality Officer, IT/System Administrator, Operations Manager, Executive), permission summary per role, effective date; active backup-approver designations and their covering period</w:t>
+            </w:r>
+          </w:p>
+        </w:tc>
+      </w:tr>
+      <w:tr>
+        <w:trPr>
+          <w:cantSplit/>
+        </w:trPr>
+        <w:tc>
+          <w:tcPr>
+            <w:tcW w:type="dxa" w:w="4680"/>
+            <w:tcMar>
+              <w:top w:type="dxa" w:w="90"/>
+              <w:left w:type="dxa" w:w="110"/>
+              <w:bottom w:type="dxa" w:w="90"/>
+              <w:right w:type="dxa" w:w="110"/>
+            </w:tcMar>
+          </w:tcPr>
+          <w:p>
+            <w:r>
+              <w:rPr>
+                <w:sz w:val="18"/>
+                <w:szCs w:val="18"/>
+              </w:rPr>
+              <w:t xml:space="preserve">Actions</w:t>
+            </w:r>
+          </w:p>
+        </w:tc>
+        <w:tc>
+          <w:tcPr>
+            <w:tcW w:type="dxa" w:w="4680"/>
+            <w:tcMar>
+              <w:top w:type="dxa" w:w="90"/>
+              <w:left w:type="dxa" w:w="110"/>
+              <w:bottom w:type="dxa" w:w="90"/>
+              <w:right w:type="dxa" w:w="110"/>
+            </w:tcMar>
+          </w:tcPr>
+          <w:p>
+            <w:r>
+              <w:rPr>
+                <w:sz w:val="18"/>
+                <w:szCs w:val="18"/>
+              </w:rPr>
+              <w:t xml:space="preserve">Add/remove role; preview resulting permission set; apply change; require secondary approval for high-privilege roles (Finance Manager, Executive, IT Administrator); designate a time-boxed Backup Finance Manager or Backup Customer Success Lead with a defined start/end date</w:t>
+            </w:r>
+          </w:p>
+        </w:tc>
+      </w:tr>
+      <w:tr>
+        <w:trPr>
+          <w:cantSplit/>
+        </w:trPr>
+        <w:tc>
+          <w:tcPr>
+            <w:tcW w:type="dxa" w:w="4680"/>
+            <w:tcMar>
+              <w:top w:type="dxa" w:w="90"/>
+              <w:left w:type="dxa" w:w="110"/>
+              <w:bottom w:type="dxa" w:w="90"/>
+              <w:right w:type="dxa" w:w="110"/>
+            </w:tcMar>
+          </w:tcPr>
+          <w:p>
+            <w:r>
+              <w:rPr>
+                <w:sz w:val="18"/>
+                <w:szCs w:val="18"/>
+              </w:rPr>
+              <w:t xml:space="preserve">Navigation</w:t>
+            </w:r>
+          </w:p>
+        </w:tc>
+        <w:tc>
+          <w:tcPr>
+            <w:tcW w:type="dxa" w:w="4680"/>
+            <w:tcMar>
+              <w:top w:type="dxa" w:w="90"/>
+              <w:left w:type="dxa" w:w="110"/>
+              <w:bottom w:type="dxa" w:w="90"/>
+              <w:right w:type="dxa" w:w="110"/>
+            </w:tcMar>
+          </w:tcPr>
+          <w:p>
+            <w:r>
+              <w:rPr>
+                <w:sz w:val="18"/>
+                <w:szCs w:val="18"/>
+              </w:rPr>
+              <w:t xml:space="preserve">From: User Account List/Management. To: User Account List/Management; Access Review screen</w:t>
+            </w:r>
+          </w:p>
+        </w:tc>
+      </w:tr>
+      <w:tr>
+        <w:trPr>
+          <w:cantSplit/>
+        </w:trPr>
+        <w:tc>
+          <w:tcPr>
+            <w:tcW w:type="dxa" w:w="4680"/>
+            <w:tcMar>
+              <w:top w:type="dxa" w:w="90"/>
+              <w:left w:type="dxa" w:w="110"/>
+              <w:bottom w:type="dxa" w:w="90"/>
+              <w:right w:type="dxa" w:w="110"/>
+            </w:tcMar>
+          </w:tcPr>
+          <w:p>
+            <w:r>
+              <w:rPr>
+                <w:sz w:val="18"/>
+                <w:szCs w:val="18"/>
+              </w:rPr>
+              <w:t xml:space="preserve">Validation/errors</w:t>
+            </w:r>
+          </w:p>
+        </w:tc>
+        <w:tc>
+          <w:tcPr>
+            <w:tcW w:type="dxa" w:w="4680"/>
+            <w:tcMar>
+              <w:top w:type="dxa" w:w="90"/>
+              <w:left w:type="dxa" w:w="110"/>
+              <w:bottom w:type="dxa" w:w="90"/>
+              <w:right w:type="dxa" w:w="110"/>
+            </w:tcMar>
+          </w:tcPr>
+          <w:p>
+            <w:r>
+              <w:rPr>
+                <w:sz w:val="18"/>
+                <w:szCs w:val="18"/>
+              </w:rPr>
+              <w:t xml:space="preserve">Assigning conflicting roles (e.g., Billing Officer plus Finance Manager approval authority on own submissions) triggers segregation-of-duties warning; high-privilege assignment requires second admin sign-off; a backup-approver designation with no end date is rejected, since it must be time-boxed by design</w:t>
+            </w:r>
+          </w:p>
+        </w:tc>
+      </w:tr>
+    </w:tbl>
+    <w:p>
+      <w:pPr>
+        <w:spacing w:after="160"/>
+      </w:pPr>
+    </w:p>
+    <w:p>
+      <w:r>
+        <w:br w:type="page"/>
+      </w:r>
+    </w:p>
+    <w:p>
+      <w:pPr>
+        <w:pStyle w:val="Heading2"/>
+      </w:pPr>
+      <w:r>
+        <w:t xml:space="preserve">4.3 Access Review Screen (Periodic Attestation)</w:t>
+      </w:r>
+    </w:p>
+    <w:tbl>
+      <w:tblPr>
+        <w:tblW w:type="dxa" w:w="9360"/>
+        <w:tblBorders>
+          <w:top w:val="single" w:color="D8D2C2" w:sz="4"/>
+          <w:left w:val="single" w:color="D8D2C2" w:sz="4"/>
+          <w:bottom w:val="single" w:color="D8D2C2" w:sz="4"/>
+          <w:right w:val="single" w:color="D8D2C2" w:sz="4"/>
+          <w:insideH w:val="single" w:color="D8D2C2" w:sz="4"/>
+          <w:insideV w:val="single" w:color="D8D2C2" w:sz="4"/>
+        </w:tblBorders>
+      </w:tblPr>
+      <w:tblGrid>
+        <w:gridCol w:w="4680"/>
+        <w:gridCol w:w="4680"/>
+      </w:tblGrid>
+      <w:tr>
+        <w:trPr>
+          <w:cantSplit/>
+          <w:tblHeader/>
+        </w:trPr>
+        <w:tc>
+          <w:tcPr>
+            <w:tcW w:type="dxa" w:w="4680"/>
+            <w:shd w:fill="16423C" w:val="clear"/>
+            <w:tcMar>
+              <w:top w:type="dxa" w:w="90"/>
+              <w:left w:type="dxa" w:w="110"/>
+              <w:bottom w:type="dxa" w:w="90"/>
+              <w:right w:type="dxa" w:w="110"/>
+            </w:tcMar>
+          </w:tcPr>
+          <w:p>
+            <w:r>
+              <w:rPr>
+                <w:b/>
+                <w:bCs/>
+                <w:color w:val="FFFFFF"/>
+                <w:sz w:val="18"/>
+                <w:szCs w:val="18"/>
+              </w:rPr>
+              <w:t xml:space="preserve">Field</w:t>
+            </w:r>
+          </w:p>
+        </w:tc>
+        <w:tc>
+          <w:tcPr>
+            <w:tcW w:type="dxa" w:w="4680"/>
+            <w:shd w:fill="16423C" w:val="clear"/>
+            <w:tcMar>
+              <w:top w:type="dxa" w:w="90"/>
+              <w:left w:type="dxa" w:w="110"/>
+              <w:bottom w:type="dxa" w:w="90"/>
+              <w:right w:type="dxa" w:w="110"/>
+            </w:tcMar>
+          </w:tcPr>
+          <w:p>
+            <w:r>
+              <w:rPr>
+                <w:b/>
+                <w:bCs/>
+                <w:color w:val="FFFFFF"/>
+                <w:sz w:val="18"/>
+                <w:szCs w:val="18"/>
+              </w:rPr>
+              <w:t xml:space="preserve">Detail</w:t>
+            </w:r>
+          </w:p>
+        </w:tc>
+      </w:tr>
+      <w:tr>
+        <w:trPr>
+          <w:cantSplit/>
+        </w:trPr>
+        <w:tc>
+          <w:tcPr>
+            <w:tcW w:type="dxa" w:w="4680"/>
+            <w:tcMar>
+              <w:top w:type="dxa" w:w="90"/>
+              <w:left w:type="dxa" w:w="110"/>
+              <w:bottom w:type="dxa" w:w="90"/>
+              <w:right w:type="dxa" w:w="110"/>
+            </w:tcMar>
+          </w:tcPr>
+          <w:p>
+            <w:r>
+              <w:rPr>
+                <w:sz w:val="18"/>
+                <w:szCs w:val="18"/>
+              </w:rPr>
+              <w:t xml:space="preserve">Roles</w:t>
+            </w:r>
+          </w:p>
+        </w:tc>
+        <w:tc>
+          <w:tcPr>
+            <w:tcW w:type="dxa" w:w="4680"/>
+            <w:tcMar>
+              <w:top w:type="dxa" w:w="90"/>
+              <w:left w:type="dxa" w:w="110"/>
+              <w:bottom w:type="dxa" w:w="90"/>
+              <w:right w:type="dxa" w:w="110"/>
+            </w:tcMar>
+          </w:tcPr>
+          <w:p>
+            <w:r>
+              <w:rPr>
+                <w:sz w:val="18"/>
+                <w:szCs w:val="18"/>
+              </w:rPr>
+              <w:t xml:space="preserve">IT/System Administrator (runs/manages review); role owners (e.g., Finance Manager, Compliance Officer) attest to their team's access as reviewers within this screen</w:t>
+            </w:r>
+          </w:p>
+        </w:tc>
+      </w:tr>
+      <w:tr>
+        <w:trPr>
+          <w:cantSplit/>
+        </w:trPr>
+        <w:tc>
+          <w:tcPr>
+            <w:tcW w:type="dxa" w:w="4680"/>
+            <w:tcMar>
+              <w:top w:type="dxa" w:w="90"/>
+              <w:left w:type="dxa" w:w="110"/>
+              <w:bottom w:type="dxa" w:w="90"/>
+              <w:right w:type="dxa" w:w="110"/>
+            </w:tcMar>
+          </w:tcPr>
+          <w:p>
+            <w:r>
+              <w:rPr>
+                <w:sz w:val="18"/>
+                <w:szCs w:val="18"/>
+              </w:rPr>
+              <w:t xml:space="preserve">Purpose</w:t>
+            </w:r>
+          </w:p>
+        </w:tc>
+        <w:tc>
+          <w:tcPr>
+            <w:tcW w:type="dxa" w:w="4680"/>
+            <w:tcMar>
+              <w:top w:type="dxa" w:w="90"/>
+              <w:left w:type="dxa" w:w="110"/>
+              <w:bottom w:type="dxa" w:w="90"/>
+              <w:right w:type="dxa" w:w="110"/>
+            </w:tcMar>
+          </w:tcPr>
+          <w:p>
+            <w:r>
+              <w:rPr>
+                <w:sz w:val="18"/>
+                <w:szCs w:val="18"/>
+              </w:rPr>
+              <w:t xml:space="preserve">Conduct periodic attestation that each User Account's current access remains appropriate.</w:t>
+            </w:r>
+          </w:p>
+        </w:tc>
+      </w:tr>
+      <w:tr>
+        <w:trPr>
+          <w:cantSplit/>
+        </w:trPr>
+        <w:tc>
+          <w:tcPr>
+            <w:tcW w:type="dxa" w:w="4680"/>
+            <w:tcMar>
+              <w:top w:type="dxa" w:w="90"/>
+              <w:left w:type="dxa" w:w="110"/>
+              <w:bottom w:type="dxa" w:w="90"/>
+              <w:right w:type="dxa" w:w="110"/>
+            </w:tcMar>
+          </w:tcPr>
+          <w:p>
+            <w:r>
+              <w:rPr>
+                <w:sz w:val="18"/>
+                <w:szCs w:val="18"/>
+              </w:rPr>
+              <w:t xml:space="preserve">Key info displayed</w:t>
+            </w:r>
+          </w:p>
+        </w:tc>
+        <w:tc>
+          <w:tcPr>
+            <w:tcW w:type="dxa" w:w="4680"/>
+            <w:tcMar>
+              <w:top w:type="dxa" w:w="90"/>
+              <w:left w:type="dxa" w:w="110"/>
+              <w:bottom w:type="dxa" w:w="90"/>
+              <w:right w:type="dxa" w:w="110"/>
+            </w:tcMar>
+          </w:tcPr>
+          <w:p>
+            <w:r>
+              <w:rPr>
+                <w:sz w:val="18"/>
+                <w:szCs w:val="18"/>
+              </w:rPr>
+              <w:t xml:space="preserve">Review cycle period, User Account list with current roles, assigned reviewer/attester, attestation status (Pending, Attested, Flagged for Removal), last review date</w:t>
+            </w:r>
+          </w:p>
+        </w:tc>
+      </w:tr>
+      <w:tr>
+        <w:trPr>
+          <w:cantSplit/>
+        </w:trPr>
+        <w:tc>
+          <w:tcPr>
+            <w:tcW w:type="dxa" w:w="4680"/>
+            <w:tcMar>
+              <w:top w:type="dxa" w:w="90"/>
+              <w:left w:type="dxa" w:w="110"/>
+              <w:bottom w:type="dxa" w:w="90"/>
+              <w:right w:type="dxa" w:w="110"/>
+            </w:tcMar>
+          </w:tcPr>
+          <w:p>
+            <w:r>
+              <w:rPr>
+                <w:sz w:val="18"/>
+                <w:szCs w:val="18"/>
+              </w:rPr>
+              <w:t xml:space="preserve">Actions</w:t>
+            </w:r>
+          </w:p>
+        </w:tc>
+        <w:tc>
+          <w:tcPr>
+            <w:tcW w:type="dxa" w:w="4680"/>
+            <w:tcMar>
+              <w:top w:type="dxa" w:w="90"/>
+              <w:left w:type="dxa" w:w="110"/>
+              <w:bottom w:type="dxa" w:w="90"/>
+              <w:right w:type="dxa" w:w="110"/>
+            </w:tcMar>
+          </w:tcPr>
+          <w:p>
+            <w:r>
+              <w:rPr>
+                <w:sz w:val="18"/>
+                <w:szCs w:val="18"/>
+              </w:rPr>
+              <w:t xml:space="preserve">Assign reviewer; attest access as appropriate; flag access for removal; bulk-remind pending reviewers; close review cycle</w:t>
+            </w:r>
+          </w:p>
+        </w:tc>
+      </w:tr>
+      <w:tr>
+        <w:trPr>
+          <w:cantSplit/>
+        </w:trPr>
+        <w:tc>
+          <w:tcPr>
+            <w:tcW w:type="dxa" w:w="4680"/>
+            <w:tcMar>
+              <w:top w:type="dxa" w:w="90"/>
+              <w:left w:type="dxa" w:w="110"/>
+              <w:bottom w:type="dxa" w:w="90"/>
+              <w:right w:type="dxa" w:w="110"/>
+            </w:tcMar>
+          </w:tcPr>
+          <w:p>
+            <w:r>
+              <w:rPr>
+                <w:sz w:val="18"/>
+                <w:szCs w:val="18"/>
+              </w:rPr>
+              <w:t xml:space="preserve">Navigation</w:t>
+            </w:r>
+          </w:p>
+        </w:tc>
+        <w:tc>
+          <w:tcPr>
+            <w:tcW w:type="dxa" w:w="4680"/>
+            <w:tcMar>
+              <w:top w:type="dxa" w:w="90"/>
+              <w:left w:type="dxa" w:w="110"/>
+              <w:bottom w:type="dxa" w:w="90"/>
+              <w:right w:type="dxa" w:w="110"/>
+            </w:tcMar>
+          </w:tcPr>
+          <w:p>
+            <w:r>
+              <w:rPr>
+                <w:sz w:val="18"/>
+                <w:szCs w:val="18"/>
+              </w:rPr>
+              <w:t xml:space="preserve">From: User Account List/Management or scheduled reminder. To: Role Assignment screen (to act on flagged removals)</w:t>
+            </w:r>
+          </w:p>
+        </w:tc>
+      </w:tr>
+      <w:tr>
+        <w:trPr>
+          <w:cantSplit/>
+        </w:trPr>
+        <w:tc>
+          <w:tcPr>
+            <w:tcW w:type="dxa" w:w="4680"/>
+            <w:tcMar>
+              <w:top w:type="dxa" w:w="90"/>
+              <w:left w:type="dxa" w:w="110"/>
+              <w:bottom w:type="dxa" w:w="90"/>
+              <w:right w:type="dxa" w:w="110"/>
+            </w:tcMar>
+          </w:tcPr>
+          <w:p>
+            <w:r>
+              <w:rPr>
+                <w:sz w:val="18"/>
+                <w:szCs w:val="18"/>
+              </w:rPr>
+              <w:t xml:space="preserve">Validation/errors</w:t>
+            </w:r>
+          </w:p>
+        </w:tc>
+        <w:tc>
+          <w:tcPr>
+            <w:tcW w:type="dxa" w:w="4680"/>
+            <w:tcMar>
+              <w:top w:type="dxa" w:w="90"/>
+              <w:left w:type="dxa" w:w="110"/>
+              <w:bottom w:type="dxa" w:w="90"/>
+              <w:right w:type="dxa" w:w="110"/>
+            </w:tcMar>
+          </w:tcPr>
+          <w:p>
+            <w:r>
+              <w:rPr>
+                <w:sz w:val="18"/>
+                <w:szCs w:val="18"/>
+              </w:rPr>
+              <w:t xml:space="preserve">Cannot close review cycle with outstanding unattested accounts; flagged-for-removal items require follow-up action logged before cycle closes</w:t>
+            </w:r>
+          </w:p>
+        </w:tc>
+      </w:tr>
+      <w:tr>
+        <w:trPr>
+          <w:cantSplit/>
+        </w:trPr>
+        <w:tc>
+          <w:tcPr>
+            <w:tcW w:type="dxa" w:w="4680"/>
+            <w:tcMar>
+              <w:top w:type="dxa" w:w="90"/>
+              <w:left w:type="dxa" w:w="110"/>
+              <w:bottom w:type="dxa" w:w="90"/>
+              <w:right w:type="dxa" w:w="110"/>
+            </w:tcMar>
+          </w:tcPr>
+          <w:p>
+            <w:r>
+              <w:rPr>
+                <w:sz w:val="18"/>
+                <w:szCs w:val="18"/>
+              </w:rPr>
+              <w:t xml:space="preserve">Empty state</w:t>
+            </w:r>
+          </w:p>
+        </w:tc>
+        <w:tc>
+          <w:tcPr>
+            <w:tcW w:type="dxa" w:w="4680"/>
+            <w:tcMar>
+              <w:top w:type="dxa" w:w="90"/>
+              <w:left w:type="dxa" w:w="110"/>
+              <w:bottom w:type="dxa" w:w="90"/>
+              <w:right w:type="dxa" w:w="110"/>
+            </w:tcMar>
+          </w:tcPr>
+          <w:p>
+            <w:r>
+              <w:rPr>
+                <w:sz w:val="18"/>
+                <w:szCs w:val="18"/>
+              </w:rPr>
+              <w:t xml:space="preserve">"All accounts attested" as a positive confirmation state once a cycle completes cleanly</w:t>
+            </w:r>
+          </w:p>
+        </w:tc>
+      </w:tr>
+    </w:tbl>
+    <w:p>
+      <w:pPr>
+        <w:spacing w:after="160"/>
+      </w:pPr>
+    </w:p>
+    <w:p>
+      <w:r>
+        <w:br w:type="page"/>
+      </w:r>
+    </w:p>
+    <w:p>
+      <w:pPr>
+        <w:pStyle w:val="Heading2"/>
+      </w:pPr>
+      <w:r>
+        <w:t xml:space="preserve">4.4 System Configuration / Change-Request Screen</w:t>
+      </w:r>
+    </w:p>
+    <w:tbl>
+      <w:tblPr>
+        <w:tblW w:type="dxa" w:w="9360"/>
+        <w:tblBorders>
+          <w:top w:val="single" w:color="D8D2C2" w:sz="4"/>
+          <w:left w:val="single" w:color="D8D2C2" w:sz="4"/>
+          <w:bottom w:val="single" w:color="D8D2C2" w:sz="4"/>
+          <w:right w:val="single" w:color="D8D2C2" w:sz="4"/>
+          <w:insideH w:val="single" w:color="D8D2C2" w:sz="4"/>
+          <w:insideV w:val="single" w:color="D8D2C2" w:sz="4"/>
+        </w:tblBorders>
+      </w:tblPr>
+      <w:tblGrid>
+        <w:gridCol w:w="4680"/>
+        <w:gridCol w:w="4680"/>
+      </w:tblGrid>
+      <w:tr>
+        <w:trPr>
+          <w:cantSplit/>
+          <w:tblHeader/>
+        </w:trPr>
+        <w:tc>
+          <w:tcPr>
+            <w:tcW w:type="dxa" w:w="4680"/>
+            <w:shd w:fill="16423C" w:val="clear"/>
+            <w:tcMar>
+              <w:top w:type="dxa" w:w="90"/>
+              <w:left w:type="dxa" w:w="110"/>
+              <w:bottom w:type="dxa" w:w="90"/>
+              <w:right w:type="dxa" w:w="110"/>
+            </w:tcMar>
+          </w:tcPr>
+          <w:p>
+            <w:r>
+              <w:rPr>
+                <w:b/>
+                <w:bCs/>
+                <w:color w:val="FFFFFF"/>
+                <w:sz w:val="18"/>
+                <w:szCs w:val="18"/>
+              </w:rPr>
+              <w:t xml:space="preserve">Field</w:t>
+            </w:r>
+          </w:p>
+        </w:tc>
+        <w:tc>
+          <w:tcPr>
+            <w:tcW w:type="dxa" w:w="4680"/>
+            <w:shd w:fill="16423C" w:val="clear"/>
+            <w:tcMar>
+              <w:top w:type="dxa" w:w="90"/>
+              <w:left w:type="dxa" w:w="110"/>
+              <w:bottom w:type="dxa" w:w="90"/>
+              <w:right w:type="dxa" w:w="110"/>
+            </w:tcMar>
+          </w:tcPr>
+          <w:p>
+            <w:r>
+              <w:rPr>
+                <w:b/>
+                <w:bCs/>
+                <w:color w:val="FFFFFF"/>
+                <w:sz w:val="18"/>
+                <w:szCs w:val="18"/>
+              </w:rPr>
+              <w:t xml:space="preserve">Detail</w:t>
+            </w:r>
+          </w:p>
+        </w:tc>
+      </w:tr>
+      <w:tr>
+        <w:trPr>
+          <w:cantSplit/>
+        </w:trPr>
+        <w:tc>
+          <w:tcPr>
+            <w:tcW w:type="dxa" w:w="4680"/>
+            <w:tcMar>
+              <w:top w:type="dxa" w:w="90"/>
+              <w:left w:type="dxa" w:w="110"/>
+              <w:bottom w:type="dxa" w:w="90"/>
+              <w:right w:type="dxa" w:w="110"/>
+            </w:tcMar>
+          </w:tcPr>
+          <w:p>
+            <w:r>
+              <w:rPr>
+                <w:sz w:val="18"/>
+                <w:szCs w:val="18"/>
+              </w:rPr>
+              <w:t xml:space="preserve">Roles</w:t>
+            </w:r>
+          </w:p>
+        </w:tc>
+        <w:tc>
+          <w:tcPr>
+            <w:tcW w:type="dxa" w:w="4680"/>
+            <w:tcMar>
+              <w:top w:type="dxa" w:w="90"/>
+              <w:left w:type="dxa" w:w="110"/>
+              <w:bottom w:type="dxa" w:w="90"/>
+              <w:right w:type="dxa" w:w="110"/>
+            </w:tcMar>
+          </w:tcPr>
+          <w:p>
+            <w:r>
+              <w:rPr>
+                <w:sz w:val="18"/>
+                <w:szCs w:val="18"/>
+              </w:rPr>
+              <w:t xml:space="preserve">IT/System Administrator</w:t>
+            </w:r>
+          </w:p>
+        </w:tc>
+      </w:tr>
+      <w:tr>
+        <w:trPr>
+          <w:cantSplit/>
+        </w:trPr>
+        <w:tc>
+          <w:tcPr>
+            <w:tcW w:type="dxa" w:w="4680"/>
+            <w:tcMar>
+              <w:top w:type="dxa" w:w="90"/>
+              <w:left w:type="dxa" w:w="110"/>
+              <w:bottom w:type="dxa" w:w="90"/>
+              <w:right w:type="dxa" w:w="110"/>
+            </w:tcMar>
+          </w:tcPr>
+          <w:p>
+            <w:r>
+              <w:rPr>
+                <w:sz w:val="18"/>
+                <w:szCs w:val="18"/>
+              </w:rPr>
+              <w:t xml:space="preserve">Purpose</w:t>
+            </w:r>
+          </w:p>
+        </w:tc>
+        <w:tc>
+          <w:tcPr>
+            <w:tcW w:type="dxa" w:w="4680"/>
+            <w:tcMar>
+              <w:top w:type="dxa" w:w="90"/>
+              <w:left w:type="dxa" w:w="110"/>
+              <w:bottom w:type="dxa" w:w="90"/>
+              <w:right w:type="dxa" w:w="110"/>
+            </w:tcMar>
+          </w:tcPr>
+          <w:p>
+            <w:r>
+              <w:rPr>
+                <w:sz w:val="18"/>
+                <w:szCs w:val="18"/>
+              </w:rPr>
+              <w:t xml:space="preserve">Submit, approve, and track requests to change platform configuration (e.g., new branch setup, integration settings, workflow rules).</w:t>
+            </w:r>
+          </w:p>
+        </w:tc>
+      </w:tr>
+      <w:tr>
+        <w:trPr>
+          <w:cantSplit/>
+        </w:trPr>
+        <w:tc>
+          <w:tcPr>
+            <w:tcW w:type="dxa" w:w="4680"/>
+            <w:tcMar>
+              <w:top w:type="dxa" w:w="90"/>
+              <w:left w:type="dxa" w:w="110"/>
+              <w:bottom w:type="dxa" w:w="90"/>
+              <w:right w:type="dxa" w:w="110"/>
+            </w:tcMar>
+          </w:tcPr>
+          <w:p>
+            <w:r>
+              <w:rPr>
+                <w:sz w:val="18"/>
+                <w:szCs w:val="18"/>
+              </w:rPr>
+              <w:t xml:space="preserve">Key info displayed</w:t>
+            </w:r>
+          </w:p>
+        </w:tc>
+        <w:tc>
+          <w:tcPr>
+            <w:tcW w:type="dxa" w:w="4680"/>
+            <w:tcMar>
+              <w:top w:type="dxa" w:w="90"/>
+              <w:left w:type="dxa" w:w="110"/>
+              <w:bottom w:type="dxa" w:w="90"/>
+              <w:right w:type="dxa" w:w="110"/>
+            </w:tcMar>
+          </w:tcPr>
+          <w:p>
+            <w:r>
+              <w:rPr>
+                <w:sz w:val="18"/>
+                <w:szCs w:val="18"/>
+              </w:rPr>
+              <w:t xml:space="preserve">Change Request ID, requested change description, requesting module/role, risk level, approval status, implementation date, rollback plan</w:t>
+            </w:r>
+          </w:p>
+        </w:tc>
+      </w:tr>
+      <w:tr>
+        <w:trPr>
+          <w:cantSplit/>
+        </w:trPr>
+        <w:tc>
+          <w:tcPr>
+            <w:tcW w:type="dxa" w:w="4680"/>
+            <w:tcMar>
+              <w:top w:type="dxa" w:w="90"/>
+              <w:left w:type="dxa" w:w="110"/>
+              <w:bottom w:type="dxa" w:w="90"/>
+              <w:right w:type="dxa" w:w="110"/>
+            </w:tcMar>
+          </w:tcPr>
+          <w:p>
+            <w:r>
+              <w:rPr>
+                <w:sz w:val="18"/>
+                <w:szCs w:val="18"/>
+              </w:rPr>
+              <w:t xml:space="preserve">Actions</w:t>
+            </w:r>
+          </w:p>
+        </w:tc>
+        <w:tc>
+          <w:tcPr>
+            <w:tcW w:type="dxa" w:w="4680"/>
+            <w:tcMar>
+              <w:top w:type="dxa" w:w="90"/>
+              <w:left w:type="dxa" w:w="110"/>
+              <w:bottom w:type="dxa" w:w="90"/>
+              <w:right w:type="dxa" w:w="110"/>
+            </w:tcMar>
+          </w:tcPr>
+          <w:p>
+            <w:r>
+              <w:rPr>
+                <w:sz w:val="18"/>
+                <w:szCs w:val="18"/>
+              </w:rPr>
+              <w:t xml:space="preserve">Submit change request; assess risk; approve/reject; schedule implementation; record rollback if needed; close request</w:t>
+            </w:r>
+          </w:p>
+        </w:tc>
+      </w:tr>
+      <w:tr>
+        <w:trPr>
+          <w:cantSplit/>
+        </w:trPr>
+        <w:tc>
+          <w:tcPr>
+            <w:tcW w:type="dxa" w:w="4680"/>
+            <w:tcMar>
+              <w:top w:type="dxa" w:w="90"/>
+              <w:left w:type="dxa" w:w="110"/>
+              <w:bottom w:type="dxa" w:w="90"/>
+              <w:right w:type="dxa" w:w="110"/>
+            </w:tcMar>
+          </w:tcPr>
+          <w:p>
+            <w:r>
+              <w:rPr>
+                <w:sz w:val="18"/>
+                <w:szCs w:val="18"/>
+              </w:rPr>
+              <w:t xml:space="preserve">Navigation</w:t>
+            </w:r>
+          </w:p>
+        </w:tc>
+        <w:tc>
+          <w:tcPr>
+            <w:tcW w:type="dxa" w:w="4680"/>
+            <w:tcMar>
+              <w:top w:type="dxa" w:w="90"/>
+              <w:left w:type="dxa" w:w="110"/>
+              <w:bottom w:type="dxa" w:w="90"/>
+              <w:right w:type="dxa" w:w="110"/>
+            </w:tcMar>
+          </w:tcPr>
+          <w:p>
+            <w:r>
+              <w:rPr>
+                <w:sz w:val="18"/>
+                <w:szCs w:val="18"/>
+              </w:rPr>
+              <w:t xml:space="preserve">From: module launcher or request raised from another module (e.g., Finance requesting new payer integration); receives the initiating request from the New Region/Branch Launch Wizard (5.6) for the technical/geofence configuration steps in that journey. To: none downstream within this screen set (terminal administrative record)</w:t>
+            </w:r>
+          </w:p>
+        </w:tc>
+      </w:tr>
+      <w:tr>
+        <w:trPr>
+          <w:cantSplit/>
+        </w:trPr>
+        <w:tc>
+          <w:tcPr>
+            <w:tcW w:type="dxa" w:w="4680"/>
+            <w:tcMar>
+              <w:top w:type="dxa" w:w="90"/>
+              <w:left w:type="dxa" w:w="110"/>
+              <w:bottom w:type="dxa" w:w="90"/>
+              <w:right w:type="dxa" w:w="110"/>
+            </w:tcMar>
+          </w:tcPr>
+          <w:p>
+            <w:r>
+              <w:rPr>
+                <w:sz w:val="18"/>
+                <w:szCs w:val="18"/>
+              </w:rPr>
+              <w:t xml:space="preserve">Validation/errors</w:t>
+            </w:r>
+          </w:p>
+        </w:tc>
+        <w:tc>
+          <w:tcPr>
+            <w:tcW w:type="dxa" w:w="4680"/>
+            <w:tcMar>
+              <w:top w:type="dxa" w:w="90"/>
+              <w:left w:type="dxa" w:w="110"/>
+              <w:bottom w:type="dxa" w:w="90"/>
+              <w:right w:type="dxa" w:w="110"/>
+            </w:tcMar>
+          </w:tcPr>
+          <w:p>
+            <w:r>
+              <w:rPr>
+                <w:sz w:val="18"/>
+                <w:szCs w:val="18"/>
+              </w:rPr>
+              <w:t xml:space="preserve">High-risk changes require documented rollback plan before approval; cannot implement without recorded approval</w:t>
+            </w:r>
+          </w:p>
+        </w:tc>
+      </w:tr>
+      <w:tr>
+        <w:trPr>
+          <w:cantSplit/>
+        </w:trPr>
+        <w:tc>
+          <w:tcPr>
+            <w:tcW w:type="dxa" w:w="4680"/>
+            <w:tcMar>
+              <w:top w:type="dxa" w:w="90"/>
+              <w:left w:type="dxa" w:w="110"/>
+              <w:bottom w:type="dxa" w:w="90"/>
+              <w:right w:type="dxa" w:w="110"/>
+            </w:tcMar>
+          </w:tcPr>
+          <w:p>
+            <w:r>
+              <w:rPr>
+                <w:sz w:val="18"/>
+                <w:szCs w:val="18"/>
+              </w:rPr>
+              <w:t xml:space="preserve">Empty state</w:t>
+            </w:r>
+          </w:p>
+        </w:tc>
+        <w:tc>
+          <w:tcPr>
+            <w:tcW w:type="dxa" w:w="4680"/>
+            <w:tcMar>
+              <w:top w:type="dxa" w:w="90"/>
+              <w:left w:type="dxa" w:w="110"/>
+              <w:bottom w:type="dxa" w:w="90"/>
+              <w:right w:type="dxa" w:w="110"/>
+            </w:tcMar>
+          </w:tcPr>
+          <w:p>
+            <w:r>
+              <w:rPr>
+                <w:sz w:val="18"/>
+                <w:szCs w:val="18"/>
+              </w:rPr>
+              <w:t xml:space="preserve">"No open change requests" as a positive confirmation state</w:t>
+            </w:r>
+          </w:p>
+        </w:tc>
+      </w:tr>
+    </w:tbl>
+    <w:p>
+      <w:pPr>
+        <w:spacing w:after="160"/>
+      </w:pPr>
+    </w:p>
+    <w:p>
+      <w:r>
+        <w:br w:type="page"/>
+      </w:r>
+    </w:p>
+    <w:p>
+      <w:pPr>
+        <w:pStyle w:val="Heading2"/>
+      </w:pPr>
+      <w:r>
+        <w:t xml:space="preserve">4.5 Backup / Security Incident Screen</w:t>
+      </w:r>
+    </w:p>
+    <w:tbl>
+      <w:tblPr>
+        <w:tblW w:type="dxa" w:w="9360"/>
+        <w:tblBorders>
+          <w:top w:val="single" w:color="D8D2C2" w:sz="4"/>
+          <w:left w:val="single" w:color="D8D2C2" w:sz="4"/>
+          <w:bottom w:val="single" w:color="D8D2C2" w:sz="4"/>
+          <w:right w:val="single" w:color="D8D2C2" w:sz="4"/>
+          <w:insideH w:val="single" w:color="D8D2C2" w:sz="4"/>
+          <w:insideV w:val="single" w:color="D8D2C2" w:sz="4"/>
+        </w:tblBorders>
+      </w:tblPr>
+      <w:tblGrid>
+        <w:gridCol w:w="4680"/>
+        <w:gridCol w:w="4680"/>
+      </w:tblGrid>
+      <w:tr>
+        <w:trPr>
+          <w:cantSplit/>
+          <w:tblHeader/>
+        </w:trPr>
+        <w:tc>
+          <w:tcPr>
+            <w:tcW w:type="dxa" w:w="4680"/>
+            <w:shd w:fill="16423C" w:val="clear"/>
+            <w:tcMar>
+              <w:top w:type="dxa" w:w="90"/>
+              <w:left w:type="dxa" w:w="110"/>
+              <w:bottom w:type="dxa" w:w="90"/>
+              <w:right w:type="dxa" w:w="110"/>
+            </w:tcMar>
+          </w:tcPr>
+          <w:p>
+            <w:r>
+              <w:rPr>
+                <w:b/>
+                <w:bCs/>
+                <w:color w:val="FFFFFF"/>
+                <w:sz w:val="18"/>
+                <w:szCs w:val="18"/>
+              </w:rPr>
+              <w:t xml:space="preserve">Field</w:t>
+            </w:r>
+          </w:p>
+        </w:tc>
+        <w:tc>
+          <w:tcPr>
+            <w:tcW w:type="dxa" w:w="4680"/>
+            <w:shd w:fill="16423C" w:val="clear"/>
+            <w:tcMar>
+              <w:top w:type="dxa" w:w="90"/>
+              <w:left w:type="dxa" w:w="110"/>
+              <w:bottom w:type="dxa" w:w="90"/>
+              <w:right w:type="dxa" w:w="110"/>
+            </w:tcMar>
+          </w:tcPr>
+          <w:p>
+            <w:r>
+              <w:rPr>
+                <w:b/>
+                <w:bCs/>
+                <w:color w:val="FFFFFF"/>
+                <w:sz w:val="18"/>
+                <w:szCs w:val="18"/>
+              </w:rPr>
+              <w:t xml:space="preserve">Detail</w:t>
+            </w:r>
+          </w:p>
+        </w:tc>
+      </w:tr>
+      <w:tr>
+        <w:trPr>
+          <w:cantSplit/>
+        </w:trPr>
+        <w:tc>
+          <w:tcPr>
+            <w:tcW w:type="dxa" w:w="4680"/>
+            <w:tcMar>
+              <w:top w:type="dxa" w:w="90"/>
+              <w:left w:type="dxa" w:w="110"/>
+              <w:bottom w:type="dxa" w:w="90"/>
+              <w:right w:type="dxa" w:w="110"/>
+            </w:tcMar>
+          </w:tcPr>
+          <w:p>
+            <w:r>
+              <w:rPr>
+                <w:sz w:val="18"/>
+                <w:szCs w:val="18"/>
+              </w:rPr>
+              <w:t xml:space="preserve">Roles</w:t>
+            </w:r>
+          </w:p>
+        </w:tc>
+        <w:tc>
+          <w:tcPr>
+            <w:tcW w:type="dxa" w:w="4680"/>
+            <w:tcMar>
+              <w:top w:type="dxa" w:w="90"/>
+              <w:left w:type="dxa" w:w="110"/>
+              <w:bottom w:type="dxa" w:w="90"/>
+              <w:right w:type="dxa" w:w="110"/>
+            </w:tcMar>
+          </w:tcPr>
+          <w:p>
+            <w:r>
+              <w:rPr>
+                <w:sz w:val="18"/>
+                <w:szCs w:val="18"/>
+              </w:rPr>
+              <w:t xml:space="preserve">IT/System Administrator</w:t>
+            </w:r>
+          </w:p>
+        </w:tc>
+      </w:tr>
+      <w:tr>
+        <w:trPr>
+          <w:cantSplit/>
+        </w:trPr>
+        <w:tc>
+          <w:tcPr>
+            <w:tcW w:type="dxa" w:w="4680"/>
+            <w:tcMar>
+              <w:top w:type="dxa" w:w="90"/>
+              <w:left w:type="dxa" w:w="110"/>
+              <w:bottom w:type="dxa" w:w="90"/>
+              <w:right w:type="dxa" w:w="110"/>
+            </w:tcMar>
+          </w:tcPr>
+          <w:p>
+            <w:r>
+              <w:rPr>
+                <w:sz w:val="18"/>
+                <w:szCs w:val="18"/>
+              </w:rPr>
+              <w:t xml:space="preserve">Purpose</w:t>
+            </w:r>
+          </w:p>
+        </w:tc>
+        <w:tc>
+          <w:tcPr>
+            <w:tcW w:type="dxa" w:w="4680"/>
+            <w:tcMar>
+              <w:top w:type="dxa" w:w="90"/>
+              <w:left w:type="dxa" w:w="110"/>
+              <w:bottom w:type="dxa" w:w="90"/>
+              <w:right w:type="dxa" w:w="110"/>
+            </w:tcMar>
+          </w:tcPr>
+          <w:p>
+            <w:r>
+              <w:rPr>
+                <w:sz w:val="18"/>
+                <w:szCs w:val="18"/>
+              </w:rPr>
+              <w:t xml:space="preserve">Track system backup status and manage security incident response (distinct from clinical Incident Case).</w:t>
+            </w:r>
+          </w:p>
+        </w:tc>
+      </w:tr>
+      <w:tr>
+        <w:trPr>
+          <w:cantSplit/>
+        </w:trPr>
+        <w:tc>
+          <w:tcPr>
+            <w:tcW w:type="dxa" w:w="4680"/>
+            <w:tcMar>
+              <w:top w:type="dxa" w:w="90"/>
+              <w:left w:type="dxa" w:w="110"/>
+              <w:bottom w:type="dxa" w:w="90"/>
+              <w:right w:type="dxa" w:w="110"/>
+            </w:tcMar>
+          </w:tcPr>
+          <w:p>
+            <w:r>
+              <w:rPr>
+                <w:sz w:val="18"/>
+                <w:szCs w:val="18"/>
+              </w:rPr>
+              <w:t xml:space="preserve">Key info displayed</w:t>
+            </w:r>
+          </w:p>
+        </w:tc>
+        <w:tc>
+          <w:tcPr>
+            <w:tcW w:type="dxa" w:w="4680"/>
+            <w:tcMar>
+              <w:top w:type="dxa" w:w="90"/>
+              <w:left w:type="dxa" w:w="110"/>
+              <w:bottom w:type="dxa" w:w="90"/>
+              <w:right w:type="dxa" w:w="110"/>
+            </w:tcMar>
+          </w:tcPr>
+          <w:p>
+            <w:r>
+              <w:rPr>
+                <w:sz w:val="18"/>
+                <w:szCs w:val="18"/>
+              </w:rPr>
+              <w:t xml:space="preserve">Backup job log (schedule, last successful run, failure alerts), security incident list (type, affected systems/accounts, detection date, severity, containment status), remediation actions</w:t>
+            </w:r>
+          </w:p>
+        </w:tc>
+      </w:tr>
+      <w:tr>
+        <w:trPr>
+          <w:cantSplit/>
+        </w:trPr>
+        <w:tc>
+          <w:tcPr>
+            <w:tcW w:type="dxa" w:w="4680"/>
+            <w:tcMar>
+              <w:top w:type="dxa" w:w="90"/>
+              <w:left w:type="dxa" w:w="110"/>
+              <w:bottom w:type="dxa" w:w="90"/>
+              <w:right w:type="dxa" w:w="110"/>
+            </w:tcMar>
+          </w:tcPr>
+          <w:p>
+            <w:r>
+              <w:rPr>
+                <w:sz w:val="18"/>
+                <w:szCs w:val="18"/>
+              </w:rPr>
+              <w:t xml:space="preserve">Actions</w:t>
+            </w:r>
+          </w:p>
+        </w:tc>
+        <w:tc>
+          <w:tcPr>
+            <w:tcW w:type="dxa" w:w="4680"/>
+            <w:tcMar>
+              <w:top w:type="dxa" w:w="90"/>
+              <w:left w:type="dxa" w:w="110"/>
+              <w:bottom w:type="dxa" w:w="90"/>
+              <w:right w:type="dxa" w:w="110"/>
+            </w:tcMar>
+          </w:tcPr>
+          <w:p>
+            <w:r>
+              <w:rPr>
+                <w:sz w:val="18"/>
+                <w:szCs w:val="18"/>
+              </w:rPr>
+              <w:t xml:space="preserve">Retry/verify backup job; open new security incident; assign remediation owner; log containment/remediation step; close incident; notify Compliance Officer if data exposure suspected (cross-module trigger to DSAR/Incident Case)</w:t>
+            </w:r>
+          </w:p>
+        </w:tc>
+      </w:tr>
+      <w:tr>
+        <w:trPr>
+          <w:cantSplit/>
+        </w:trPr>
+        <w:tc>
+          <w:tcPr>
+            <w:tcW w:type="dxa" w:w="4680"/>
+            <w:tcMar>
+              <w:top w:type="dxa" w:w="90"/>
+              <w:left w:type="dxa" w:w="110"/>
+              <w:bottom w:type="dxa" w:w="90"/>
+              <w:right w:type="dxa" w:w="110"/>
+            </w:tcMar>
+          </w:tcPr>
+          <w:p>
+            <w:r>
+              <w:rPr>
+                <w:sz w:val="18"/>
+                <w:szCs w:val="18"/>
+              </w:rPr>
+              <w:t xml:space="preserve">Navigation</w:t>
+            </w:r>
+          </w:p>
+        </w:tc>
+        <w:tc>
+          <w:tcPr>
+            <w:tcW w:type="dxa" w:w="4680"/>
+            <w:tcMar>
+              <w:top w:type="dxa" w:w="90"/>
+              <w:left w:type="dxa" w:w="110"/>
+              <w:bottom w:type="dxa" w:w="90"/>
+              <w:right w:type="dxa" w:w="110"/>
+            </w:tcMar>
+          </w:tcPr>
+          <w:p>
+            <w:r>
+              <w:rPr>
+                <w:sz w:val="18"/>
+                <w:szCs w:val="18"/>
+              </w:rPr>
+              <w:t xml:space="preserve">From: module launcher or automated alert. To: none within IT module (may generate linked record in Compliance module's Incident Case screen if data breach suspected)</w:t>
+            </w:r>
+          </w:p>
+        </w:tc>
+      </w:tr>
+      <w:tr>
+        <w:trPr>
+          <w:cantSplit/>
+        </w:trPr>
+        <w:tc>
+          <w:tcPr>
+            <w:tcW w:type="dxa" w:w="4680"/>
+            <w:tcMar>
+              <w:top w:type="dxa" w:w="90"/>
+              <w:left w:type="dxa" w:w="110"/>
+              <w:bottom w:type="dxa" w:w="90"/>
+              <w:right w:type="dxa" w:w="110"/>
+            </w:tcMar>
+          </w:tcPr>
+          <w:p>
+            <w:r>
+              <w:rPr>
+                <w:sz w:val="18"/>
+                <w:szCs w:val="18"/>
+              </w:rPr>
+              <w:t xml:space="preserve">Validation/errors</w:t>
+            </w:r>
+          </w:p>
+        </w:tc>
+        <w:tc>
+          <w:tcPr>
+            <w:tcW w:type="dxa" w:w="4680"/>
+            <w:tcMar>
+              <w:top w:type="dxa" w:w="90"/>
+              <w:left w:type="dxa" w:w="110"/>
+              <w:bottom w:type="dxa" w:w="90"/>
+              <w:right w:type="dxa" w:w="110"/>
+            </w:tcMar>
+          </w:tcPr>
+          <w:p>
+            <w:r>
+              <w:rPr>
+                <w:sz w:val="18"/>
+                <w:szCs w:val="18"/>
+              </w:rPr>
+              <w:t xml:space="preserve">Cannot close security incident without documented containment and remediation; failed backup beyond retry threshold auto-escalates severity</w:t>
+            </w:r>
+          </w:p>
+        </w:tc>
+      </w:tr>
+      <w:tr>
+        <w:trPr>
+          <w:cantSplit/>
+        </w:trPr>
+        <w:tc>
+          <w:tcPr>
+            <w:tcW w:type="dxa" w:w="4680"/>
+            <w:tcMar>
+              <w:top w:type="dxa" w:w="90"/>
+              <w:left w:type="dxa" w:w="110"/>
+              <w:bottom w:type="dxa" w:w="90"/>
+              <w:right w:type="dxa" w:w="110"/>
+            </w:tcMar>
+          </w:tcPr>
+          <w:p>
+            <w:r>
+              <w:rPr>
+                <w:sz w:val="18"/>
+                <w:szCs w:val="18"/>
+              </w:rPr>
+              <w:t xml:space="preserve">Empty state</w:t>
+            </w:r>
+          </w:p>
+        </w:tc>
+        <w:tc>
+          <w:tcPr>
+            <w:tcW w:type="dxa" w:w="4680"/>
+            <w:tcMar>
+              <w:top w:type="dxa" w:w="90"/>
+              <w:left w:type="dxa" w:w="110"/>
+              <w:bottom w:type="dxa" w:w="90"/>
+              <w:right w:type="dxa" w:w="110"/>
+            </w:tcMar>
+          </w:tcPr>
+          <w:p>
+            <w:r>
+              <w:rPr>
+                <w:sz w:val="18"/>
+                <w:szCs w:val="18"/>
+              </w:rPr>
+              <w:t xml:space="preserve">Security incident list shows "No open security incidents" as a positive confirmation state; the backup job log is never empty by design (it always shows the most recent scheduled run, success or failure)</w:t>
+            </w:r>
+          </w:p>
+        </w:tc>
+      </w:tr>
+    </w:tbl>
+    <w:p>
+      <w:pPr>
+        <w:spacing w:after="160"/>
+      </w:pPr>
+    </w:p>
+    <w:p>
+      <w:r>
+        <w:br w:type="page"/>
+      </w:r>
+    </w:p>
+    <w:p>
+      <w:pPr>
+        <w:pStyle w:val="Heading1"/>
+      </w:pPr>
+      <w:r>
+        <w:t xml:space="preserve">Module 5: Executive and Operations Reporting</w:t>
+      </w:r>
+    </w:p>
+    <w:p>
+      <w:r>
+        <w:br w:type="page"/>
+      </w:r>
+    </w:p>
+    <w:p>
+      <w:pPr>
+        <w:pStyle w:val="Heading2"/>
+      </w:pPr>
+      <w:r>
+        <w:t xml:space="preserve">5.1 Main KPI Dashboard</w:t>
+      </w:r>
+    </w:p>
+    <w:tbl>
+      <w:tblPr>
+        <w:tblW w:type="dxa" w:w="9360"/>
+        <w:tblBorders>
+          <w:top w:val="single" w:color="D8D2C2" w:sz="4"/>
+          <w:left w:val="single" w:color="D8D2C2" w:sz="4"/>
+          <w:bottom w:val="single" w:color="D8D2C2" w:sz="4"/>
+          <w:right w:val="single" w:color="D8D2C2" w:sz="4"/>
+          <w:insideH w:val="single" w:color="D8D2C2" w:sz="4"/>
+          <w:insideV w:val="single" w:color="D8D2C2" w:sz="4"/>
+        </w:tblBorders>
+      </w:tblPr>
+      <w:tblGrid>
+        <w:gridCol w:w="4680"/>
+        <w:gridCol w:w="4680"/>
+      </w:tblGrid>
+      <w:tr>
+        <w:trPr>
+          <w:cantSplit/>
+          <w:tblHeader/>
+        </w:trPr>
+        <w:tc>
+          <w:tcPr>
+            <w:tcW w:type="dxa" w:w="4680"/>
+            <w:shd w:fill="16423C" w:val="clear"/>
+            <w:tcMar>
+              <w:top w:type="dxa" w:w="90"/>
+              <w:left w:type="dxa" w:w="110"/>
+              <w:bottom w:type="dxa" w:w="90"/>
+              <w:right w:type="dxa" w:w="110"/>
+            </w:tcMar>
+          </w:tcPr>
+          <w:p>
+            <w:r>
+              <w:rPr>
+                <w:b/>
+                <w:bCs/>
+                <w:color w:val="FFFFFF"/>
+                <w:sz w:val="18"/>
+                <w:szCs w:val="18"/>
+              </w:rPr>
+              <w:t xml:space="preserve">Field</w:t>
+            </w:r>
+          </w:p>
+        </w:tc>
+        <w:tc>
+          <w:tcPr>
+            <w:tcW w:type="dxa" w:w="4680"/>
+            <w:shd w:fill="16423C" w:val="clear"/>
+            <w:tcMar>
+              <w:top w:type="dxa" w:w="90"/>
+              <w:left w:type="dxa" w:w="110"/>
+              <w:bottom w:type="dxa" w:w="90"/>
+              <w:right w:type="dxa" w:w="110"/>
+            </w:tcMar>
+          </w:tcPr>
+          <w:p>
+            <w:r>
+              <w:rPr>
+                <w:b/>
+                <w:bCs/>
+                <w:color w:val="FFFFFF"/>
+                <w:sz w:val="18"/>
+                <w:szCs w:val="18"/>
+              </w:rPr>
+              <w:t xml:space="preserve">Detail</w:t>
+            </w:r>
+          </w:p>
+        </w:tc>
+      </w:tr>
+      <w:tr>
+        <w:trPr>
+          <w:cantSplit/>
+        </w:trPr>
+        <w:tc>
+          <w:tcPr>
+            <w:tcW w:type="dxa" w:w="4680"/>
+            <w:tcMar>
+              <w:top w:type="dxa" w:w="90"/>
+              <w:left w:type="dxa" w:w="110"/>
+              <w:bottom w:type="dxa" w:w="90"/>
+              <w:right w:type="dxa" w:w="110"/>
+            </w:tcMar>
+          </w:tcPr>
+          <w:p>
+            <w:r>
+              <w:rPr>
+                <w:sz w:val="18"/>
+                <w:szCs w:val="18"/>
+              </w:rPr>
+              <w:t xml:space="preserve">Roles</w:t>
+            </w:r>
+          </w:p>
+        </w:tc>
+        <w:tc>
+          <w:tcPr>
+            <w:tcW w:type="dxa" w:w="4680"/>
+            <w:tcMar>
+              <w:top w:type="dxa" w:w="90"/>
+              <w:left w:type="dxa" w:w="110"/>
+              <w:bottom w:type="dxa" w:w="90"/>
+              <w:right w:type="dxa" w:w="110"/>
+            </w:tcMar>
+          </w:tcPr>
+          <w:p>
+            <w:r>
+              <w:rPr>
+                <w:sz w:val="18"/>
+                <w:szCs w:val="18"/>
+              </w:rPr>
               <w:t xml:space="preserve">Operations Manager (interactive, can adjust filters/save views); Executive (read-only aggregated view, no configuration controls)</w:t>
             </w:r>
           </w:p>
@@ -19458,7 +22444,7 @@
                 <w:sz w:val="18"/>
                 <w:szCs w:val="18"/>
               </w:rPr>
-              <w:t xml:space="preserve">Ambulance/visit response time metrics, revenue summary (linked to Invoice/Payout data), fleet/crew utilization rate, Membership plan mix and status breakdown, open Incident Case/DSAR Case counts, compliance filing status summary, provider payout/payroll cost by service line, Care Plan compliance rate</w:t>
+              <w:t xml:space="preserve">Ambulance/visit response time metrics, revenue summary (linked to Invoice/Payout data), fleet/crew utilization rate, Membership plan mix and status breakdown, open Incident Case/DSAR Case counts, compliance filing status summary, provider payout/payroll cost by service line, Care Plan compliance rate, average patient/Member satisfaction rating (rolled up from the Patient App's Rate and Review submissions) trended over time and broken out by service type</w:t>
             </w:r>
           </w:p>
         </w:tc>

</xml_diff>

<commit_message>
Add tips/gratuities as a 100% pass-through to service providers
Business decision: tips are optional, patient-initiated, and disbursed
in full to the assigned provider with zero AFC commission. Documents
the mechanics as a sub-flow of Provider Compensation and Payout (tax
treatment, multi-provider split, clawback on chargeback/refund), and
adds the actual UI: tip capture on the patient's Rate and Review screen,
a distinct Tips Received line on provider My Earnings, and pass-through
handling on the Payout Run, Payout Record, GL Posting, Dispute Case,
and KPI Dashboard screens.

Co-Authored-By: Claude Sonnet 5 <noreply@anthropic.com>
</commit_message>
<xml_diff>
--- a/docs/AFC_UIUX_Functional_Screen_Inventory.docx
+++ b/docs/AFC_UIUX_Functional_Screen_Inventory.docx
@@ -3013,72 +3013,72 @@
         <w:spacing w:after="90"/>
       </w:pPr>
       <w:r>
-        <w:t xml:space="preserve">Purpose: Capture a patient's rating and feedback after a completed visit, and route a low rating into the service-recovery/complaint path rather than letting it sit as an isolated data point.</w:t>
-      </w:r>
-    </w:p>
-    <w:p>
-      <w:pPr>
-        <w:pStyle w:val="ListParagraph"/>
-        <w:numPr>
-          <w:ilvl w:val="0"/>
-          <w:numId w:val="2"/>
-        </w:numPr>
-        <w:spacing w:after="90"/>
-      </w:pPr>
-      <w:r>
-        <w:t xml:space="preserve">Key information displayed: Completed service summary (type, date, provider); star or numeric rating; optional free-text feedback.</w:t>
-      </w:r>
-    </w:p>
-    <w:p>
-      <w:pPr>
-        <w:pStyle w:val="ListParagraph"/>
-        <w:numPr>
-          <w:ilvl w:val="0"/>
-          <w:numId w:val="2"/>
-        </w:numPr>
-        <w:spacing w:after="90"/>
-      </w:pPr>
-      <w:r>
-        <w:t xml:space="preserve">Actions: Submit rating; add written feedback; submit.</w:t>
-      </w:r>
-    </w:p>
-    <w:p>
-      <w:pPr>
-        <w:pStyle w:val="ListParagraph"/>
-        <w:numPr>
-          <w:ilvl w:val="0"/>
-          <w:numId w:val="2"/>
-        </w:numPr>
-        <w:spacing w:after="90"/>
-      </w:pPr>
-      <w:r>
-        <w:t xml:space="preserve">Navigation: From: Booking Detail, or a post-visit notification prompt. To: Booking Detail (on submit); a rating below a defined threshold automatically offers a direct path into raising a Complaint Case rather than the feedback simply being logged silently.</w:t>
-      </w:r>
-    </w:p>
-    <w:p>
-      <w:pPr>
-        <w:pStyle w:val="ListParagraph"/>
-        <w:numPr>
-          <w:ilvl w:val="0"/>
-          <w:numId w:val="2"/>
-        </w:numPr>
-        <w:spacing w:after="90"/>
-      </w:pPr>
-      <w:r>
-        <w:t xml:space="preserve">Validation/errors: Rating is required before written feedback can be submitted alone; a submitted rating cannot be edited after the fact, only appended with a follow-up comment, to preserve the original feedback's integrity.</w:t>
-      </w:r>
-    </w:p>
-    <w:p>
-      <w:pPr>
-        <w:pStyle w:val="ListParagraph"/>
-        <w:numPr>
-          <w:ilvl w:val="0"/>
-          <w:numId w:val="2"/>
-        </w:numPr>
-        <w:spacing w:after="90"/>
-      </w:pPr>
-      <w:r>
-        <w:t xml:space="preserve">Empty state: Not applicable — single-use form per completed visit.</w:t>
+        <w:t xml:space="preserve">Purpose: Capture a patient's rating and feedback after a completed visit, route a low rating into the service-recovery/complaint path rather than letting it sit as an isolated data point, and let the patient optionally leave a tip for the provider(s) who delivered the service.</w:t>
+      </w:r>
+    </w:p>
+    <w:p>
+      <w:pPr>
+        <w:pStyle w:val="ListParagraph"/>
+        <w:numPr>
+          <w:ilvl w:val="0"/>
+          <w:numId w:val="2"/>
+        </w:numPr>
+        <w:spacing w:after="90"/>
+      </w:pPr>
+      <w:r>
+        <w:t xml:space="preserve">Key information displayed: Completed service summary (type, date, provider); star or numeric rating; optional free-text feedback; a Tip section, shown only once the booking has reached Completed status, with preset tip amount/percentage options, a custom-amount entry, the payment method already on file for this booking (no separate payment-method entry required), and explicit "100% of your tip goes directly to [provider name]" messaging, since AFC retains no commission or fee on tips; for a multi-provider booking (e.g., an ambulance run with more than one crew member), the primary provider named as the tip recipient by default, with an optional per-provider split-tip breakdown.</w:t>
+      </w:r>
+    </w:p>
+    <w:p>
+      <w:pPr>
+        <w:pStyle w:val="ListParagraph"/>
+        <w:numPr>
+          <w:ilvl w:val="0"/>
+          <w:numId w:val="2"/>
+        </w:numPr>
+        <w:spacing w:after="90"/>
+      </w:pPr>
+      <w:r>
+        <w:t xml:space="preserve">Actions: Submit rating; add written feedback; select a preset tip amount/percentage or enter a custom tip amount; confirm the tip (one-time confirmation step before it is charged to the booking's existing payment method); for a multi-provider booking, leave the default tip to the primary provider or switch to Split Tip and allocate the amount across the listed providers; submit.</w:t>
+      </w:r>
+    </w:p>
+    <w:p>
+      <w:pPr>
+        <w:pStyle w:val="ListParagraph"/>
+        <w:numPr>
+          <w:ilvl w:val="0"/>
+          <w:numId w:val="2"/>
+        </w:numPr>
+        <w:spacing w:after="90"/>
+      </w:pPr>
+      <w:r>
+        <w:t xml:space="preserve">Navigation: From: Booking Detail, or a post-visit notification prompt. To: Booking Detail (on submit); a rating below a defined threshold automatically offers a direct path into raising a Complaint Case rather than the feedback simply being logged silently; a confirmed tip charge shows a success state on this same screen before returning to Booking Detail.</w:t>
+      </w:r>
+    </w:p>
+    <w:p>
+      <w:pPr>
+        <w:pStyle w:val="ListParagraph"/>
+        <w:numPr>
+          <w:ilvl w:val="0"/>
+          <w:numId w:val="2"/>
+        </w:numPr>
+        <w:spacing w:after="90"/>
+      </w:pPr>
+      <w:r>
+        <w:t xml:space="preserve">Validation/errors: Rating is required before written feedback can be submitted alone; a submitted rating cannot be edited after the fact, only appended with a follow-up comment, to preserve the original feedback's integrity; the Tip section is only available once the underlying service/job has reached a Completed status — it does not appear for an Upcoming or In Progress booking; a tip cannot be added to a Cancelled or No-show booking; tip-payment-failed banner (the rating and written feedback still save independently of tip success); a split-tip allocation must total the entered tip amount before it can be confirmed.</w:t>
+      </w:r>
+    </w:p>
+    <w:p>
+      <w:pPr>
+        <w:pStyle w:val="ListParagraph"/>
+        <w:numPr>
+          <w:ilvl w:val="0"/>
+          <w:numId w:val="2"/>
+        </w:numPr>
+        <w:spacing w:after="90"/>
+      </w:pPr>
+      <w:r>
+        <w:t xml:space="preserve">Empty state: Not applicable — single-use form per completed visit; a completed booking with no provider on file to tip (a rare data-integrity edge case) omits the Tip section rather than showing it non-functionally.</w:t>
       </w:r>
     </w:p>
     <w:p>
@@ -5348,33 +5348,33 @@
         <w:spacing w:after="90"/>
       </w:pPr>
       <w:r>
-        <w:t xml:space="preserve">Purpose: Show the provider their own Payout Record breakdown.</w:t>
-      </w:r>
-    </w:p>
-    <w:p>
-      <w:pPr>
-        <w:pStyle w:val="ListParagraph"/>
-        <w:numPr>
-          <w:ilvl w:val="0"/>
-          <w:numId w:val="2"/>
-        </w:numPr>
-        <w:spacing w:after="90"/>
-      </w:pPr>
-      <w:r>
-        <w:t xml:space="preserve">Key information displayed: Current pay-period summary; breakdown by structure (per-visit fee list, salary base, revenue-share percentage); completed-jobs count; pending vs. paid amounts; linked Compensation Profile terms</w:t>
-      </w:r>
-    </w:p>
-    <w:p>
-      <w:pPr>
-        <w:pStyle w:val="ListParagraph"/>
-        <w:numPr>
-          <w:ilvl w:val="0"/>
-          <w:numId w:val="2"/>
-        </w:numPr>
-        <w:spacing w:after="90"/>
-      </w:pPr>
-      <w:r>
-        <w:t xml:space="preserve">Actions: Filter by pay period; View Payout Detail on a line item; Download Statement; Report a Discrepancy (raises a Dispute Case scoped to payout)</w:t>
+        <w:t xml:space="preserve">Purpose: Show the provider their own Payout Record breakdown, including any patient-initiated tips received — tips are kept in full, with no commission or fee deducted, separately from Compensation-Profile-based service-fee earnings.</w:t>
+      </w:r>
+    </w:p>
+    <w:p>
+      <w:pPr>
+        <w:pStyle w:val="ListParagraph"/>
+        <w:numPr>
+          <w:ilvl w:val="0"/>
+          <w:numId w:val="2"/>
+        </w:numPr>
+        <w:spacing w:after="90"/>
+      </w:pPr>
+      <w:r>
+        <w:t xml:space="preserve">Key information displayed: Current pay-period summary; breakdown by structure (per-visit fee list, salary base, revenue-share percentage); Tips Received, shown as its own distinct line item clearly separated from Compensation-Profile earnings, with no commission or platform fee deducted — the provider keeps 100% of every tip; completed-jobs count; pending vs. paid amounts; linked Compensation Profile terms</w:t>
+      </w:r>
+    </w:p>
+    <w:p>
+      <w:pPr>
+        <w:pStyle w:val="ListParagraph"/>
+        <w:numPr>
+          <w:ilvl w:val="0"/>
+          <w:numId w:val="2"/>
+        </w:numPr>
+        <w:spacing w:after="90"/>
+      </w:pPr>
+      <w:r>
+        <w:t xml:space="preserve">Actions: Filter by pay period; View Payout Detail on a line item, including the Tips Received line item; Download Statement; Report a Discrepancy (raises a Dispute Case scoped to payout, including a missing or incorrect tip)</w:t>
       </w:r>
     </w:p>
     <w:p>
@@ -5400,7 +5400,7 @@
         <w:spacing w:after="90"/>
       </w:pPr>
       <w:r>
-        <w:t xml:space="preserve">Validation/errors: By design, no UI path exists anywhere in the app to view another provider's Payout Record.</w:t>
+        <w:t xml:space="preserve">Validation/errors: By design, no UI path exists anywhere in the app to view another provider's Payout Record; a tip not yet settled shows as Pending within the Tips Received line item, mirroring the same pending-vs-paid distinction used for standard payout amounts.</w:t>
       </w:r>
     </w:p>
     <w:p>
@@ -10804,7 +10804,7 @@
                 <w:sz w:val="18"/>
                 <w:szCs w:val="18"/>
               </w:rPr>
-              <w:t xml:space="preserve">Dispute Case ID, disputing-party type (Member or Provider) and identity, linked record under dispute (Invoice for a Member dispute; Payout Record/Payout Run for a Payout Dispute), dispute reason, disputing party's statement/correspondence log, a GPS/trip-log evidence field alongside that statement/correspondence log — available on a Member billing dispute (e.g., "visit didn't happen") just as it already is on a Payout Dispute's evidentiary basis — status (Open, Under Review, Resolved, Escalated, Fraud Hold), proposed resolution (adjust, waive, uphold), resolution amount, resolution method (credit/adjustment vs. cash/manual refund), an identity/authorization-verification result for the disputing party, recorded before any financial action can be taken on the case, SLA due date; a distinct Chargeback Compelling-Evidence Packet sub-case, flagged separately from a standard dispute, for assembling the specific documentation bundle a card network/issuer requires to contest a chargeback; for a Payout Dispute specifically, the evidentiary basis under review (job records, GPS/trip log, and the provider's Compensation Profile basis) in place of a Member dispute's invoice line items</w:t>
+              <w:t xml:space="preserve">Dispute Case ID, disputing-party type (Member or Provider) and identity, linked record under dispute (Invoice for a Member dispute; Payout Record/Payout Run for a Payout Dispute), dispute reason, disputing party's statement/correspondence log, a GPS/trip-log evidence field alongside that statement/correspondence log — available on a Member billing dispute (e.g., "visit didn't happen") just as it already is on a Payout Dispute's evidentiary basis — status (Open, Under Review, Resolved, Escalated, Fraud Hold), proposed resolution (adjust, waive, uphold), resolution amount, resolution method (credit/adjustment vs. cash/manual refund), an identity/authorization-verification result for the disputing party, recorded before any financial action can be taken on the case, SLA due date; a distinct Chargeback Compelling-Evidence Packet sub-case, flagged separately from a standard dispute, for assembling the specific documentation bundle a card network/issuer requires to contest a chargeback; for a Payout Dispute specifically, the evidentiary basis under review (job records, GPS/trip log, and the provider's Compensation Profile basis) in place of a Member dispute's invoice line items; a tip-clawback trigger, distinct from a standard Payout Dispute, raised when a tip is charged back by the card network or when the underlying disputed service is found not merited after the tip has already been disbursed to the provider, since the tip itself must then be recovered even though AFC never held or earned any portion of it</w:t>
             </w:r>
           </w:p>
         </w:tc>
@@ -10849,7 +10849,7 @@
                 <w:sz w:val="18"/>
                 <w:szCs w:val="18"/>
               </w:rPr>
-              <w:t xml:space="preserve">Log correspondence; verify disputing party's identity/authorization (required gate before any financial action); propose resolution; attach supporting document (for a Payout Dispute: job record, GPS/trip log extract, or Compensation Profile reference in place of member statement/correspondence); assemble and export a chargeback compelling-evidence packet (distinct workflow from a standard dispute resolution); escalate to Finance Manager; approve/deny resolution (Finance Manager, single sign-off for a credit/adjustment resolution); dual-sign-off approval for any cash or manual refund specifically (a second, distinct Finance Manager approval beyond the standard single approval, since a cash/manual refund cannot be reversed the way a card-network chargeback can); place case on fraud hold if the refund destination is fraud-flagged; close case</w:t>
+              <w:t xml:space="preserve">Log correspondence; verify disputing party's identity/authorization (required gate before any financial action); propose resolution; attach supporting document (for a Payout Dispute: job record, GPS/trip log extract, or Compensation Profile reference in place of member statement/correspondence); assemble and export a chargeback compelling-evidence packet (distinct workflow from a standard dispute resolution); escalate to Finance Manager; approve/deny resolution (Finance Manager, single sign-off for a credit/adjustment resolution); dual-sign-off approval for any cash or manual refund specifically (a second, distinct Finance Manager approval beyond the standard single approval, since a cash/manual refund cannot be reversed the way a card-network chargeback can); place case on fraud hold if the refund destination is fraud-flagged; on a tip-clawback trigger, initiate recovery of the already-disbursed tip amount by routing it through the Payout Run screen's clawback mechanism (1.6) rather than establishing a separate recovery path here; close case</w:t>
             </w:r>
           </w:p>
         </w:tc>
@@ -10894,7 +10894,7 @@
                 <w:sz w:val="18"/>
                 <w:szCs w:val="18"/>
               </w:rPr>
-              <w:t xml:space="preserve">From: Invoice Detail/Adjustment screen, Invoice Queue (Member dispute), or Payout Run screen/Payout Record Detail screen (1.14, Payout Dispute). To: Invoice Detail/Adjustment screen (apply resolved adjustment, Member dispute) or Payout Record Detail screen (1.14, apply resolved adjustment/clawback reversal, Payout Dispute); Consolidated Approval Queue</w:t>
+              <w:t xml:space="preserve">From: Invoice Detail/Adjustment screen, Invoice Queue (Member dispute), or Payout Run screen/Payout Record Detail screen (1.14, Payout Dispute). To: Invoice Detail/Adjustment screen (apply resolved adjustment, Member dispute) or Payout Record Detail screen (1.14, apply resolved adjustment/clawback reversal, Payout Dispute); Payout Run screen (1.6, to initiate a tip-clawback via its established clawback mechanism); Consolidated Approval Queue</w:t>
             </w:r>
           </w:p>
         </w:tc>
@@ -10939,7 +10939,7 @@
                 <w:sz w:val="18"/>
                 <w:szCs w:val="18"/>
               </w:rPr>
-              <w:t xml:space="preserve">Cannot close case without a resolution decision recorded; SLA-breach warning banner if past due date; a Payout Dispute is held to the same evidentiary standard as a Member-facing dispute (documented evidence required before proposing resolution), just evaluated against job records/GPS/trip log/Compensation Profile basis rather than invoice line items; cannot propose or approve any financial action until identity/authorization verification is recorded; a cash/manual refund cannot be released with only one Finance Manager approval — it is blocked pending the required second, distinct sign-off; a case placed on fraud hold blocks any refund release until the hold is explicitly cleared by a Finance Manager with a documented reason</w:t>
+              <w:t xml:space="preserve">Cannot close case without a resolution decision recorded; SLA-breach warning banner if past due date; a Payout Dispute is held to the same evidentiary standard as a Member-facing dispute (documented evidence required before proposing resolution), just evaluated against job records/GPS/trip log/Compensation Profile basis rather than invoice line items; cannot propose or approve any financial action until identity/authorization verification is recorded; a cash/manual refund cannot be released with only one Finance Manager approval — it is blocked pending the required second, distinct sign-off; a case placed on fraud hold blocks any refund release until the hold is explicitly cleared by a Finance Manager with a documented reason; a tip-clawback trigger cannot be resolved directly on this screen — it must be routed through and actioned via the Payout Run screen's clawback mechanism (1.6), same Finance-Manager-approval requirement as any other clawback</w:t>
             </w:r>
           </w:p>
         </w:tc>
@@ -11926,7 +11926,7 @@
                 <w:sz w:val="18"/>
                 <w:szCs w:val="18"/>
               </w:rPr>
-              <w:t xml:space="preserve">Payout Record list grouped by Compensation Profile type (Salaried, Per-Visit, Revenue-Share), per-provider subtotal and basis (visits completed, revenue attributed, salary period), a documented split-allocation field for any job with two jointly-responsible providers (percentage or fixed split per provider, with the basis for the split recorded), tax-treatment indicator per provider (PAYE-withheld for Salaried vs. self-filing for Per-Visit/Revenue-Share, pulled directly from that provider's Compensation Profile so the two are never confused on the run itself), run total, exceptions (e.g., provider with incomplete Care Plan sign-off, mismatched Vehicle/Crew Record hours, a provider with no Compensation Profile on file at all), run status (Draft, Pending Approval, Approved, Released), run type (Regular Cycle or Off-Cycle Correction)</w:t>
+              <w:t xml:space="preserve">Payout Record list grouped by Compensation Profile type (Salaried, Per-Visit, Revenue-Share), per-provider subtotal and basis (visits completed, revenue attributed, salary period), a documented split-allocation field for any job with two jointly-responsible providers (percentage or fixed split per provider, with the basis for the split recorded), tax-treatment indicator per provider (PAYE-withheld for Salaried vs. self-filing for Per-Visit/Revenue-Share, pulled directly from that provider's Compensation Profile so the two are never confused on the run itself), run total, exceptions (e.g., provider with incomplete Care Plan sign-off, mismatched Vehicle/Crew Record hours, a provider with no Compensation Profile on file at all), run status (Draft, Pending Approval, Approved, Released), run type (Regular Cycle or Off-Cycle Correction); a per-provider, per-run Tips total line item, shown as its own distinct row alongside — never blended into — that provider's Compensation-Profile-based subtotal, since a tip is a 100%-pass-through, patient-initiated gratuity on which AFC retains no commission or fee whatsoever, and is explicitly labeled as such (e.g., "Tips — 100% pass-through, no AFC commission") so it is never mistaken for part of the calculated compensation basis</w:t>
             </w:r>
           </w:p>
         </w:tc>
@@ -15174,7 +15174,7 @@
                 <w:sz w:val="18"/>
                 <w:szCs w:val="18"/>
               </w:rPr>
-              <w:t xml:space="preserve">Provider identity, linked Compensation Profile (1.11) and its basis (Salaried, Per-Visit, Revenue-Share); this provider's payout history across prior runs; for each run, a disbursement status distinct from the overall Payout Run's status (Pending, Sent, Confirmed, Failed at the individual-provider level, since a run can be Released overall while one provider's disbursement still fails or is pending confirmation); any clawback applied against this provider (amount, reason, run(s) affected, status); any open or resolved Payout Dispute referencing this record; a provider-death/departure estate-routing reference, once a provider is marked deceased or departed with a final payout outstanding, recording the estate/next-of-kin or final-settlement record that any remaining payout is routed to instead of the provider's own on-file payment method</w:t>
+              <w:t xml:space="preserve">Provider identity, linked Compensation Profile (1.11) and its basis (Salaried, Per-Visit, Revenue-Share); this provider's payout history across prior runs; for each run, a disbursement status distinct from the overall Payout Run's status (Pending, Sent, Confirmed, Failed at the individual-provider level, since a run can be Released overall while one provider's disbursement still fails or is pending confirmation); any clawback applied against this provider (amount, reason, run(s) affected, status); any open or resolved Payout Dispute referencing this record; a provider-death/departure estate-routing reference, once a provider is marked deceased or departed with a final payout outstanding, recording the estate/next-of-kin or final-settlement record that any remaining payout is routed to instead of the provider's own on-file payment method; a per-run Tips total carried into this provider's disbursement history alongside (not merged into) their Compensation-Profile-based service-fee earnings for that run, labeled as a 100%-pass-through gratuity on which AFC retains no commission, mirroring the same distinct Tips line item shown on the Payout Run screen (1.6)</w:t>
             </w:r>
           </w:p>
         </w:tc>
@@ -15578,7 +15578,7 @@
                 <w:sz w:val="18"/>
                 <w:szCs w:val="18"/>
               </w:rPr>
-              <w:t xml:space="preserve">GL entry ID, source record type (closed Invoice, Month-End Close, Payout Run), link to the source record, entry type (revenue or expense), amount, cost centre, service line, posting date, export/batch status (Not Exported, Exported, Export Failed)</w:t>
+              <w:t xml:space="preserve">GL entry ID, source record type (closed Invoice, Month-End Close, Payout Run), link to the source record, entry type (revenue, expense, or pass-through liability — this third type reserved for provider tips, since a tip is disbursed 100% to the provider and is never AFC revenue), amount, cost centre, service line (not applicable/blank for a pass-through-liability entry, since a tip is deliberately not tagged to any revenue cost-centre or service line the way service-fee income is), posting date, export/batch status (Not Exported, Exported, Export Failed)</w:t>
             </w:r>
           </w:p>
         </w:tc>
@@ -15713,7 +15713,7 @@
                 <w:sz w:val="18"/>
                 <w:szCs w:val="18"/>
               </w:rPr>
-              <w:t xml:space="preserve">Cannot export a batch containing an entry missing a cost-centre tag; an export failure flags the entry for retry rather than silently dropping it from the batch; entries generated from a locked period cannot be regenerated — a correction requires reopening the period via 1.7's dual-approval reopen workflow first</w:t>
+              <w:t xml:space="preserve">Cannot export a batch containing an entry missing a cost-centre tag, except a pass-through-liability (tip) entry, which is exempt from the cost-centre-tag requirement by design and is instead validated only against its zero-commission, zero-revenue classification; an export failure flags the entry for retry rather than silently dropping it from the batch; entries generated from a locked period cannot be regenerated — a correction requires reopening the period via 1.7's dual-approval reopen workflow first; a tip amount cannot be posted or reclassified as revenue or as service-fee income under any circumstance</w:t>
             </w:r>
           </w:p>
         </w:tc>
@@ -26627,7 +26627,7 @@
                 <w:sz w:val="18"/>
                 <w:szCs w:val="18"/>
               </w:rPr>
-              <w:t xml:space="preserve">Ambulance/visit response time metrics filterable by acuity level and job type, not just rolled up into one average, and displayed with a percentile-banded breakdown (e.g., p50/p90/p99) alongside the mean so an outlier tail is visible rather than smoothed away; revenue summary (linked to Invoice/Payout data); granular crew-utilization metrics beyond a single rolled-up rate — idle time, overtime, and a comparative view across crews/branches; Membership plan mix and status breakdown; open Incident Case/DSAR Case counts, plus an incident-register pattern-analysis view surfacing recurring category/location/time-of-day clusters rather than only the raw open-count; compliance filing status summary; provider payout/payroll cost by service line; Care Plan compliance rate; average patient/Member satisfaction rating (rolled up from the Patient App's Rate and Review submissions) trended over time and broken out by service type; a de-identified, aggregate safeguarding-case count metric (volume only, no case detail), the receiving end of the aggregate figure the Safeguarding Case Screen (3.9) already promises to surface but that previously had nowhere to land; any Operations Manager-authored KPI-trend annotations attached to a trend line, shown inline at the point on the timeline they explain</w:t>
+              <w:t xml:space="preserve">Ambulance/visit response time metrics filterable by acuity level and job type, not just rolled up into one average, and displayed with a percentile-banded breakdown (e.g., p50/p90/p99) alongside the mean so an outlier tail is visible rather than smoothed away; revenue summary (linked to Invoice/Payout data); granular crew-utilization metrics beyond a single rolled-up rate — idle time, overtime, and a comparative view across crews/branches; Membership plan mix and status breakdown; open Incident Case/DSAR Case counts, plus an incident-register pattern-analysis view surfacing recurring category/location/time-of-day clusters rather than only the raw open-count; compliance filing status summary; provider payout/payroll cost by service line; a Total tips disbursed metric, shown near the other payout/payroll figures but explicitly and visually labeled as distinct from revenue (e.g., "Tips — 100% pass-through, not AFC revenue"), since these are optional, patient-initiated gratuities passed through in full to the provider with no AFC commission retained; Care Plan compliance rate; average patient/Member satisfaction rating (rolled up from the Patient App's Rate and Review submissions) trended over time and broken out by service type; a de-identified, aggregate safeguarding-case count metric (volume only, no case detail), the receiving end of the aggregate figure the Safeguarding Case Screen (3.9) already promises to surface but that previously had nowhere to land; any Operations Manager-authored KPI-trend annotations attached to a trend line, shown inline at the point on the timeline they explain</w:t>
             </w:r>
           </w:p>
         </w:tc>

</xml_diff>

<commit_message>
Name Phone Consultation and Emergency SOS explicitly in Rate Card and Service Catalog example lists
Both were already covered by the screens' "any other billable service
type" catch-all, but weren't named alongside the other five service
types in the illustrative examples - a clarity gap, not a functional
one. Also adds Pharmacist and Phone Consultation Clinician to the
Service Catalog's example delivering-roles list for the same reason.

Co-Authored-By: Claude Sonnet 5 <noreply@anthropic.com>
</commit_message>
<xml_diff>
--- a/docs/AFC_UIUX_Functional_Screen_Inventory.docx
+++ b/docs/AFC_UIUX_Functional_Screen_Inventory.docx
@@ -16698,7 +16698,7 @@
                 <w:sz w:val="18"/>
                 <w:szCs w:val="18"/>
               </w:rPr>
-              <w:t xml:space="preserve">Rate Card ID and version number, effective-date range per version, per-service-type line items (Home Doctor Visit, Home Nurse Visit, Home Health Aide Visit, ambulance per-mile transport rate, controlled-substance delivery surcharge, and any other billable service type defined in Service Catalog Administration, 1.18), per-region price overrides where a region's cost structure differs from the base card, full version/change history with author and approval record; a pending-approval indicator for any proposed change above the materiality threshold awaiting Operations Manager sign-off; a retroactive-impact preview listing already-priced, unconfirmed-but-pending bookings that a proposed change would otherwise reprice</w:t>
+              <w:t xml:space="preserve">Rate Card ID and version number, effective-date range per version, per-service-type line items (Home Doctor Visit, Home Nurse Visit, Home Health Aide Visit, Phone Consultation session fee, ambulance per-mile transport rate, Emergency SOS response fee, controlled-substance delivery surcharge, and any other billable service type defined in Service Catalog Administration, 1.18), per-region price overrides where a region's cost structure differs from the base card, full version/change history with author and approval record; a pending-approval indicator for any proposed change above the materiality threshold awaiting Operations Manager sign-off; a retroactive-impact preview listing already-priced, unconfirmed-but-pending bookings that a proposed change would otherwise reprice</w:t>
             </w:r>
           </w:p>
         </w:tc>
@@ -17102,7 +17102,7 @@
                 <w:sz w:val="18"/>
                 <w:szCs w:val="18"/>
               </w:rPr>
-              <w:t xml:space="preserve">Service type list: name, description, which role(s) can deliver it (Doctor, Nurse, Home Health Aide, Ambulance Crew), linked Rate Card entry (1.17), Membership-allowance eligibility (whether visits of this type draw against a Membership plan's visit allowance), region availability, active/inactive status; Membership plan tier list: Bronze, Silver, Gold, Family, and Corporate/Group (the tier referenced elsewhere in this platform's finance journeys as an existing billing route with no screen anywhere that actually creates it as a selectable plan tier until now), each with name, price, visit-allowance rules, active/inactive status; a reference count per service type/tier showing how many active bookings, enrollments, or Compensation Profiles currently reference it</w:t>
+              <w:t xml:space="preserve">Service type list — e.g., Home Doctor Visit, Home Nurse Visit, Home Health Aide Visit, Medication Delivery, Phone Consultation, Scheduled Ambulance Transport, Emergency SOS Response — each with name, description, which role(s) can deliver it (Doctor, Nurse, Home Health Aide, Pharmacist, Phone Consultation Clinician, Ambulance Crew, Emergency Dispatcher, as applicable to that service), linked Rate Card entry (1.17), Membership-allowance eligibility (whether visits of this type draw against a Membership plan's visit allowance), region availability, active/inactive status; Membership plan tier list: Bronze, Silver, Gold, Family, and Corporate/Group (the tier referenced elsewhere in this platform's finance journeys as an existing billing route with no screen anywhere that actually creates it as a selectable plan tier until now), each with name, price, visit-allowance rules, active/inactive status; a reference count per service type/tier showing how many active bookings, enrollments, or Compensation Profiles currently reference it</w:t>
             </w:r>
           </w:p>
         </w:tc>

</xml_diff>